<commit_message>
Initialize Django project with basic structure and create myapp
- Created a new Django project named 'practice'.
- Added 'myapp' application with initial files including models, views, and templates.
- Implemented basic views for handling student registration and method checks.
- Set up URL routing for various endpoints including product and employee views.
- Configured settings for database and installed apps.
- Added HTML templates for user input forms.
- Created initial migrations and database setup.
</commit_message>
<xml_diff>
--- a/IXD803/Mine/CA's/CA1/CA1.docx
+++ b/IXD803/Mine/CA's/CA1/CA1.docx
@@ -6,7 +6,7 @@
       <w:pPr>
         <w:jc w:val="center"/>
         <w:rPr>
-          <w:rFonts w:ascii="Calibri" w:hAnsi="Calibri" w:cs="Calibri"/>
+          <w:rFonts w:cstheme="minorHAnsi"/>
           <w:b/>
           <w:bCs/>
           <w:sz w:val="36"/>
@@ -16,7 +16,7 @@
       </w:pPr>
       <w:r>
         <w:rPr>
-          <w:rFonts w:ascii="Calibri" w:hAnsi="Calibri" w:cs="Calibri"/>
+          <w:rFonts w:cstheme="minorHAnsi"/>
           <w:b/>
           <w:bCs/>
           <w:sz w:val="36"/>
@@ -29,7 +29,7 @@
     <w:p>
       <w:pPr>
         <w:rPr>
-          <w:rFonts w:ascii="Calibri" w:hAnsi="Calibri" w:cs="Calibri"/>
+          <w:rFonts w:cstheme="minorHAnsi"/>
           <w:b/>
           <w:bCs/>
           <w:sz w:val="28"/>
@@ -39,7 +39,7 @@
       </w:pPr>
       <w:r>
         <w:rPr>
-          <w:rFonts w:ascii="Calibri" w:hAnsi="Calibri" w:cs="Calibri"/>
+          <w:rFonts w:cstheme="minorHAnsi"/>
           <w:b/>
           <w:bCs/>
           <w:sz w:val="36"/>
@@ -77,20 +77,7 @@
           <w:lang w:eastAsia="en-ID"/>
           <w14:ligatures w14:val="none"/>
         </w:rPr>
-        <w:t>Environmental Issue Reporting</w:t>
-      </w:r>
-      <w:r>
-        <w:rPr>
-          <w:rFonts w:eastAsia="Times New Roman" w:cstheme="minorHAnsi"/>
-          <w:b/>
-          <w:bCs/>
-          <w:kern w:val="0"/>
-          <w:sz w:val="24"/>
-          <w:szCs w:val="24"/>
-          <w:lang w:eastAsia="en-ID"/>
-          <w14:ligatures w14:val="none"/>
-        </w:rPr>
-        <w:t>:</w:t>
+        <w:t>Environmental Issue Reporting:</w:t>
       </w:r>
       <w:r>
         <w:rPr>
@@ -102,9 +89,17 @@
           <w14:ligatures w14:val="none"/>
         </w:rPr>
         <w:br/>
-      </w:r>
-      <w:proofErr w:type="gramStart"/>
-      <w:r>
+        <w:t xml:space="preserve">Citizens face difficulties in reporting problems such as illegal dumping, air pollution, water pollution, overflowing garbage, and poor sanitation to the appropriate authorities. </w:t>
+      </w:r>
+    </w:p>
+    <w:p>
+      <w:pPr>
+        <w:pStyle w:val="ListParagraph"/>
+        <w:numPr>
+          <w:ilvl w:val="0"/>
+          <w:numId w:val="15"/>
+        </w:numPr>
+        <w:spacing w:after="0" w:line="240" w:lineRule="auto"/>
         <w:rPr>
           <w:rFonts w:eastAsia="Times New Roman" w:cstheme="minorHAnsi"/>
           <w:kern w:val="0"/>
@@ -113,9 +108,20 @@
           <w:lang w:eastAsia="en-ID"/>
           <w14:ligatures w14:val="none"/>
         </w:rPr>
-        <w:t>Citizens</w:t>
-      </w:r>
-      <w:proofErr w:type="gramEnd"/>
+      </w:pPr>
+      <w:r>
+        <w:rPr>
+          <w:rFonts w:eastAsia="Times New Roman" w:cstheme="minorHAnsi"/>
+          <w:b/>
+          <w:bCs/>
+          <w:kern w:val="0"/>
+          <w:sz w:val="24"/>
+          <w:szCs w:val="24"/>
+          <w:lang w:eastAsia="en-ID"/>
+          <w14:ligatures w14:val="none"/>
+        </w:rPr>
+        <w:t>Household Waste Management:</w:t>
+      </w:r>
       <w:r>
         <w:rPr>
           <w:rFonts w:eastAsia="Times New Roman" w:cstheme="minorHAnsi"/>
@@ -125,7 +131,8 @@
           <w:lang w:eastAsia="en-ID"/>
           <w14:ligatures w14:val="none"/>
         </w:rPr>
-        <w:t xml:space="preserve"> face difficulties in reporting problems such as illegal dumping, air pollution, water pollution, overflowing garbage, and poor sanitation to the appropriate authorities. </w:t>
+        <w:br/>
+        <w:t xml:space="preserve">People struggle to properly segregate, dispose of, and manage household waste, leading to increased landfill waste and environmental pollution. </w:t>
       </w:r>
     </w:p>
     <w:p>
@@ -156,20 +163,7 @@
           <w:lang w:eastAsia="en-ID"/>
           <w14:ligatures w14:val="none"/>
         </w:rPr>
-        <w:t>Household Waste Management</w:t>
-      </w:r>
-      <w:r>
-        <w:rPr>
-          <w:rFonts w:eastAsia="Times New Roman" w:cstheme="minorHAnsi"/>
-          <w:b/>
-          <w:bCs/>
-          <w:kern w:val="0"/>
-          <w:sz w:val="24"/>
-          <w:szCs w:val="24"/>
-          <w:lang w:eastAsia="en-ID"/>
-          <w14:ligatures w14:val="none"/>
-        </w:rPr>
-        <w:t>:</w:t>
+        <w:t>Water Conservation &amp; Leakage Management:</w:t>
       </w:r>
       <w:r>
         <w:rPr>
@@ -181,7 +175,7 @@
           <w14:ligatures w14:val="none"/>
         </w:rPr>
         <w:br/>
-        <w:t xml:space="preserve">People struggle to properly segregate, dispose of, and manage household waste, leading to increased landfill waste and environmental pollution. </w:t>
+        <w:t xml:space="preserve">Individuals and communities often lack effective ways to identify, report, and reduce water wastage caused by leaks, overflowing tanks, inefficient usage, and damaged infrastructure. </w:t>
       </w:r>
     </w:p>
     <w:p>
@@ -212,20 +206,7 @@
           <w:lang w:eastAsia="en-ID"/>
           <w14:ligatures w14:val="none"/>
         </w:rPr>
-        <w:t>Water Conservation &amp; Leakage Management</w:t>
-      </w:r>
-      <w:r>
-        <w:rPr>
-          <w:rFonts w:eastAsia="Times New Roman" w:cstheme="minorHAnsi"/>
-          <w:b/>
-          <w:bCs/>
-          <w:kern w:val="0"/>
-          <w:sz w:val="24"/>
-          <w:szCs w:val="24"/>
-          <w:lang w:eastAsia="en-ID"/>
-          <w14:ligatures w14:val="none"/>
-        </w:rPr>
-        <w:t>:</w:t>
+        <w:t>Air Pollution Awareness &amp; Monitoring:</w:t>
       </w:r>
       <w:r>
         <w:rPr>
@@ -237,7 +218,7 @@
           <w14:ligatures w14:val="none"/>
         </w:rPr>
         <w:br/>
-        <w:t xml:space="preserve">Individuals and communities often lack effective ways to identify, report, and reduce water wastage caused by leaks, overflowing tanks, inefficient usage, and damaged infrastructure. </w:t>
+        <w:t>People have limited awareness of the air quality around them and find it difficult to understand pollution levels, major pollution sources, and appropriate actions to reduce exposure.</w:t>
       </w:r>
     </w:p>
     <w:p>
@@ -268,20 +249,7 @@
           <w:lang w:eastAsia="en-ID"/>
           <w14:ligatures w14:val="none"/>
         </w:rPr>
-        <w:t>Air Pollution Awareness &amp; Monitoring</w:t>
-      </w:r>
-      <w:r>
-        <w:rPr>
-          <w:rFonts w:eastAsia="Times New Roman" w:cstheme="minorHAnsi"/>
-          <w:b/>
-          <w:bCs/>
-          <w:kern w:val="0"/>
-          <w:sz w:val="24"/>
-          <w:szCs w:val="24"/>
-          <w:lang w:eastAsia="en-ID"/>
-          <w14:ligatures w14:val="none"/>
-        </w:rPr>
-        <w:t>:</w:t>
+        <w:t>Community Recycling &amp; Reuse:</w:t>
       </w:r>
       <w:r>
         <w:rPr>
@@ -293,16 +261,11 @@
           <w14:ligatures w14:val="none"/>
         </w:rPr>
         <w:br/>
-        <w:t>People have limited awareness of the air quality around them and find it difficult to understand pollution levels, major pollution sources, and appropriate actions to reduce exposure.</w:t>
-      </w:r>
-    </w:p>
-    <w:p>
-      <w:pPr>
-        <w:pStyle w:val="ListParagraph"/>
-        <w:numPr>
-          <w:ilvl w:val="0"/>
-          <w:numId w:val="15"/>
-        </w:numPr>
+        <w:t>People often do not know where to recycle or responsibly dispose of items such as e-waste, plastic, batteries, clothing, and other reusable materials, resulting in recyclable waste being sent to landfills.</w:t>
+      </w:r>
+    </w:p>
+    <w:p>
+      <w:pPr>
         <w:spacing w:after="0" w:line="240" w:lineRule="auto"/>
         <w:rPr>
           <w:rFonts w:eastAsia="Times New Roman" w:cstheme="minorHAnsi"/>
@@ -313,7 +276,10 @@
           <w14:ligatures w14:val="none"/>
         </w:rPr>
       </w:pPr>
-      <w:r>
+    </w:p>
+    <w:p>
+      <w:pPr>
+        <w:spacing w:after="0" w:line="240" w:lineRule="auto"/>
         <w:rPr>
           <w:rFonts w:eastAsia="Times New Roman" w:cstheme="minorHAnsi"/>
           <w:b/>
@@ -321,11 +287,11 @@
           <w:kern w:val="0"/>
           <w:sz w:val="24"/>
           <w:szCs w:val="24"/>
+          <w:u w:val="single"/>
           <w:lang w:eastAsia="en-ID"/>
           <w14:ligatures w14:val="none"/>
         </w:rPr>
-        <w:t>Community Recycling &amp; Reuse</w:t>
-      </w:r>
+      </w:pPr>
       <w:r>
         <w:rPr>
           <w:rFonts w:eastAsia="Times New Roman" w:cstheme="minorHAnsi"/>
@@ -334,12 +300,63 @@
           <w:kern w:val="0"/>
           <w:sz w:val="24"/>
           <w:szCs w:val="24"/>
+          <w:u w:val="single"/>
           <w:lang w:eastAsia="en-ID"/>
           <w14:ligatures w14:val="none"/>
         </w:rPr>
-        <w:t>:</w:t>
-      </w:r>
-      <w:r>
+        <w:t>Reasoning for Choosing Environmental Issue Reporting:</w:t>
+      </w:r>
+      <w:r>
+        <w:rPr>
+          <w:rFonts w:eastAsia="Times New Roman" w:cstheme="minorHAnsi"/>
+          <w:b/>
+          <w:bCs/>
+          <w:kern w:val="0"/>
+          <w:sz w:val="24"/>
+          <w:szCs w:val="24"/>
+          <w:u w:val="single"/>
+          <w:lang w:eastAsia="en-ID"/>
+          <w14:ligatures w14:val="none"/>
+        </w:rPr>
+        <w:br/>
+      </w:r>
+      <w:r>
+        <w:rPr>
+          <w:rFonts w:cstheme="minorHAnsi"/>
+        </w:rPr>
+        <w:t xml:space="preserve">I chose </w:t>
+      </w:r>
+      <w:r>
+        <w:rPr>
+          <w:rStyle w:val="Strong"/>
+          <w:rFonts w:cstheme="minorHAnsi"/>
+        </w:rPr>
+        <w:t>Environmental Issue Reporting</w:t>
+      </w:r>
+      <w:r>
+        <w:rPr>
+          <w:rFonts w:cstheme="minorHAnsi"/>
+        </w:rPr>
+        <w:t xml:space="preserve"> because citizens frequently encounter issues such as illegal dumping, overflowing garbage, and pollution but often lack a simple way to report them to the right authorities. The problem has a direct impact on community cleanliness and sustainability. It also offers clear user pain points and good scope for research and designing a user-</w:t>
+      </w:r>
+      <w:proofErr w:type="spellStart"/>
+      <w:r>
+        <w:rPr>
+          <w:rFonts w:cstheme="minorHAnsi"/>
+        </w:rPr>
+        <w:t>centered</w:t>
+      </w:r>
+      <w:proofErr w:type="spellEnd"/>
+      <w:r>
+        <w:rPr>
+          <w:rFonts w:cstheme="minorHAnsi"/>
+        </w:rPr>
+        <w:t xml:space="preserve"> digital solution.</w:t>
+      </w:r>
+    </w:p>
+    <w:p>
+      <w:pPr>
+        <w:spacing w:after="0" w:line="240" w:lineRule="auto"/>
         <w:rPr>
           <w:rFonts w:eastAsia="Times New Roman" w:cstheme="minorHAnsi"/>
           <w:kern w:val="0"/>
@@ -348,13 +365,384 @@
           <w:lang w:eastAsia="en-ID"/>
           <w14:ligatures w14:val="none"/>
         </w:rPr>
-        <w:br/>
-        <w:t>People often do not know where to recycle or responsibly dispose of items such as e-waste, plastic, batteries, clothing, and other reusable materials, resulting in recyclable waste being sent to landfills.</w:t>
+      </w:pPr>
+    </w:p>
+    <w:p>
+      <w:pPr>
+        <w:rPr>
+          <w:rFonts w:cstheme="minorHAnsi"/>
+          <w:b/>
+          <w:bCs/>
+          <w:sz w:val="36"/>
+          <w:szCs w:val="36"/>
+          <w:u w:val="single"/>
+        </w:rPr>
+      </w:pPr>
+      <w:r>
+        <w:rPr>
+          <w:rFonts w:cstheme="minorHAnsi"/>
+          <w:b/>
+          <w:bCs/>
+          <w:sz w:val="36"/>
+          <w:szCs w:val="36"/>
+          <w:u w:val="single"/>
+        </w:rPr>
+        <w:t>Primary Research:</w:t>
+      </w:r>
+    </w:p>
+    <w:p>
+      <w:pPr>
+        <w:pStyle w:val="ListParagraph"/>
+        <w:numPr>
+          <w:ilvl w:val="0"/>
+          <w:numId w:val="1"/>
+        </w:numPr>
+        <w:rPr>
+          <w:rFonts w:cstheme="minorHAnsi"/>
+          <w:b/>
+          <w:bCs/>
+          <w:sz w:val="28"/>
+          <w:szCs w:val="28"/>
+          <w:u w:val="single"/>
+        </w:rPr>
+      </w:pPr>
+      <w:r>
+        <w:rPr>
+          <w:rFonts w:cstheme="minorHAnsi"/>
+          <w:b/>
+          <w:bCs/>
+          <w:sz w:val="28"/>
+          <w:szCs w:val="28"/>
+          <w:u w:val="single"/>
+        </w:rPr>
+        <w:t>Selected Problem Statement:</w:t>
+      </w:r>
+    </w:p>
+    <w:p>
+      <w:pPr>
+        <w:pStyle w:val="ListParagraph"/>
+        <w:ind w:left="360"/>
+        <w:rPr>
+          <w:rFonts w:cstheme="minorHAnsi"/>
+          <w:b/>
+          <w:bCs/>
+          <w:sz w:val="24"/>
+          <w:szCs w:val="24"/>
+          <w:u w:val="single"/>
+        </w:rPr>
+      </w:pPr>
+      <w:r>
+        <w:rPr>
+          <w:rFonts w:eastAsia="Times New Roman" w:cstheme="minorHAnsi"/>
+          <w:b/>
+          <w:bCs/>
+          <w:kern w:val="0"/>
+          <w:sz w:val="24"/>
+          <w:szCs w:val="24"/>
+          <w:lang w:eastAsia="en-ID"/>
+          <w14:ligatures w14:val="none"/>
+        </w:rPr>
+        <w:t>Environmental Issue Reporting System</w:t>
+      </w:r>
+    </w:p>
+    <w:p>
+      <w:pPr>
+        <w:pStyle w:val="ListParagraph"/>
+        <w:numPr>
+          <w:ilvl w:val="0"/>
+          <w:numId w:val="5"/>
+        </w:numPr>
+        <w:rPr>
+          <w:rFonts w:eastAsia="Times New Roman" w:cstheme="minorHAnsi"/>
+          <w:kern w:val="0"/>
+          <w:lang w:eastAsia="en-ID"/>
+          <w14:ligatures w14:val="none"/>
+        </w:rPr>
+      </w:pPr>
+      <w:r>
+        <w:rPr>
+          <w:rFonts w:eastAsia="Times New Roman" w:cstheme="minorHAnsi"/>
+          <w:kern w:val="0"/>
+          <w:lang w:eastAsia="en-ID"/>
+          <w14:ligatures w14:val="none"/>
+        </w:rPr>
+        <w:t>Students often notice environmental problems around the college campus, such as garbage, overflowing dustbins, pollution, water wastage, and other unhygienic conditions. Sometimes students also come across injured or harmed animals on roads but do not know whom to contact for help.</w:t>
+      </w:r>
+    </w:p>
+    <w:p>
+      <w:pPr>
+        <w:pStyle w:val="ListParagraph"/>
+        <w:numPr>
+          <w:ilvl w:val="0"/>
+          <w:numId w:val="5"/>
+        </w:numPr>
+        <w:rPr>
+          <w:rFonts w:eastAsia="Times New Roman" w:cstheme="minorHAnsi"/>
+          <w:kern w:val="0"/>
+          <w:lang w:eastAsia="en-ID"/>
+          <w14:ligatures w14:val="none"/>
+        </w:rPr>
+      </w:pPr>
+      <w:r>
+        <w:rPr>
+          <w:rFonts w:eastAsia="Times New Roman" w:cstheme="minorHAnsi"/>
+          <w:kern w:val="0"/>
+          <w:lang w:eastAsia="en-ID"/>
+          <w14:ligatures w14:val="none"/>
+        </w:rPr>
+        <w:t xml:space="preserve">The main problem is that there is no simple and convenient way for students to report these issues with proper location and evidence. Our idea is to create a platform where students </w:t>
+      </w:r>
+      <w:r>
+        <w:rPr>
+          <w:rFonts w:eastAsia="Times New Roman" w:cstheme="minorHAnsi"/>
+          <w:kern w:val="0"/>
+          <w:lang w:eastAsia="en-ID"/>
+          <w14:ligatures w14:val="none"/>
+        </w:rPr>
+        <w:lastRenderedPageBreak/>
+        <w:t>can report an issue by adding a photo, location, and short description.</w:t>
+      </w:r>
+    </w:p>
+    <w:p>
+      <w:pPr>
+        <w:pStyle w:val="ListParagraph"/>
+        <w:ind w:left="1080"/>
+        <w:rPr>
+          <w:rFonts w:eastAsia="Times New Roman" w:cstheme="minorHAnsi"/>
+          <w:kern w:val="0"/>
+          <w:lang w:eastAsia="en-ID"/>
+          <w14:ligatures w14:val="none"/>
+        </w:rPr>
+      </w:pPr>
+    </w:p>
+    <w:p>
+      <w:pPr>
+        <w:pStyle w:val="ListParagraph"/>
+        <w:numPr>
+          <w:ilvl w:val="0"/>
+          <w:numId w:val="1"/>
+        </w:numPr>
+        <w:rPr>
+          <w:rFonts w:cstheme="minorHAnsi"/>
+          <w:b/>
+          <w:bCs/>
+          <w:sz w:val="28"/>
+          <w:szCs w:val="28"/>
+          <w:u w:val="single"/>
+        </w:rPr>
+      </w:pPr>
+      <w:r>
+        <w:rPr>
+          <w:rFonts w:cstheme="minorHAnsi"/>
+          <w:b/>
+          <w:bCs/>
+          <w:sz w:val="28"/>
+          <w:szCs w:val="28"/>
+          <w:u w:val="single"/>
+        </w:rPr>
+        <w:t>Target Users:</w:t>
+      </w:r>
+    </w:p>
+    <w:p>
+      <w:pPr>
+        <w:pStyle w:val="ListParagraph"/>
+        <w:numPr>
+          <w:ilvl w:val="0"/>
+          <w:numId w:val="4"/>
+        </w:numPr>
+        <w:rPr>
+          <w:rFonts w:cstheme="minorHAnsi"/>
+          <w:b/>
+          <w:bCs/>
+          <w:sz w:val="28"/>
+          <w:szCs w:val="28"/>
+          <w:u w:val="single"/>
+        </w:rPr>
+      </w:pPr>
+      <w:r>
+        <w:rPr>
+          <w:rFonts w:cstheme="minorHAnsi"/>
+        </w:rPr>
+        <w:t xml:space="preserve">Our target users are </w:t>
+      </w:r>
+      <w:r>
+        <w:rPr>
+          <w:rStyle w:val="Strong"/>
+          <w:rFonts w:cstheme="minorHAnsi"/>
+          <w:b w:val="0"/>
+          <w:bCs w:val="0"/>
+        </w:rPr>
+        <w:t>college students</w:t>
+      </w:r>
+      <w:r>
+        <w:rPr>
+          <w:rFonts w:cstheme="minorHAnsi"/>
+        </w:rPr>
+        <w:t>. Students spend a lot of time on campus and regularly move through different areas, so they can easily notice environmental problems.</w:t>
+      </w:r>
+    </w:p>
+    <w:p>
+      <w:pPr>
+        <w:pStyle w:val="ListParagraph"/>
+        <w:numPr>
+          <w:ilvl w:val="0"/>
+          <w:numId w:val="4"/>
+        </w:numPr>
+        <w:rPr>
+          <w:rFonts w:cstheme="minorHAnsi"/>
+          <w:b/>
+          <w:bCs/>
+          <w:sz w:val="28"/>
+          <w:szCs w:val="28"/>
+          <w:u w:val="single"/>
+        </w:rPr>
+      </w:pPr>
+      <w:r>
+        <w:rPr>
+          <w:rFonts w:cstheme="minorHAnsi"/>
+        </w:rPr>
+        <w:t>They can also come across situations such as injured animals on roads or waste being dumped in public areas. Their experiences can help us understand what problems they face and what kind of reporting system they would actually use.</w:t>
+      </w:r>
+    </w:p>
+    <w:p>
+      <w:pPr>
+        <w:pStyle w:val="ListParagraph"/>
+        <w:ind w:left="1080"/>
+        <w:rPr>
+          <w:rFonts w:cstheme="minorHAnsi"/>
+          <w:b/>
+          <w:bCs/>
+          <w:sz w:val="28"/>
+          <w:szCs w:val="28"/>
+          <w:u w:val="single"/>
+        </w:rPr>
+      </w:pPr>
+    </w:p>
+    <w:p>
+      <w:pPr>
+        <w:pStyle w:val="ListParagraph"/>
+        <w:numPr>
+          <w:ilvl w:val="0"/>
+          <w:numId w:val="1"/>
+        </w:numPr>
+        <w:rPr>
+          <w:rFonts w:cstheme="minorHAnsi"/>
+          <w:b/>
+          <w:bCs/>
+          <w:sz w:val="28"/>
+          <w:szCs w:val="28"/>
+          <w:u w:val="single"/>
+        </w:rPr>
+      </w:pPr>
+      <w:r>
+        <w:rPr>
+          <w:rFonts w:cstheme="minorHAnsi"/>
+          <w:b/>
+          <w:bCs/>
+          <w:sz w:val="28"/>
+          <w:szCs w:val="28"/>
+          <w:u w:val="single"/>
+        </w:rPr>
+        <w:t>Research Location:</w:t>
+      </w:r>
+    </w:p>
+    <w:p>
+      <w:pPr>
+        <w:pStyle w:val="ListParagraph"/>
+        <w:numPr>
+          <w:ilvl w:val="0"/>
+          <w:numId w:val="7"/>
+        </w:numPr>
+        <w:rPr>
+          <w:rFonts w:cstheme="minorHAnsi"/>
+        </w:rPr>
+      </w:pPr>
+      <w:r>
+        <w:rPr>
+          <w:rFonts w:cstheme="minorHAnsi"/>
+        </w:rPr>
+        <w:t xml:space="preserve">The research was conducted </w:t>
+      </w:r>
+      <w:r>
+        <w:rPr>
+          <w:rStyle w:val="Strong"/>
+          <w:rFonts w:cstheme="minorHAnsi"/>
+          <w:b w:val="0"/>
+          <w:bCs w:val="0"/>
+        </w:rPr>
+        <w:t>within the college campus</w:t>
+      </w:r>
+      <w:r>
+        <w:rPr>
+          <w:rFonts w:cstheme="minorHAnsi"/>
+        </w:rPr>
+        <w:t xml:space="preserve">. We interacted with students in different common areas of the campus and discussed the environmental problems they have noticed. </w:t>
+      </w:r>
+    </w:p>
+    <w:p>
+      <w:pPr>
+        <w:pStyle w:val="ListParagraph"/>
+        <w:numPr>
+          <w:ilvl w:val="0"/>
+          <w:numId w:val="7"/>
+        </w:numPr>
+        <w:rPr>
+          <w:rFonts w:cstheme="minorHAnsi"/>
+        </w:rPr>
+      </w:pPr>
+      <w:r>
+        <w:rPr>
+          <w:rFonts w:cstheme="minorHAnsi"/>
+        </w:rPr>
+        <w:t>The purpose was to understand their experiences and how they currently deal with such problems.</w:t>
+      </w:r>
+    </w:p>
+    <w:p>
+      <w:pPr>
+        <w:pStyle w:val="ListParagraph"/>
+        <w:ind w:left="360"/>
+        <w:rPr>
+          <w:rFonts w:cstheme="minorHAnsi"/>
+          <w:b/>
+          <w:bCs/>
+          <w:sz w:val="28"/>
+          <w:szCs w:val="28"/>
+          <w:u w:val="single"/>
+        </w:rPr>
+      </w:pPr>
+    </w:p>
+    <w:p>
+      <w:pPr>
+        <w:pStyle w:val="ListParagraph"/>
+        <w:numPr>
+          <w:ilvl w:val="0"/>
+          <w:numId w:val="1"/>
+        </w:numPr>
+        <w:rPr>
+          <w:rFonts w:cstheme="minorHAnsi"/>
+          <w:b/>
+          <w:bCs/>
+          <w:sz w:val="28"/>
+          <w:szCs w:val="28"/>
+          <w:u w:val="single"/>
+        </w:rPr>
+      </w:pPr>
+      <w:r>
+        <w:rPr>
+          <w:rFonts w:cstheme="minorHAnsi"/>
+          <w:b/>
+          <w:bCs/>
+          <w:sz w:val="28"/>
+          <w:szCs w:val="28"/>
+          <w:u w:val="single"/>
+        </w:rPr>
+        <w:t>Interview Questions:</w:t>
       </w:r>
     </w:p>
     <w:p>
       <w:pPr>
         <w:spacing w:after="0" w:line="240" w:lineRule="auto"/>
+        <w:ind w:left="360"/>
         <w:rPr>
           <w:rFonts w:eastAsia="Times New Roman" w:cstheme="minorHAnsi"/>
           <w:kern w:val="0"/>
@@ -364,471 +752,9 @@
           <w14:ligatures w14:val="none"/>
         </w:rPr>
       </w:pPr>
-    </w:p>
-    <w:p>
-      <w:pPr>
-        <w:spacing w:after="0" w:line="240" w:lineRule="auto"/>
+      <w:r>
         <w:rPr>
           <w:rFonts w:eastAsia="Times New Roman" w:cstheme="minorHAnsi"/>
-          <w:b/>
-          <w:bCs/>
-          <w:kern w:val="0"/>
-          <w:sz w:val="24"/>
-          <w:szCs w:val="24"/>
-          <w:u w:val="single"/>
-          <w:lang w:eastAsia="en-ID"/>
-          <w14:ligatures w14:val="none"/>
-        </w:rPr>
-      </w:pPr>
-      <w:r>
-        <w:rPr>
-          <w:rFonts w:eastAsia="Times New Roman" w:cstheme="minorHAnsi"/>
-          <w:b/>
-          <w:bCs/>
-          <w:kern w:val="0"/>
-          <w:sz w:val="24"/>
-          <w:szCs w:val="24"/>
-          <w:u w:val="single"/>
-          <w:lang w:eastAsia="en-ID"/>
-          <w14:ligatures w14:val="none"/>
-        </w:rPr>
-        <w:t>Reasoning for Choosing Environmental Issue Reporting</w:t>
-      </w:r>
-      <w:r>
-        <w:rPr>
-          <w:rFonts w:eastAsia="Times New Roman" w:cstheme="minorHAnsi"/>
-          <w:b/>
-          <w:bCs/>
-          <w:kern w:val="0"/>
-          <w:sz w:val="24"/>
-          <w:szCs w:val="24"/>
-          <w:u w:val="single"/>
-          <w:lang w:eastAsia="en-ID"/>
-          <w14:ligatures w14:val="none"/>
-        </w:rPr>
-        <w:t>:</w:t>
-      </w:r>
-      <w:r>
-        <w:rPr>
-          <w:rFonts w:eastAsia="Times New Roman" w:cstheme="minorHAnsi"/>
-          <w:b/>
-          <w:bCs/>
-          <w:kern w:val="0"/>
-          <w:sz w:val="24"/>
-          <w:szCs w:val="24"/>
-          <w:u w:val="single"/>
-          <w:lang w:eastAsia="en-ID"/>
-          <w14:ligatures w14:val="none"/>
-        </w:rPr>
-        <w:br/>
-      </w:r>
-      <w:r>
-        <w:t xml:space="preserve">I chose </w:t>
-      </w:r>
-      <w:r>
-        <w:rPr>
-          <w:rStyle w:val="Strong"/>
-        </w:rPr>
-        <w:t>Environmental Issue Reporting</w:t>
-      </w:r>
-      <w:r>
-        <w:t xml:space="preserve"> because citizens frequently encounter issues such as illegal dumping, overflowing garbage, and pollution but often lack a simple way to report them to the right authorities. The problem has a direct impact on community cleanliness and sustainability. It also offers clear user pain points and good scope for research and designing a user-</w:t>
-      </w:r>
-      <w:proofErr w:type="spellStart"/>
-      <w:r>
-        <w:t>centered</w:t>
-      </w:r>
-      <w:proofErr w:type="spellEnd"/>
-      <w:r>
-        <w:t xml:space="preserve"> digital solution.</w:t>
-      </w:r>
-    </w:p>
-    <w:p>
-      <w:pPr>
-        <w:spacing w:after="0" w:line="240" w:lineRule="auto"/>
-        <w:rPr>
-          <w:rFonts w:eastAsia="Times New Roman" w:cstheme="minorHAnsi"/>
-          <w:kern w:val="0"/>
-          <w:sz w:val="24"/>
-          <w:szCs w:val="24"/>
-          <w:lang w:eastAsia="en-ID"/>
-          <w14:ligatures w14:val="none"/>
-        </w:rPr>
-      </w:pPr>
-    </w:p>
-    <w:p>
-      <w:pPr>
-        <w:rPr>
-          <w:rFonts w:ascii="Calibri" w:hAnsi="Calibri" w:cs="Calibri"/>
-          <w:b/>
-          <w:bCs/>
-          <w:sz w:val="36"/>
-          <w:szCs w:val="36"/>
-          <w:u w:val="single"/>
-        </w:rPr>
-      </w:pPr>
-      <w:r>
-        <w:rPr>
-          <w:rFonts w:ascii="Calibri" w:hAnsi="Calibri" w:cs="Calibri"/>
-          <w:b/>
-          <w:bCs/>
-          <w:sz w:val="36"/>
-          <w:szCs w:val="36"/>
-          <w:u w:val="single"/>
-        </w:rPr>
-        <w:t>Primary Research:</w:t>
-      </w:r>
-    </w:p>
-    <w:p>
-      <w:pPr>
-        <w:pStyle w:val="ListParagraph"/>
-        <w:numPr>
-          <w:ilvl w:val="0"/>
-          <w:numId w:val="1"/>
-        </w:numPr>
-        <w:rPr>
-          <w:rFonts w:ascii="Calibri" w:hAnsi="Calibri" w:cs="Calibri"/>
-          <w:b/>
-          <w:bCs/>
-          <w:sz w:val="28"/>
-          <w:szCs w:val="28"/>
-          <w:u w:val="single"/>
-        </w:rPr>
-      </w:pPr>
-      <w:r>
-        <w:rPr>
-          <w:rFonts w:ascii="Calibri" w:hAnsi="Calibri" w:cs="Calibri"/>
-          <w:b/>
-          <w:bCs/>
-          <w:sz w:val="28"/>
-          <w:szCs w:val="28"/>
-          <w:u w:val="single"/>
-        </w:rPr>
-        <w:t>Selected Problem Statement:</w:t>
-      </w:r>
-    </w:p>
-    <w:p>
-      <w:pPr>
-        <w:pStyle w:val="ListParagraph"/>
-        <w:ind w:left="360"/>
-        <w:rPr>
-          <w:rFonts w:ascii="Calibri" w:hAnsi="Calibri" w:cs="Calibri"/>
-          <w:b/>
-          <w:bCs/>
-          <w:sz w:val="24"/>
-          <w:szCs w:val="24"/>
-          <w:u w:val="single"/>
-        </w:rPr>
-      </w:pPr>
-      <w:r>
-        <w:rPr>
-          <w:rFonts w:ascii="Calibri" w:eastAsia="Times New Roman" w:hAnsi="Calibri" w:cs="Calibri"/>
-          <w:b/>
-          <w:bCs/>
-          <w:kern w:val="0"/>
-          <w:sz w:val="24"/>
-          <w:szCs w:val="24"/>
-          <w:lang w:eastAsia="en-ID"/>
-          <w14:ligatures w14:val="none"/>
-        </w:rPr>
-        <w:t>Environmental Issue Reporting System</w:t>
-      </w:r>
-    </w:p>
-    <w:p>
-      <w:pPr>
-        <w:pStyle w:val="ListParagraph"/>
-        <w:numPr>
-          <w:ilvl w:val="0"/>
-          <w:numId w:val="5"/>
-        </w:numPr>
-        <w:rPr>
-          <w:rFonts w:ascii="Calibri" w:eastAsia="Times New Roman" w:hAnsi="Calibri" w:cs="Calibri"/>
-          <w:kern w:val="0"/>
-          <w:lang w:eastAsia="en-ID"/>
-          <w14:ligatures w14:val="none"/>
-        </w:rPr>
-      </w:pPr>
-      <w:r>
-        <w:rPr>
-          <w:rFonts w:ascii="Calibri" w:eastAsia="Times New Roman" w:hAnsi="Calibri" w:cs="Calibri"/>
-          <w:kern w:val="0"/>
-          <w:lang w:eastAsia="en-ID"/>
-          <w14:ligatures w14:val="none"/>
-        </w:rPr>
-        <w:t>Students often notice environmental problems around the college campus, such as garbage, overflowing dustbins, pollution, water wastage, and other unhygienic conditions. Sometimes students also come across injured or harmed animals on roads but do not know whom to contact for help.</w:t>
-      </w:r>
-    </w:p>
-    <w:p>
-      <w:pPr>
-        <w:pStyle w:val="ListParagraph"/>
-        <w:numPr>
-          <w:ilvl w:val="0"/>
-          <w:numId w:val="5"/>
-        </w:numPr>
-        <w:rPr>
-          <w:rFonts w:ascii="Calibri" w:eastAsia="Times New Roman" w:hAnsi="Calibri" w:cs="Calibri"/>
-          <w:kern w:val="0"/>
-          <w:lang w:eastAsia="en-ID"/>
-          <w14:ligatures w14:val="none"/>
-        </w:rPr>
-      </w:pPr>
-      <w:r>
-        <w:rPr>
-          <w:rFonts w:ascii="Calibri" w:eastAsia="Times New Roman" w:hAnsi="Calibri" w:cs="Calibri"/>
-          <w:kern w:val="0"/>
-          <w:lang w:eastAsia="en-ID"/>
-          <w14:ligatures w14:val="none"/>
-        </w:rPr>
-        <w:t xml:space="preserve">The main problem is that there is no simple and convenient way for students to report these issues with proper location and evidence. Our idea is to create a platform where students </w:t>
-      </w:r>
-      <w:r>
-        <w:rPr>
-          <w:rFonts w:ascii="Calibri" w:eastAsia="Times New Roman" w:hAnsi="Calibri" w:cs="Calibri"/>
-          <w:kern w:val="0"/>
-          <w:lang w:eastAsia="en-ID"/>
-          <w14:ligatures w14:val="none"/>
-        </w:rPr>
-        <w:lastRenderedPageBreak/>
-        <w:t>can report an issue by adding a photo, location, and short description.</w:t>
-      </w:r>
-    </w:p>
-    <w:p>
-      <w:pPr>
-        <w:pStyle w:val="ListParagraph"/>
-        <w:ind w:left="1080"/>
-        <w:rPr>
-          <w:rFonts w:ascii="Calibri" w:eastAsia="Times New Roman" w:hAnsi="Calibri" w:cs="Calibri"/>
-          <w:kern w:val="0"/>
-          <w:lang w:eastAsia="en-ID"/>
-          <w14:ligatures w14:val="none"/>
-        </w:rPr>
-      </w:pPr>
-    </w:p>
-    <w:p>
-      <w:pPr>
-        <w:pStyle w:val="ListParagraph"/>
-        <w:numPr>
-          <w:ilvl w:val="0"/>
-          <w:numId w:val="1"/>
-        </w:numPr>
-        <w:rPr>
-          <w:rFonts w:ascii="Calibri" w:hAnsi="Calibri" w:cs="Calibri"/>
-          <w:b/>
-          <w:bCs/>
-          <w:sz w:val="28"/>
-          <w:szCs w:val="28"/>
-          <w:u w:val="single"/>
-        </w:rPr>
-      </w:pPr>
-      <w:r>
-        <w:rPr>
-          <w:rFonts w:ascii="Calibri" w:hAnsi="Calibri" w:cs="Calibri"/>
-          <w:b/>
-          <w:bCs/>
-          <w:sz w:val="28"/>
-          <w:szCs w:val="28"/>
-          <w:u w:val="single"/>
-        </w:rPr>
-        <w:t>Target Users</w:t>
-      </w:r>
-      <w:r>
-        <w:rPr>
-          <w:rFonts w:ascii="Calibri" w:hAnsi="Calibri" w:cs="Calibri"/>
-          <w:b/>
-          <w:bCs/>
-          <w:sz w:val="28"/>
-          <w:szCs w:val="28"/>
-          <w:u w:val="single"/>
-        </w:rPr>
-        <w:t>:</w:t>
-      </w:r>
-    </w:p>
-    <w:p>
-      <w:pPr>
-        <w:pStyle w:val="ListParagraph"/>
-        <w:numPr>
-          <w:ilvl w:val="0"/>
-          <w:numId w:val="4"/>
-        </w:numPr>
-        <w:rPr>
-          <w:rFonts w:ascii="Calibri" w:hAnsi="Calibri" w:cs="Calibri"/>
-          <w:b/>
-          <w:bCs/>
-          <w:sz w:val="28"/>
-          <w:szCs w:val="28"/>
-          <w:u w:val="single"/>
-        </w:rPr>
-      </w:pPr>
-      <w:r>
-        <w:t xml:space="preserve">Our target users are </w:t>
-      </w:r>
-      <w:r>
-        <w:rPr>
-          <w:rStyle w:val="Strong"/>
-          <w:b w:val="0"/>
-          <w:bCs w:val="0"/>
-        </w:rPr>
-        <w:t>college students</w:t>
-      </w:r>
-      <w:r>
-        <w:t>. Students spend a lot of time on campus and regularly move through different areas, so they can easily notice environmental problems.</w:t>
-      </w:r>
-    </w:p>
-    <w:p>
-      <w:pPr>
-        <w:pStyle w:val="ListParagraph"/>
-        <w:numPr>
-          <w:ilvl w:val="0"/>
-          <w:numId w:val="4"/>
-        </w:numPr>
-        <w:rPr>
-          <w:rFonts w:ascii="Calibri" w:hAnsi="Calibri" w:cs="Calibri"/>
-          <w:b/>
-          <w:bCs/>
-          <w:sz w:val="28"/>
-          <w:szCs w:val="28"/>
-          <w:u w:val="single"/>
-        </w:rPr>
-      </w:pPr>
-      <w:r>
-        <w:t>They can also come across situations such as injured animals on roads or waste being dumped in public areas. Their experiences can help us understand what problems they face and what kind of reporting system they would actually use.</w:t>
-      </w:r>
-    </w:p>
-    <w:p>
-      <w:pPr>
-        <w:pStyle w:val="ListParagraph"/>
-        <w:ind w:left="1080"/>
-        <w:rPr>
-          <w:rFonts w:ascii="Calibri" w:hAnsi="Calibri" w:cs="Calibri"/>
-          <w:b/>
-          <w:bCs/>
-          <w:sz w:val="28"/>
-          <w:szCs w:val="28"/>
-          <w:u w:val="single"/>
-        </w:rPr>
-      </w:pPr>
-    </w:p>
-    <w:p>
-      <w:pPr>
-        <w:pStyle w:val="ListParagraph"/>
-        <w:numPr>
-          <w:ilvl w:val="0"/>
-          <w:numId w:val="1"/>
-        </w:numPr>
-        <w:rPr>
-          <w:rFonts w:ascii="Calibri" w:hAnsi="Calibri" w:cs="Calibri"/>
-          <w:b/>
-          <w:bCs/>
-          <w:sz w:val="28"/>
-          <w:szCs w:val="28"/>
-          <w:u w:val="single"/>
-        </w:rPr>
-      </w:pPr>
-      <w:r>
-        <w:rPr>
-          <w:rFonts w:ascii="Calibri" w:hAnsi="Calibri" w:cs="Calibri"/>
-          <w:b/>
-          <w:bCs/>
-          <w:sz w:val="28"/>
-          <w:szCs w:val="28"/>
-          <w:u w:val="single"/>
-        </w:rPr>
-        <w:t>Research Location:</w:t>
-      </w:r>
-    </w:p>
-    <w:p>
-      <w:pPr>
-        <w:pStyle w:val="ListParagraph"/>
-        <w:numPr>
-          <w:ilvl w:val="0"/>
-          <w:numId w:val="7"/>
-        </w:numPr>
-      </w:pPr>
-      <w:r>
-        <w:t xml:space="preserve">The research was conducted </w:t>
-      </w:r>
-      <w:r>
-        <w:rPr>
-          <w:rStyle w:val="Strong"/>
-          <w:b w:val="0"/>
-          <w:bCs w:val="0"/>
-        </w:rPr>
-        <w:t>within the college campus</w:t>
-      </w:r>
-      <w:r>
-        <w:t xml:space="preserve">. We interacted with students in different common areas of the campus and discussed the environmental problems they have noticed. </w:t>
-      </w:r>
-    </w:p>
-    <w:p>
-      <w:pPr>
-        <w:pStyle w:val="ListParagraph"/>
-        <w:numPr>
-          <w:ilvl w:val="0"/>
-          <w:numId w:val="7"/>
-        </w:numPr>
-      </w:pPr>
-      <w:r>
-        <w:t>The purpose was to understand their experiences and how they currently deal with such problems.</w:t>
-      </w:r>
-    </w:p>
-    <w:p>
-      <w:pPr>
-        <w:pStyle w:val="ListParagraph"/>
-        <w:ind w:left="360"/>
-        <w:rPr>
-          <w:rFonts w:ascii="Calibri" w:hAnsi="Calibri" w:cs="Calibri"/>
-          <w:b/>
-          <w:bCs/>
-          <w:sz w:val="28"/>
-          <w:szCs w:val="28"/>
-          <w:u w:val="single"/>
-        </w:rPr>
-      </w:pPr>
-    </w:p>
-    <w:p>
-      <w:pPr>
-        <w:pStyle w:val="ListParagraph"/>
-        <w:numPr>
-          <w:ilvl w:val="0"/>
-          <w:numId w:val="1"/>
-        </w:numPr>
-        <w:rPr>
-          <w:rFonts w:ascii="Calibri" w:hAnsi="Calibri" w:cs="Calibri"/>
-          <w:b/>
-          <w:bCs/>
-          <w:sz w:val="28"/>
-          <w:szCs w:val="28"/>
-          <w:u w:val="single"/>
-        </w:rPr>
-      </w:pPr>
-      <w:r>
-        <w:rPr>
-          <w:rFonts w:ascii="Calibri" w:hAnsi="Calibri" w:cs="Calibri"/>
-          <w:b/>
-          <w:bCs/>
-          <w:sz w:val="28"/>
-          <w:szCs w:val="28"/>
-          <w:u w:val="single"/>
-        </w:rPr>
-        <w:t>Interview Questions:</w:t>
-      </w:r>
-    </w:p>
-    <w:p>
-      <w:pPr>
-        <w:spacing w:after="0" w:line="240" w:lineRule="auto"/>
-        <w:ind w:left="360"/>
-        <w:rPr>
-          <w:rFonts w:ascii="Times New Roman" w:eastAsia="Times New Roman" w:hAnsi="Times New Roman" w:cs="Times New Roman"/>
-          <w:kern w:val="0"/>
-          <w:sz w:val="24"/>
-          <w:szCs w:val="24"/>
-          <w:lang w:eastAsia="en-ID"/>
-          <w14:ligatures w14:val="none"/>
-        </w:rPr>
-      </w:pPr>
-      <w:r>
-        <w:rPr>
-          <w:rFonts w:ascii="Times New Roman" w:eastAsia="Times New Roman" w:hAnsi="Times New Roman" w:cs="Times New Roman"/>
           <w:kern w:val="0"/>
           <w:sz w:val="24"/>
           <w:szCs w:val="24"/>
@@ -851,7 +777,7 @@
         <w:spacing w:before="100" w:beforeAutospacing="1" w:after="100" w:afterAutospacing="1" w:line="240" w:lineRule="auto"/>
         <w:ind w:left="1080"/>
         <w:rPr>
-          <w:rFonts w:ascii="Times New Roman" w:eastAsia="Times New Roman" w:hAnsi="Times New Roman" w:cs="Times New Roman"/>
+          <w:rFonts w:eastAsia="Times New Roman" w:cstheme="minorHAnsi"/>
           <w:kern w:val="0"/>
           <w:sz w:val="24"/>
           <w:szCs w:val="24"/>
@@ -861,7 +787,7 @@
       </w:pPr>
       <w:r>
         <w:rPr>
-          <w:rFonts w:ascii="Times New Roman" w:eastAsia="Times New Roman" w:hAnsi="Times New Roman" w:cs="Times New Roman"/>
+          <w:rFonts w:eastAsia="Times New Roman" w:cstheme="minorHAnsi"/>
           <w:kern w:val="0"/>
           <w:sz w:val="24"/>
           <w:szCs w:val="24"/>
@@ -884,7 +810,7 @@
         <w:spacing w:before="100" w:beforeAutospacing="1" w:after="100" w:afterAutospacing="1" w:line="240" w:lineRule="auto"/>
         <w:ind w:left="1080"/>
         <w:rPr>
-          <w:rFonts w:ascii="Times New Roman" w:eastAsia="Times New Roman" w:hAnsi="Times New Roman" w:cs="Times New Roman"/>
+          <w:rFonts w:eastAsia="Times New Roman" w:cstheme="minorHAnsi"/>
           <w:kern w:val="0"/>
           <w:sz w:val="24"/>
           <w:szCs w:val="24"/>
@@ -894,7 +820,7 @@
       </w:pPr>
       <w:r>
         <w:rPr>
-          <w:rFonts w:ascii="Times New Roman" w:eastAsia="Times New Roman" w:hAnsi="Times New Roman" w:cs="Times New Roman"/>
+          <w:rFonts w:eastAsia="Times New Roman" w:cstheme="minorHAnsi"/>
           <w:kern w:val="0"/>
           <w:sz w:val="24"/>
           <w:szCs w:val="24"/>
@@ -917,7 +843,7 @@
         <w:spacing w:before="100" w:beforeAutospacing="1" w:after="100" w:afterAutospacing="1" w:line="240" w:lineRule="auto"/>
         <w:ind w:left="1080"/>
         <w:rPr>
-          <w:rFonts w:ascii="Times New Roman" w:eastAsia="Times New Roman" w:hAnsi="Times New Roman" w:cs="Times New Roman"/>
+          <w:rFonts w:eastAsia="Times New Roman" w:cstheme="minorHAnsi"/>
           <w:kern w:val="0"/>
           <w:sz w:val="24"/>
           <w:szCs w:val="24"/>
@@ -927,7 +853,7 @@
       </w:pPr>
       <w:r>
         <w:rPr>
-          <w:rFonts w:ascii="Times New Roman" w:eastAsia="Times New Roman" w:hAnsi="Times New Roman" w:cs="Times New Roman"/>
+          <w:rFonts w:eastAsia="Times New Roman" w:cstheme="minorHAnsi"/>
           <w:kern w:val="0"/>
           <w:sz w:val="24"/>
           <w:szCs w:val="24"/>
@@ -950,7 +876,7 @@
         <w:spacing w:before="100" w:beforeAutospacing="1" w:after="100" w:afterAutospacing="1" w:line="240" w:lineRule="auto"/>
         <w:ind w:left="1080"/>
         <w:rPr>
-          <w:rFonts w:ascii="Times New Roman" w:eastAsia="Times New Roman" w:hAnsi="Times New Roman" w:cs="Times New Roman"/>
+          <w:rFonts w:eastAsia="Times New Roman" w:cstheme="minorHAnsi"/>
           <w:kern w:val="0"/>
           <w:sz w:val="24"/>
           <w:szCs w:val="24"/>
@@ -960,7 +886,7 @@
       </w:pPr>
       <w:r>
         <w:rPr>
-          <w:rFonts w:ascii="Times New Roman" w:eastAsia="Times New Roman" w:hAnsi="Times New Roman" w:cs="Times New Roman"/>
+          <w:rFonts w:eastAsia="Times New Roman" w:cstheme="minorHAnsi"/>
           <w:kern w:val="0"/>
           <w:sz w:val="24"/>
           <w:szCs w:val="24"/>
@@ -983,7 +909,7 @@
         <w:spacing w:before="100" w:beforeAutospacing="1" w:after="100" w:afterAutospacing="1" w:line="240" w:lineRule="auto"/>
         <w:ind w:left="1080"/>
         <w:rPr>
-          <w:rFonts w:ascii="Times New Roman" w:eastAsia="Times New Roman" w:hAnsi="Times New Roman" w:cs="Times New Roman"/>
+          <w:rFonts w:eastAsia="Times New Roman" w:cstheme="minorHAnsi"/>
           <w:kern w:val="0"/>
           <w:sz w:val="24"/>
           <w:szCs w:val="24"/>
@@ -993,7 +919,7 @@
       </w:pPr>
       <w:r>
         <w:rPr>
-          <w:rFonts w:ascii="Times New Roman" w:eastAsia="Times New Roman" w:hAnsi="Times New Roman" w:cs="Times New Roman"/>
+          <w:rFonts w:eastAsia="Times New Roman" w:cstheme="minorHAnsi"/>
           <w:kern w:val="0"/>
           <w:sz w:val="24"/>
           <w:szCs w:val="24"/>
@@ -1016,7 +942,7 @@
         <w:spacing w:before="100" w:beforeAutospacing="1" w:after="100" w:afterAutospacing="1" w:line="240" w:lineRule="auto"/>
         <w:ind w:left="1080"/>
         <w:rPr>
-          <w:rFonts w:ascii="Times New Roman" w:eastAsia="Times New Roman" w:hAnsi="Times New Roman" w:cs="Times New Roman"/>
+          <w:rFonts w:eastAsia="Times New Roman" w:cstheme="minorHAnsi"/>
           <w:kern w:val="0"/>
           <w:sz w:val="24"/>
           <w:szCs w:val="24"/>
@@ -1026,7 +952,7 @@
       </w:pPr>
       <w:r>
         <w:rPr>
-          <w:rFonts w:ascii="Times New Roman" w:eastAsia="Times New Roman" w:hAnsi="Times New Roman" w:cs="Times New Roman"/>
+          <w:rFonts w:eastAsia="Times New Roman" w:cstheme="minorHAnsi"/>
           <w:kern w:val="0"/>
           <w:sz w:val="24"/>
           <w:szCs w:val="24"/>
@@ -1049,7 +975,7 @@
         <w:spacing w:before="100" w:beforeAutospacing="1" w:after="100" w:afterAutospacing="1" w:line="240" w:lineRule="auto"/>
         <w:ind w:left="1080"/>
         <w:rPr>
-          <w:rFonts w:ascii="Times New Roman" w:eastAsia="Times New Roman" w:hAnsi="Times New Roman" w:cs="Times New Roman"/>
+          <w:rFonts w:eastAsia="Times New Roman" w:cstheme="minorHAnsi"/>
           <w:kern w:val="0"/>
           <w:sz w:val="24"/>
           <w:szCs w:val="24"/>
@@ -1059,7 +985,7 @@
       </w:pPr>
       <w:r>
         <w:rPr>
-          <w:rFonts w:ascii="Times New Roman" w:eastAsia="Times New Roman" w:hAnsi="Times New Roman" w:cs="Times New Roman"/>
+          <w:rFonts w:eastAsia="Times New Roman" w:cstheme="minorHAnsi"/>
           <w:kern w:val="0"/>
           <w:sz w:val="24"/>
           <w:szCs w:val="24"/>
@@ -1082,7 +1008,7 @@
         <w:spacing w:before="100" w:beforeAutospacing="1" w:after="100" w:afterAutospacing="1" w:line="240" w:lineRule="auto"/>
         <w:ind w:left="1080"/>
         <w:rPr>
-          <w:rFonts w:ascii="Times New Roman" w:eastAsia="Times New Roman" w:hAnsi="Times New Roman" w:cs="Times New Roman"/>
+          <w:rFonts w:eastAsia="Times New Roman" w:cstheme="minorHAnsi"/>
           <w:kern w:val="0"/>
           <w:sz w:val="24"/>
           <w:szCs w:val="24"/>
@@ -1092,7 +1018,7 @@
       </w:pPr>
       <w:r>
         <w:rPr>
-          <w:rFonts w:ascii="Times New Roman" w:eastAsia="Times New Roman" w:hAnsi="Times New Roman" w:cs="Times New Roman"/>
+          <w:rFonts w:eastAsia="Times New Roman" w:cstheme="minorHAnsi"/>
           <w:kern w:val="0"/>
           <w:sz w:val="24"/>
           <w:szCs w:val="24"/>
@@ -1110,7 +1036,7 @@
           <w:numId w:val="1"/>
         </w:numPr>
         <w:rPr>
-          <w:rFonts w:ascii="Calibri" w:hAnsi="Calibri" w:cs="Calibri"/>
+          <w:rFonts w:cstheme="minorHAnsi"/>
           <w:b/>
           <w:bCs/>
           <w:sz w:val="28"/>
@@ -1120,7 +1046,7 @@
       </w:pPr>
       <w:r>
         <w:rPr>
-          <w:rFonts w:ascii="Calibri" w:hAnsi="Calibri" w:cs="Calibri"/>
+          <w:rFonts w:cstheme="minorHAnsi"/>
           <w:b/>
           <w:bCs/>
           <w:sz w:val="28"/>
@@ -1138,7 +1064,7 @@
           <w:numId w:val="11"/>
         </w:numPr>
         <w:rPr>
-          <w:rFonts w:ascii="Calibri" w:hAnsi="Calibri" w:cs="Calibri"/>
+          <w:rFonts w:cstheme="minorHAnsi"/>
           <w:b/>
           <w:bCs/>
           <w:sz w:val="28"/>
@@ -1147,6 +1073,9 @@
         </w:rPr>
       </w:pPr>
       <w:r>
+        <w:rPr>
+          <w:rFonts w:cstheme="minorHAnsi"/>
+        </w:rPr>
         <w:t>Most students said that they have noticed problems like garbage, overflowing dustbins and improper waste disposal around the campus.</w:t>
       </w:r>
     </w:p>
@@ -1158,7 +1087,7 @@
           <w:numId w:val="11"/>
         </w:numPr>
         <w:rPr>
-          <w:rFonts w:ascii="Calibri" w:hAnsi="Calibri" w:cs="Calibri"/>
+          <w:rFonts w:cstheme="minorHAnsi"/>
           <w:b/>
           <w:bCs/>
           <w:sz w:val="28"/>
@@ -1167,6 +1096,9 @@
         </w:rPr>
       </w:pPr>
       <w:r>
+        <w:rPr>
+          <w:rFonts w:cstheme="minorHAnsi"/>
+        </w:rPr>
         <w:t>Some students said that they usually do not report these problems because they are not sure whom they should contact. Because of this, they often ignore the issue and continue with their work.</w:t>
       </w:r>
     </w:p>
@@ -1178,7 +1110,7 @@
           <w:numId w:val="11"/>
         </w:numPr>
         <w:rPr>
-          <w:rFonts w:ascii="Calibri" w:hAnsi="Calibri" w:cs="Calibri"/>
+          <w:rFonts w:cstheme="minorHAnsi"/>
           <w:b/>
           <w:bCs/>
           <w:sz w:val="28"/>
@@ -1187,6 +1119,9 @@
         </w:rPr>
       </w:pPr>
       <w:r>
+        <w:rPr>
+          <w:rFonts w:cstheme="minorHAnsi"/>
+        </w:rPr>
         <w:lastRenderedPageBreak/>
         <w:t>One important concern was injured or harmed animals. Students mentioned that they have seen animals on roads that appeared injured, but they were not sure which person or organization could help them.</w:t>
       </w:r>
@@ -1199,7 +1134,7 @@
           <w:numId w:val="11"/>
         </w:numPr>
         <w:rPr>
-          <w:rFonts w:ascii="Calibri" w:hAnsi="Calibri" w:cs="Calibri"/>
+          <w:rFonts w:cstheme="minorHAnsi"/>
           <w:b/>
           <w:bCs/>
           <w:sz w:val="28"/>
@@ -1208,15 +1143,10 @@
         </w:rPr>
       </w:pPr>
       <w:r>
-        <w:t xml:space="preserve">Students also felt that taking a photograph would make the complaint </w:t>
-      </w:r>
-      <w:proofErr w:type="gramStart"/>
-      <w:r>
-        <w:t>more clear</w:t>
-      </w:r>
-      <w:proofErr w:type="gramEnd"/>
-      <w:r>
-        <w:t>. They said that adding the exact location would make it easier for the concerned person to find the problem.</w:t>
+        <w:rPr>
+          <w:rFonts w:cstheme="minorHAnsi"/>
+        </w:rPr>
+        <w:t>Students also felt that taking a photograph would make the complaint more clear. They said that adding the exact location would make it easier for the concerned person to find the problem.</w:t>
       </w:r>
     </w:p>
     <w:p>
@@ -1227,7 +1157,7 @@
           <w:numId w:val="11"/>
         </w:numPr>
         <w:rPr>
-          <w:rFonts w:ascii="Calibri" w:hAnsi="Calibri" w:cs="Calibri"/>
+          <w:rFonts w:cstheme="minorHAnsi"/>
           <w:b/>
           <w:bCs/>
           <w:sz w:val="28"/>
@@ -1236,6 +1166,9 @@
         </w:rPr>
       </w:pPr>
       <w:r>
+        <w:rPr>
+          <w:rFonts w:cstheme="minorHAnsi"/>
+        </w:rPr>
         <w:t>Overall, students preferred a system that is quick and easy to use. They also felt that knowing the status of their complaint would make them more interested in using such a platform.</w:t>
       </w:r>
     </w:p>
@@ -1244,7 +1177,7 @@
         <w:pStyle w:val="ListParagraph"/>
         <w:ind w:left="360"/>
         <w:rPr>
-          <w:rFonts w:ascii="Calibri" w:hAnsi="Calibri" w:cs="Calibri"/>
+          <w:rFonts w:cstheme="minorHAnsi"/>
           <w:b/>
           <w:bCs/>
           <w:sz w:val="28"/>
@@ -1261,7 +1194,7 @@
           <w:numId w:val="1"/>
         </w:numPr>
         <w:rPr>
-          <w:rFonts w:ascii="Calibri" w:hAnsi="Calibri" w:cs="Calibri"/>
+          <w:rFonts w:cstheme="minorHAnsi"/>
           <w:b/>
           <w:bCs/>
           <w:sz w:val="28"/>
@@ -1271,7 +1204,7 @@
       </w:pPr>
       <w:r>
         <w:rPr>
-          <w:rFonts w:ascii="Calibri" w:hAnsi="Calibri" w:cs="Calibri"/>
+          <w:rFonts w:cstheme="minorHAnsi"/>
           <w:b/>
           <w:bCs/>
           <w:sz w:val="28"/>
@@ -1289,7 +1222,7 @@
           <w:numId w:val="12"/>
         </w:numPr>
         <w:rPr>
-          <w:rFonts w:ascii="Calibri" w:hAnsi="Calibri" w:cs="Calibri"/>
+          <w:rFonts w:cstheme="minorHAnsi"/>
           <w:b/>
           <w:bCs/>
           <w:sz w:val="28"/>
@@ -1298,6 +1231,9 @@
         </w:rPr>
       </w:pPr>
       <w:r>
+        <w:rPr>
+          <w:rFonts w:cstheme="minorHAnsi"/>
+        </w:rPr>
         <w:t>During the interactions, we noticed that students were aware of environmental problems but did not always take action.</w:t>
       </w:r>
     </w:p>
@@ -1309,7 +1245,7 @@
           <w:numId w:val="12"/>
         </w:numPr>
         <w:rPr>
-          <w:rFonts w:ascii="Calibri" w:hAnsi="Calibri" w:cs="Calibri"/>
+          <w:rFonts w:cstheme="minorHAnsi"/>
           <w:b/>
           <w:bCs/>
           <w:sz w:val="28"/>
@@ -1318,6 +1254,9 @@
         </w:rPr>
       </w:pPr>
       <w:r>
+        <w:rPr>
+          <w:rFonts w:cstheme="minorHAnsi"/>
+        </w:rPr>
         <w:t>The main reason seemed to be the lack of a simple reporting process. Students often did not know where to report an issue or whether their complaint would actually be considered.</w:t>
       </w:r>
     </w:p>
@@ -1329,7 +1268,7 @@
           <w:numId w:val="12"/>
         </w:numPr>
         <w:rPr>
-          <w:rFonts w:ascii="Calibri" w:hAnsi="Calibri" w:cs="Calibri"/>
+          <w:rFonts w:cstheme="minorHAnsi"/>
           <w:b/>
           <w:bCs/>
           <w:sz w:val="28"/>
@@ -1338,6 +1277,9 @@
         </w:rPr>
       </w:pPr>
       <w:r>
+        <w:rPr>
+          <w:rFonts w:cstheme="minorHAnsi"/>
+        </w:rPr>
         <w:t>We also observed that location can be important while reporting a problem. A photo along with the exact location can give the responsible person a much better understanding of the situation.</w:t>
       </w:r>
     </w:p>
@@ -1349,7 +1291,7 @@
           <w:numId w:val="12"/>
         </w:numPr>
         <w:rPr>
-          <w:rFonts w:ascii="Calibri" w:hAnsi="Calibri" w:cs="Calibri"/>
+          <w:rFonts w:cstheme="minorHAnsi"/>
           <w:b/>
           <w:bCs/>
           <w:sz w:val="28"/>
@@ -1358,6 +1300,9 @@
         </w:rPr>
       </w:pPr>
       <w:r>
+        <w:rPr>
+          <w:rFonts w:cstheme="minorHAnsi"/>
+        </w:rPr>
         <w:t>In the case of injured animals, quick reporting can be especially important because the animal may need immediate help.</w:t>
       </w:r>
     </w:p>
@@ -1366,7 +1311,7 @@
         <w:pStyle w:val="ListParagraph"/>
         <w:ind w:left="360"/>
         <w:rPr>
-          <w:rFonts w:ascii="Calibri" w:hAnsi="Calibri" w:cs="Calibri"/>
+          <w:rFonts w:cstheme="minorHAnsi"/>
           <w:b/>
           <w:bCs/>
           <w:sz w:val="28"/>
@@ -1383,7 +1328,7 @@
           <w:numId w:val="1"/>
         </w:numPr>
         <w:rPr>
-          <w:rFonts w:ascii="Calibri" w:hAnsi="Calibri" w:cs="Calibri"/>
+          <w:rFonts w:cstheme="minorHAnsi"/>
           <w:b/>
           <w:bCs/>
           <w:sz w:val="28"/>
@@ -1391,29 +1336,16 @@
           <w:u w:val="single"/>
         </w:rPr>
       </w:pPr>
-      <w:proofErr w:type="gramStart"/>
-      <w:r>
-        <w:rPr>
-          <w:rFonts w:ascii="Calibri" w:hAnsi="Calibri" w:cs="Calibri"/>
+      <w:r>
+        <w:rPr>
+          <w:rFonts w:cstheme="minorHAnsi"/>
           <w:b/>
           <w:bCs/>
           <w:sz w:val="28"/>
           <w:szCs w:val="28"/>
           <w:u w:val="single"/>
         </w:rPr>
-        <w:t>Pain  Points</w:t>
-      </w:r>
-      <w:proofErr w:type="gramEnd"/>
-      <w:r>
-        <w:rPr>
-          <w:rFonts w:ascii="Calibri" w:hAnsi="Calibri" w:cs="Calibri"/>
-          <w:b/>
-          <w:bCs/>
-          <w:sz w:val="28"/>
-          <w:szCs w:val="28"/>
-          <w:u w:val="single"/>
-        </w:rPr>
-        <w:t>:</w:t>
+        <w:t>Pain  Points:</w:t>
       </w:r>
     </w:p>
     <w:p>
@@ -1424,7 +1356,7 @@
           <w:numId w:val="13"/>
         </w:numPr>
         <w:rPr>
-          <w:rFonts w:ascii="Calibri" w:hAnsi="Calibri" w:cs="Calibri"/>
+          <w:rFonts w:cstheme="minorHAnsi"/>
           <w:b/>
           <w:bCs/>
           <w:sz w:val="28"/>
@@ -1433,6 +1365,9 @@
         </w:rPr>
       </w:pPr>
       <w:r>
+        <w:rPr>
+          <w:rFonts w:cstheme="minorHAnsi"/>
+        </w:rPr>
         <w:t>The first major pain point is that students do not have one common place to report different environmental issues.</w:t>
       </w:r>
     </w:p>
@@ -1444,7 +1379,7 @@
           <w:numId w:val="13"/>
         </w:numPr>
         <w:rPr>
-          <w:rFonts w:ascii="Calibri" w:hAnsi="Calibri" w:cs="Calibri"/>
+          <w:rFonts w:cstheme="minorHAnsi"/>
           <w:b/>
           <w:bCs/>
           <w:sz w:val="28"/>
@@ -1453,15 +1388,22 @@
         </w:rPr>
       </w:pPr>
       <w:r>
+        <w:rPr>
+          <w:rFonts w:cstheme="minorHAnsi"/>
+        </w:rPr>
         <w:t xml:space="preserve">Another problem is that students are often unsure about </w:t>
       </w:r>
       <w:r>
         <w:rPr>
           <w:rStyle w:val="Strong"/>
+          <w:rFonts w:cstheme="minorHAnsi"/>
         </w:rPr>
         <w:t>whom to contact</w:t>
       </w:r>
       <w:r>
+        <w:rPr>
+          <w:rFonts w:cstheme="minorHAnsi"/>
+        </w:rPr>
         <w:t>. This can discourage them from reporting the problem at all.</w:t>
       </w:r>
     </w:p>
@@ -1473,7 +1415,7 @@
           <w:numId w:val="13"/>
         </w:numPr>
         <w:rPr>
-          <w:rFonts w:ascii="Calibri" w:hAnsi="Calibri" w:cs="Calibri"/>
+          <w:rFonts w:cstheme="minorHAnsi"/>
           <w:b/>
           <w:bCs/>
           <w:sz w:val="28"/>
@@ -1482,6 +1424,9 @@
         </w:rPr>
       </w:pPr>
       <w:r>
+        <w:rPr>
+          <w:rFonts w:cstheme="minorHAnsi"/>
+        </w:rPr>
         <w:t>Students may also find the existing reporting process inconvenient or time-consuming. Because of this, smaller issues are often ignored.</w:t>
       </w:r>
     </w:p>
@@ -1493,7 +1438,7 @@
           <w:numId w:val="13"/>
         </w:numPr>
         <w:rPr>
-          <w:rFonts w:ascii="Calibri" w:hAnsi="Calibri" w:cs="Calibri"/>
+          <w:rFonts w:cstheme="minorHAnsi"/>
           <w:b/>
           <w:bCs/>
           <w:sz w:val="28"/>
@@ -1502,6 +1447,9 @@
         </w:rPr>
       </w:pPr>
       <w:r>
+        <w:rPr>
+          <w:rFonts w:cstheme="minorHAnsi"/>
+        </w:rPr>
         <w:t>There is also a lack of proper location and evidence in normal complaints. Without a photo or exact location, it can be difficult to understand the actual problem.</w:t>
       </w:r>
     </w:p>
@@ -1513,7 +1461,7 @@
           <w:numId w:val="13"/>
         </w:numPr>
         <w:rPr>
-          <w:rFonts w:ascii="Calibri" w:hAnsi="Calibri" w:cs="Calibri"/>
+          <w:rFonts w:cstheme="minorHAnsi"/>
           <w:b/>
           <w:bCs/>
           <w:sz w:val="28"/>
@@ -1522,6 +1470,9 @@
         </w:rPr>
       </w:pPr>
       <w:r>
+        <w:rPr>
+          <w:rFonts w:cstheme="minorHAnsi"/>
+        </w:rPr>
         <w:t>Students also do not always know what happens after they report an issue. They would prefer to see whether their complaint is being reviewed or resolved.</w:t>
       </w:r>
     </w:p>
@@ -1530,7 +1481,49 @@
         <w:pStyle w:val="ListParagraph"/>
         <w:ind w:left="360"/>
         <w:rPr>
-          <w:rFonts w:ascii="Calibri" w:hAnsi="Calibri" w:cs="Calibri"/>
+          <w:rFonts w:cstheme="minorHAnsi"/>
+          <w:b/>
+          <w:bCs/>
+          <w:sz w:val="28"/>
+          <w:szCs w:val="28"/>
+          <w:u w:val="single"/>
+        </w:rPr>
+      </w:pPr>
+    </w:p>
+    <w:p>
+      <w:pPr>
+        <w:pStyle w:val="ListParagraph"/>
+        <w:ind w:left="360"/>
+        <w:rPr>
+          <w:rFonts w:cstheme="minorHAnsi"/>
+          <w:b/>
+          <w:bCs/>
+          <w:sz w:val="28"/>
+          <w:szCs w:val="28"/>
+          <w:u w:val="single"/>
+        </w:rPr>
+      </w:pPr>
+    </w:p>
+    <w:p>
+      <w:pPr>
+        <w:pStyle w:val="ListParagraph"/>
+        <w:ind w:left="360"/>
+        <w:rPr>
+          <w:rFonts w:cstheme="minorHAnsi"/>
+          <w:b/>
+          <w:bCs/>
+          <w:sz w:val="28"/>
+          <w:szCs w:val="28"/>
+          <w:u w:val="single"/>
+        </w:rPr>
+      </w:pPr>
+    </w:p>
+    <w:p>
+      <w:pPr>
+        <w:pStyle w:val="ListParagraph"/>
+        <w:ind w:left="360"/>
+        <w:rPr>
+          <w:rFonts w:cstheme="minorHAnsi"/>
           <w:b/>
           <w:bCs/>
           <w:sz w:val="28"/>
@@ -1547,7 +1540,7 @@
           <w:numId w:val="1"/>
         </w:numPr>
         <w:rPr>
-          <w:rFonts w:ascii="Calibri" w:hAnsi="Calibri" w:cs="Calibri"/>
+          <w:rFonts w:cstheme="minorHAnsi"/>
           <w:b/>
           <w:bCs/>
           <w:sz w:val="28"/>
@@ -1557,13 +1550,14 @@
       </w:pPr>
       <w:r>
         <w:rPr>
-          <w:rFonts w:ascii="Calibri" w:hAnsi="Calibri" w:cs="Calibri"/>
+          <w:rFonts w:cstheme="minorHAnsi"/>
           <w:b/>
           <w:bCs/>
           <w:sz w:val="28"/>
           <w:szCs w:val="28"/>
           <w:u w:val="single"/>
         </w:rPr>
+        <w:lastRenderedPageBreak/>
         <w:t>Key Insights:</w:t>
       </w:r>
     </w:p>
@@ -1576,7 +1570,7 @@
         </w:numPr>
         <w:spacing w:after="0" w:line="240" w:lineRule="auto"/>
         <w:rPr>
-          <w:rFonts w:ascii="Times New Roman" w:eastAsia="Times New Roman" w:hAnsi="Times New Roman" w:cs="Times New Roman"/>
+          <w:rFonts w:eastAsia="Times New Roman" w:cstheme="minorHAnsi"/>
           <w:kern w:val="0"/>
           <w:sz w:val="24"/>
           <w:szCs w:val="24"/>
@@ -1586,14 +1580,13 @@
       </w:pPr>
       <w:r>
         <w:rPr>
-          <w:rFonts w:ascii="Times New Roman" w:eastAsia="Times New Roman" w:hAnsi="Times New Roman" w:cs="Times New Roman"/>
+          <w:rFonts w:eastAsia="Times New Roman" w:cstheme="minorHAnsi"/>
           <w:kern w:val="0"/>
           <w:sz w:val="24"/>
           <w:szCs w:val="24"/>
           <w:lang w:eastAsia="en-ID"/>
           <w14:ligatures w14:val="none"/>
         </w:rPr>
-        <w:lastRenderedPageBreak/>
         <w:t xml:space="preserve">Many students notice problems but avoid reporting them because they don't know whom to contact or the process feels inconvenient. </w:t>
       </w:r>
     </w:p>
@@ -1606,7 +1599,7 @@
         </w:numPr>
         <w:spacing w:after="0" w:line="240" w:lineRule="auto"/>
         <w:rPr>
-          <w:rFonts w:ascii="Times New Roman" w:eastAsia="Times New Roman" w:hAnsi="Times New Roman" w:cs="Times New Roman"/>
+          <w:rFonts w:eastAsia="Times New Roman" w:cstheme="minorHAnsi"/>
           <w:kern w:val="0"/>
           <w:sz w:val="24"/>
           <w:szCs w:val="24"/>
@@ -1616,7 +1609,7 @@
       </w:pPr>
       <w:r>
         <w:rPr>
-          <w:rFonts w:ascii="Times New Roman" w:eastAsia="Times New Roman" w:hAnsi="Times New Roman" w:cs="Times New Roman"/>
+          <w:rFonts w:eastAsia="Times New Roman" w:cstheme="minorHAnsi"/>
           <w:kern w:val="0"/>
           <w:sz w:val="24"/>
           <w:szCs w:val="24"/>
@@ -1633,8 +1626,9 @@
           <w:ilvl w:val="0"/>
           <w:numId w:val="14"/>
         </w:numPr>
-        <w:rPr>
-          <w:rFonts w:ascii="Calibri" w:hAnsi="Calibri" w:cs="Calibri"/>
+        <w:spacing w:after="0"/>
+        <w:rPr>
+          <w:rFonts w:cstheme="minorHAnsi"/>
           <w:b/>
           <w:bCs/>
           <w:sz w:val="28"/>
@@ -1644,7 +1638,7 @@
       </w:pPr>
       <w:r>
         <w:rPr>
-          <w:rFonts w:ascii="Times New Roman" w:eastAsia="Times New Roman" w:hAnsi="Times New Roman" w:cs="Times New Roman"/>
+          <w:rFonts w:eastAsia="Times New Roman" w:cstheme="minorHAnsi"/>
           <w:kern w:val="0"/>
           <w:sz w:val="24"/>
           <w:szCs w:val="24"/>
@@ -1656,9 +1650,303 @@
     </w:p>
     <w:p>
       <w:pPr>
+        <w:numPr>
+          <w:ilvl w:val="0"/>
+          <w:numId w:val="14"/>
+        </w:numPr>
+        <w:spacing w:after="100" w:afterAutospacing="1" w:line="240" w:lineRule="auto"/>
+        <w:rPr>
+          <w:rFonts w:eastAsia="Times New Roman" w:cstheme="minorHAnsi"/>
+          <w:kern w:val="0"/>
+          <w:sz w:val="24"/>
+          <w:szCs w:val="24"/>
+          <w:lang w:eastAsia="en-ID"/>
+          <w14:ligatures w14:val="none"/>
+        </w:rPr>
+      </w:pPr>
+      <w:r>
+        <w:rPr>
+          <w:rFonts w:eastAsia="Times New Roman" w:cstheme="minorHAnsi"/>
+          <w:kern w:val="0"/>
+          <w:sz w:val="24"/>
+          <w:szCs w:val="24"/>
+          <w:lang w:eastAsia="en-ID"/>
+          <w14:ligatures w14:val="none"/>
+        </w:rPr>
+        <w:t xml:space="preserve">Students want to know what happens after they submit a report. Without any status update or feedback, they may feel that their complaint has been ignored. </w:t>
+      </w:r>
+    </w:p>
+    <w:p>
+      <w:pPr>
+        <w:numPr>
+          <w:ilvl w:val="0"/>
+          <w:numId w:val="14"/>
+        </w:numPr>
+        <w:spacing w:before="100" w:beforeAutospacing="1" w:after="100" w:afterAutospacing="1" w:line="240" w:lineRule="auto"/>
+        <w:rPr>
+          <w:rFonts w:eastAsia="Times New Roman" w:cstheme="minorHAnsi"/>
+          <w:kern w:val="0"/>
+          <w:sz w:val="24"/>
+          <w:szCs w:val="24"/>
+          <w:lang w:eastAsia="en-ID"/>
+          <w14:ligatures w14:val="none"/>
+        </w:rPr>
+      </w:pPr>
+      <w:r>
+        <w:rPr>
+          <w:rFonts w:eastAsia="Times New Roman" w:cstheme="minorHAnsi"/>
+          <w:kern w:val="0"/>
+          <w:sz w:val="24"/>
+          <w:szCs w:val="24"/>
+          <w:lang w:eastAsia="en-ID"/>
+          <w14:ligatures w14:val="none"/>
+        </w:rPr>
+        <w:t xml:space="preserve">Students prefer a quick reporting process that does not require too many steps. A simple form with only necessary information could make them more comfortable reporting issues when they notice them. </w:t>
+      </w:r>
+    </w:p>
+    <w:p>
+      <w:pPr>
+        <w:numPr>
+          <w:ilvl w:val="0"/>
+          <w:numId w:val="14"/>
+        </w:numPr>
+        <w:spacing w:before="100" w:beforeAutospacing="1" w:after="100" w:afterAutospacing="1" w:line="240" w:lineRule="auto"/>
+        <w:rPr>
+          <w:rFonts w:eastAsia="Times New Roman" w:cstheme="minorHAnsi"/>
+          <w:kern w:val="0"/>
+          <w:sz w:val="24"/>
+          <w:szCs w:val="24"/>
+          <w:lang w:eastAsia="en-ID"/>
+          <w14:ligatures w14:val="none"/>
+        </w:rPr>
+      </w:pPr>
+      <w:r>
+        <w:rPr>
+          <w:rFonts w:eastAsia="Times New Roman" w:cstheme="minorHAnsi"/>
+          <w:kern w:val="0"/>
+          <w:sz w:val="24"/>
+          <w:szCs w:val="24"/>
+          <w:lang w:eastAsia="en-ID"/>
+          <w14:ligatures w14:val="none"/>
+        </w:rPr>
+        <w:t xml:space="preserve">The seriousness of an issue can affect how students respond to it. Issues such as injured animals or situations that may cause immediate harm may need a faster response than regular environmental complaints. </w:t>
+      </w:r>
+    </w:p>
+    <w:p>
+      <w:pPr>
+        <w:numPr>
+          <w:ilvl w:val="0"/>
+          <w:numId w:val="14"/>
+        </w:numPr>
+        <w:spacing w:before="100" w:beforeAutospacing="1" w:after="100" w:afterAutospacing="1" w:line="240" w:lineRule="auto"/>
+        <w:rPr>
+          <w:rFonts w:eastAsia="Times New Roman" w:cstheme="minorHAnsi"/>
+          <w:kern w:val="0"/>
+          <w:sz w:val="24"/>
+          <w:szCs w:val="24"/>
+          <w:lang w:eastAsia="en-ID"/>
+          <w14:ligatures w14:val="none"/>
+        </w:rPr>
+      </w:pPr>
+      <w:r>
+        <w:rPr>
+          <w:rFonts w:eastAsia="Times New Roman" w:cstheme="minorHAnsi"/>
+          <w:kern w:val="0"/>
+          <w:sz w:val="24"/>
+          <w:szCs w:val="24"/>
+          <w:lang w:eastAsia="en-ID"/>
+          <w14:ligatures w14:val="none"/>
+        </w:rPr>
+        <w:t xml:space="preserve">Students are more likely to report issues when they feel their report can lead to actual action. Knowing that the report will reach the right person or department can encourage them to participate. </w:t>
+      </w:r>
+    </w:p>
+    <w:p>
+      <w:pPr>
         <w:pStyle w:val="ListParagraph"/>
         <w:rPr>
-          <w:rFonts w:ascii="Calibri" w:hAnsi="Calibri" w:cs="Calibri"/>
+          <w:rFonts w:cstheme="minorHAnsi"/>
+          <w:b/>
+          <w:bCs/>
+          <w:sz w:val="28"/>
+          <w:szCs w:val="28"/>
+          <w:u w:val="single"/>
+        </w:rPr>
+      </w:pPr>
+    </w:p>
+    <w:p>
+      <w:pPr>
+        <w:pStyle w:val="ListParagraph"/>
+        <w:rPr>
+          <w:rFonts w:cstheme="minorHAnsi"/>
+          <w:b/>
+          <w:bCs/>
+          <w:sz w:val="28"/>
+          <w:szCs w:val="28"/>
+          <w:u w:val="single"/>
+        </w:rPr>
+      </w:pPr>
+    </w:p>
+    <w:p>
+      <w:pPr>
+        <w:pStyle w:val="ListParagraph"/>
+        <w:rPr>
+          <w:rFonts w:cstheme="minorHAnsi"/>
+          <w:b/>
+          <w:bCs/>
+          <w:sz w:val="28"/>
+          <w:szCs w:val="28"/>
+          <w:u w:val="single"/>
+        </w:rPr>
+      </w:pPr>
+    </w:p>
+    <w:p>
+      <w:pPr>
+        <w:pStyle w:val="ListParagraph"/>
+        <w:rPr>
+          <w:rFonts w:cstheme="minorHAnsi"/>
+          <w:b/>
+          <w:bCs/>
+          <w:sz w:val="28"/>
+          <w:szCs w:val="28"/>
+          <w:u w:val="single"/>
+        </w:rPr>
+      </w:pPr>
+    </w:p>
+    <w:p>
+      <w:pPr>
+        <w:pStyle w:val="ListParagraph"/>
+        <w:rPr>
+          <w:rFonts w:cstheme="minorHAnsi"/>
+          <w:b/>
+          <w:bCs/>
+          <w:sz w:val="28"/>
+          <w:szCs w:val="28"/>
+          <w:u w:val="single"/>
+        </w:rPr>
+      </w:pPr>
+    </w:p>
+    <w:p>
+      <w:pPr>
+        <w:pStyle w:val="ListParagraph"/>
+        <w:rPr>
+          <w:rFonts w:cstheme="minorHAnsi"/>
+          <w:b/>
+          <w:bCs/>
+          <w:sz w:val="28"/>
+          <w:szCs w:val="28"/>
+          <w:u w:val="single"/>
+        </w:rPr>
+      </w:pPr>
+    </w:p>
+    <w:p>
+      <w:pPr>
+        <w:pStyle w:val="ListParagraph"/>
+        <w:rPr>
+          <w:rFonts w:cstheme="minorHAnsi"/>
+          <w:b/>
+          <w:bCs/>
+          <w:sz w:val="28"/>
+          <w:szCs w:val="28"/>
+          <w:u w:val="single"/>
+        </w:rPr>
+      </w:pPr>
+    </w:p>
+    <w:p>
+      <w:pPr>
+        <w:pStyle w:val="ListParagraph"/>
+        <w:rPr>
+          <w:rFonts w:cstheme="minorHAnsi"/>
+          <w:b/>
+          <w:bCs/>
+          <w:sz w:val="28"/>
+          <w:szCs w:val="28"/>
+          <w:u w:val="single"/>
+        </w:rPr>
+      </w:pPr>
+    </w:p>
+    <w:p>
+      <w:pPr>
+        <w:pStyle w:val="ListParagraph"/>
+        <w:rPr>
+          <w:rFonts w:cstheme="minorHAnsi"/>
+          <w:b/>
+          <w:bCs/>
+          <w:sz w:val="28"/>
+          <w:szCs w:val="28"/>
+          <w:u w:val="single"/>
+        </w:rPr>
+      </w:pPr>
+    </w:p>
+    <w:p>
+      <w:pPr>
+        <w:pStyle w:val="ListParagraph"/>
+        <w:rPr>
+          <w:rFonts w:cstheme="minorHAnsi"/>
+          <w:b/>
+          <w:bCs/>
+          <w:sz w:val="28"/>
+          <w:szCs w:val="28"/>
+          <w:u w:val="single"/>
+        </w:rPr>
+      </w:pPr>
+    </w:p>
+    <w:p>
+      <w:pPr>
+        <w:pStyle w:val="ListParagraph"/>
+        <w:rPr>
+          <w:rFonts w:cstheme="minorHAnsi"/>
+          <w:b/>
+          <w:bCs/>
+          <w:sz w:val="28"/>
+          <w:szCs w:val="28"/>
+          <w:u w:val="single"/>
+        </w:rPr>
+      </w:pPr>
+    </w:p>
+    <w:p>
+      <w:pPr>
+        <w:pStyle w:val="ListParagraph"/>
+        <w:rPr>
+          <w:rFonts w:cstheme="minorHAnsi"/>
+          <w:b/>
+          <w:bCs/>
+          <w:sz w:val="28"/>
+          <w:szCs w:val="28"/>
+          <w:u w:val="single"/>
+        </w:rPr>
+      </w:pPr>
+    </w:p>
+    <w:p>
+      <w:pPr>
+        <w:pStyle w:val="ListParagraph"/>
+        <w:rPr>
+          <w:rFonts w:cstheme="minorHAnsi"/>
+          <w:b/>
+          <w:bCs/>
+          <w:sz w:val="28"/>
+          <w:szCs w:val="28"/>
+          <w:u w:val="single"/>
+        </w:rPr>
+      </w:pPr>
+    </w:p>
+    <w:p>
+      <w:pPr>
+        <w:pStyle w:val="ListParagraph"/>
+        <w:rPr>
+          <w:rFonts w:cstheme="minorHAnsi"/>
+          <w:b/>
+          <w:bCs/>
+          <w:sz w:val="28"/>
+          <w:szCs w:val="28"/>
+          <w:u w:val="single"/>
+        </w:rPr>
+      </w:pPr>
+    </w:p>
+    <w:p>
+      <w:pPr>
+        <w:pStyle w:val="ListParagraph"/>
+        <w:rPr>
+          <w:rFonts w:cstheme="minorHAnsi"/>
           <w:b/>
           <w:bCs/>
           <w:sz w:val="28"/>
@@ -1676,7 +1964,7 @@
         </w:numPr>
         <w:spacing w:after="0"/>
         <w:rPr>
-          <w:rFonts w:ascii="Calibri" w:hAnsi="Calibri" w:cs="Calibri"/>
+          <w:rFonts w:cstheme="minorHAnsi"/>
           <w:b/>
           <w:bCs/>
           <w:sz w:val="28"/>
@@ -1686,18 +1974,19 @@
       </w:pPr>
       <w:r>
         <w:rPr>
-          <w:rFonts w:ascii="Calibri" w:hAnsi="Calibri" w:cs="Calibri"/>
+          <w:rFonts w:cstheme="minorHAnsi"/>
           <w:b/>
           <w:bCs/>
           <w:sz w:val="28"/>
           <w:szCs w:val="28"/>
           <w:u w:val="single"/>
         </w:rPr>
+        <w:lastRenderedPageBreak/>
         <w:t>Photographic Evidence:</w:t>
       </w:r>
       <w:r>
         <w:rPr>
-          <w:rFonts w:ascii="Calibri" w:hAnsi="Calibri" w:cs="Calibri"/>
+          <w:rFonts w:cstheme="minorHAnsi"/>
           <w:b/>
           <w:bCs/>
           <w:noProof/>
@@ -1714,7 +2003,7 @@
         <w:spacing w:after="0"/>
         <w:ind w:left="360"/>
         <w:rPr>
-          <w:rFonts w:ascii="Calibri" w:hAnsi="Calibri" w:cs="Calibri"/>
+          <w:rFonts w:cstheme="minorHAnsi"/>
           <w:b/>
           <w:bCs/>
           <w:sz w:val="28"/>
@@ -1729,7 +2018,7 @@
         <w:spacing w:after="0"/>
         <w:ind w:left="360"/>
         <w:rPr>
-          <w:rFonts w:ascii="Calibri" w:hAnsi="Calibri" w:cs="Calibri"/>
+          <w:rFonts w:cstheme="minorHAnsi"/>
           <w:b/>
           <w:bCs/>
           <w:sz w:val="28"/>
@@ -1739,7 +2028,7 @@
       </w:pPr>
       <w:r>
         <w:rPr>
-          <w:rFonts w:ascii="Calibri" w:hAnsi="Calibri" w:cs="Calibri"/>
+          <w:rFonts w:cstheme="minorHAnsi"/>
           <w:b/>
           <w:bCs/>
           <w:noProof/>
@@ -1793,7 +2082,7 @@
     <w:p>
       <w:pPr>
         <w:rPr>
-          <w:rFonts w:ascii="Calibri" w:hAnsi="Calibri" w:cs="Calibri"/>
+          <w:rFonts w:cstheme="minorHAnsi"/>
           <w:b/>
           <w:bCs/>
           <w:sz w:val="28"/>
@@ -1803,7 +2092,7 @@
       </w:pPr>
       <w:r>
         <w:rPr>
-          <w:rFonts w:ascii="Calibri" w:hAnsi="Calibri" w:cs="Calibri"/>
+          <w:rFonts w:cstheme="minorHAnsi"/>
           <w:b/>
           <w:bCs/>
           <w:noProof/>
@@ -1858,7 +2147,7 @@
     <w:p>
       <w:pPr>
         <w:rPr>
-          <w:rFonts w:ascii="Calibri" w:hAnsi="Calibri" w:cs="Calibri"/>
+          <w:rFonts w:cstheme="minorHAnsi"/>
           <w:b/>
           <w:bCs/>
           <w:sz w:val="28"/>
@@ -1868,7 +2157,7 @@
       </w:pPr>
       <w:r>
         <w:rPr>
-          <w:rFonts w:ascii="Calibri" w:hAnsi="Calibri" w:cs="Calibri"/>
+          <w:rFonts w:cstheme="minorHAnsi"/>
           <w:b/>
           <w:bCs/>
           <w:noProof/>
@@ -1923,7 +2212,7 @@
     <w:p>
       <w:pPr>
         <w:rPr>
-          <w:rFonts w:ascii="Calibri" w:hAnsi="Calibri" w:cs="Calibri"/>
+          <w:rFonts w:cstheme="minorHAnsi"/>
           <w:b/>
           <w:bCs/>
           <w:sz w:val="28"/>
@@ -1933,7 +2222,7 @@
       </w:pPr>
       <w:r>
         <w:rPr>
-          <w:rFonts w:ascii="Calibri" w:hAnsi="Calibri" w:cs="Calibri"/>
+          <w:rFonts w:cstheme="minorHAnsi"/>
           <w:b/>
           <w:bCs/>
           <w:noProof/>
@@ -1988,7 +2277,7 @@
     <w:p>
       <w:pPr>
         <w:rPr>
-          <w:rFonts w:ascii="Calibri" w:hAnsi="Calibri" w:cs="Calibri"/>
+          <w:rFonts w:cstheme="minorHAnsi"/>
           <w:b/>
           <w:bCs/>
           <w:sz w:val="28"/>
@@ -1998,7 +2287,7 @@
       </w:pPr>
       <w:r>
         <w:rPr>
-          <w:rFonts w:ascii="Calibri" w:hAnsi="Calibri" w:cs="Calibri"/>
+          <w:rFonts w:cstheme="minorHAnsi"/>
           <w:b/>
           <w:bCs/>
           <w:noProof/>
@@ -2053,7 +2342,7 @@
     <w:p>
       <w:pPr>
         <w:rPr>
-          <w:rFonts w:ascii="Calibri" w:hAnsi="Calibri" w:cs="Calibri"/>
+          <w:rFonts w:cstheme="minorHAnsi"/>
           <w:b/>
           <w:bCs/>
           <w:sz w:val="28"/>
@@ -2065,7 +2354,7 @@
     <w:p>
       <w:pPr>
         <w:rPr>
-          <w:rFonts w:ascii="Calibri" w:hAnsi="Calibri" w:cs="Calibri"/>
+          <w:rFonts w:cstheme="minorHAnsi"/>
           <w:b/>
           <w:bCs/>
           <w:sz w:val="28"/>
@@ -2077,7 +2366,7 @@
     <w:p>
       <w:pPr>
         <w:rPr>
-          <w:rFonts w:ascii="Calibri" w:hAnsi="Calibri" w:cs="Calibri"/>
+          <w:rFonts w:cstheme="minorHAnsi"/>
           <w:b/>
           <w:bCs/>
           <w:sz w:val="28"/>
@@ -2089,7 +2378,7 @@
     <w:p>
       <w:pPr>
         <w:rPr>
-          <w:rFonts w:ascii="Calibri" w:hAnsi="Calibri" w:cs="Calibri"/>
+          <w:rFonts w:cstheme="minorHAnsi"/>
           <w:b/>
           <w:bCs/>
           <w:sz w:val="28"/>
@@ -2101,7 +2390,7 @@
     <w:p>
       <w:pPr>
         <w:rPr>
-          <w:rFonts w:ascii="Calibri" w:hAnsi="Calibri" w:cs="Calibri"/>
+          <w:rFonts w:cstheme="minorHAnsi"/>
           <w:b/>
           <w:bCs/>
           <w:sz w:val="28"/>
@@ -2113,7 +2402,7 @@
     <w:p>
       <w:pPr>
         <w:rPr>
-          <w:rFonts w:ascii="Calibri" w:hAnsi="Calibri" w:cs="Calibri"/>
+          <w:rFonts w:cstheme="minorHAnsi"/>
           <w:b/>
           <w:bCs/>
           <w:sz w:val="28"/>
@@ -2125,7 +2414,7 @@
     <w:p>
       <w:pPr>
         <w:rPr>
-          <w:rFonts w:ascii="Calibri" w:hAnsi="Calibri" w:cs="Calibri"/>
+          <w:rFonts w:cstheme="minorHAnsi"/>
           <w:b/>
           <w:bCs/>
           <w:sz w:val="36"/>
@@ -2135,7 +2424,7 @@
       </w:pPr>
       <w:r>
         <w:rPr>
-          <w:rFonts w:ascii="Calibri" w:hAnsi="Calibri" w:cs="Calibri"/>
+          <w:rFonts w:cstheme="minorHAnsi"/>
           <w:b/>
           <w:bCs/>
           <w:sz w:val="36"/>
@@ -2154,7 +2443,7 @@
           <w:numId w:val="16"/>
         </w:numPr>
         <w:rPr>
-          <w:rFonts w:ascii="Calibri" w:hAnsi="Calibri" w:cs="Calibri"/>
+          <w:rFonts w:cstheme="minorHAnsi"/>
           <w:b/>
           <w:bCs/>
           <w:sz w:val="32"/>
@@ -2164,7 +2453,7 @@
       </w:pPr>
       <w:r>
         <w:rPr>
-          <w:rFonts w:ascii="Calibri" w:hAnsi="Calibri" w:cs="Calibri"/>
+          <w:rFonts w:cstheme="minorHAnsi"/>
           <w:b/>
           <w:bCs/>
           <w:sz w:val="32"/>
@@ -2208,12 +2497,14 @@
             <w:pPr>
               <w:jc w:val="center"/>
               <w:rPr>
+                <w:rFonts w:cstheme="minorHAnsi"/>
                 <w:b/>
                 <w:bCs/>
               </w:rPr>
             </w:pPr>
             <w:r>
               <w:rPr>
+                <w:rFonts w:cstheme="minorHAnsi"/>
                 <w:b/>
                 <w:bCs/>
               </w:rPr>
@@ -2231,12 +2522,14 @@
             <w:pPr>
               <w:jc w:val="center"/>
               <w:rPr>
+                <w:rFonts w:cstheme="minorHAnsi"/>
                 <w:b/>
                 <w:bCs/>
               </w:rPr>
             </w:pPr>
             <w:r>
               <w:rPr>
+                <w:rFonts w:cstheme="minorHAnsi"/>
                 <w:b/>
                 <w:bCs/>
               </w:rPr>
@@ -2254,12 +2547,14 @@
             <w:pPr>
               <w:jc w:val="center"/>
               <w:rPr>
+                <w:rFonts w:cstheme="minorHAnsi"/>
                 <w:b/>
                 <w:bCs/>
               </w:rPr>
             </w:pPr>
             <w:r>
               <w:rPr>
+                <w:rFonts w:cstheme="minorHAnsi"/>
                 <w:b/>
                 <w:bCs/>
               </w:rPr>
@@ -2277,12 +2572,14 @@
             <w:pPr>
               <w:jc w:val="center"/>
               <w:rPr>
+                <w:rFonts w:cstheme="minorHAnsi"/>
                 <w:b/>
                 <w:bCs/>
               </w:rPr>
             </w:pPr>
             <w:r>
               <w:rPr>
+                <w:rFonts w:cstheme="minorHAnsi"/>
                 <w:b/>
                 <w:bCs/>
               </w:rPr>
@@ -2303,14 +2600,18 @@
             <w:hideMark/>
           </w:tcPr>
           <w:p>
-            <w:proofErr w:type="spellStart"/>
+            <w:pPr>
+              <w:rPr>
+                <w:rFonts w:cstheme="minorHAnsi"/>
+              </w:rPr>
+            </w:pPr>
             <w:r>
               <w:rPr>
                 <w:rStyle w:val="Strong"/>
+                <w:rFonts w:cstheme="minorHAnsi"/>
               </w:rPr>
               <w:t>Swachhata-MoHUA</w:t>
             </w:r>
-            <w:proofErr w:type="spellEnd"/>
           </w:p>
         </w:tc>
         <w:tc>
@@ -2320,7 +2621,15 @@
             <w:hideMark/>
           </w:tcPr>
           <w:p>
+            <w:pPr>
+              <w:rPr>
+                <w:rFonts w:cstheme="minorHAnsi"/>
+              </w:rPr>
+            </w:pPr>
             <w:r>
+              <w:rPr>
+                <w:rFonts w:cstheme="minorHAnsi"/>
+              </w:rPr>
               <w:t>Civic cleanliness and sanitation reporting</w:t>
             </w:r>
           </w:p>
@@ -2332,7 +2641,15 @@
             <w:hideMark/>
           </w:tcPr>
           <w:p>
+            <w:pPr>
+              <w:rPr>
+                <w:rFonts w:cstheme="minorHAnsi"/>
+              </w:rPr>
+            </w:pPr>
             <w:r>
+              <w:rPr>
+                <w:rFonts w:cstheme="minorHAnsi"/>
+              </w:rPr>
               <w:t>Photo, location, categories, authority assignment, status updates, reopening complaints</w:t>
             </w:r>
           </w:p>
@@ -2344,18 +2661,30 @@
             <w:hideMark/>
           </w:tcPr>
           <w:p>
+            <w:pPr>
+              <w:rPr>
+                <w:rFonts w:cstheme="minorHAnsi"/>
+              </w:rPr>
+            </w:pPr>
             <w:r>
+              <w:rPr>
+                <w:rFonts w:cstheme="minorHAnsi"/>
+              </w:rPr>
               <w:t>Mainly designed for city-level civic complaints rather than campus-specific issues. (</w:t>
             </w:r>
             <w:hyperlink r:id="rId10" w:tooltip="Swachhata-MoHUA - Apps on Google Play" w:history="1">
               <w:r>
                 <w:rPr>
                   <w:rStyle w:val="Hyperlink"/>
+                  <w:rFonts w:cstheme="minorHAnsi"/>
                 </w:rPr>
                 <w:t>Google Play</w:t>
               </w:r>
             </w:hyperlink>
             <w:r>
+              <w:rPr>
+                <w:rFonts w:cstheme="minorHAnsi"/>
+              </w:rPr>
               <w:t>)</w:t>
             </w:r>
           </w:p>
@@ -2373,9 +2702,15 @@
             <w:hideMark/>
           </w:tcPr>
           <w:p>
+            <w:pPr>
+              <w:rPr>
+                <w:rFonts w:cstheme="minorHAnsi"/>
+              </w:rPr>
+            </w:pPr>
             <w:r>
               <w:rPr>
                 <w:rStyle w:val="Strong"/>
+                <w:rFonts w:cstheme="minorHAnsi"/>
               </w:rPr>
               <w:t>Snap Send Solve</w:t>
             </w:r>
@@ -2388,7 +2723,15 @@
             <w:hideMark/>
           </w:tcPr>
           <w:p>
+            <w:pPr>
+              <w:rPr>
+                <w:rFonts w:cstheme="minorHAnsi"/>
+              </w:rPr>
+            </w:pPr>
             <w:r>
+              <w:rPr>
+                <w:rFonts w:cstheme="minorHAnsi"/>
+              </w:rPr>
               <w:t>Reporting local community problems</w:t>
             </w:r>
           </w:p>
@@ -2400,7 +2743,15 @@
             <w:hideMark/>
           </w:tcPr>
           <w:p>
+            <w:pPr>
+              <w:rPr>
+                <w:rFonts w:cstheme="minorHAnsi"/>
+              </w:rPr>
+            </w:pPr>
             <w:r>
+              <w:rPr>
+                <w:rFonts w:cstheme="minorHAnsi"/>
+              </w:rPr>
               <w:t>Photo upload, automatic/manual location, issue category, authority routing, status updates</w:t>
             </w:r>
           </w:p>
@@ -2412,18 +2763,30 @@
             <w:hideMark/>
           </w:tcPr>
           <w:p>
+            <w:pPr>
+              <w:rPr>
+                <w:rFonts w:cstheme="minorHAnsi"/>
+              </w:rPr>
+            </w:pPr>
             <w:r>
+              <w:rPr>
+                <w:rFonts w:cstheme="minorHAnsi"/>
+              </w:rPr>
               <w:t>Broad community focus; not specifically designed around student/campus reporting. (</w:t>
             </w:r>
             <w:hyperlink r:id="rId11" w:tooltip="How do I send a report? | Snap Send Solve Help Centre" w:history="1">
               <w:r>
                 <w:rPr>
                   <w:rStyle w:val="Hyperlink"/>
+                  <w:rFonts w:cstheme="minorHAnsi"/>
                 </w:rPr>
                 <w:t>Snap Send Solve Help Centre</w:t>
               </w:r>
             </w:hyperlink>
             <w:r>
+              <w:rPr>
+                <w:rFonts w:cstheme="minorHAnsi"/>
+              </w:rPr>
               <w:t>)</w:t>
             </w:r>
           </w:p>
@@ -2441,10 +2804,16 @@
             <w:hideMark/>
           </w:tcPr>
           <w:p>
+            <w:pPr>
+              <w:rPr>
+                <w:rFonts w:cstheme="minorHAnsi"/>
+              </w:rPr>
+            </w:pPr>
             <w:proofErr w:type="spellStart"/>
             <w:r>
               <w:rPr>
                 <w:rStyle w:val="Strong"/>
+                <w:rFonts w:cstheme="minorHAnsi"/>
               </w:rPr>
               <w:t>SeeClickFix</w:t>
             </w:r>
@@ -2458,7 +2827,15 @@
             <w:hideMark/>
           </w:tcPr>
           <w:p>
+            <w:pPr>
+              <w:rPr>
+                <w:rFonts w:cstheme="minorHAnsi"/>
+              </w:rPr>
+            </w:pPr>
             <w:r>
+              <w:rPr>
+                <w:rFonts w:cstheme="minorHAnsi"/>
+              </w:rPr>
               <w:t>Civic issue reporting and tracking</w:t>
             </w:r>
           </w:p>
@@ -2470,7 +2847,15 @@
             <w:hideMark/>
           </w:tcPr>
           <w:p>
+            <w:pPr>
+              <w:rPr>
+                <w:rFonts w:cstheme="minorHAnsi"/>
+              </w:rPr>
+            </w:pPr>
             <w:r>
+              <w:rPr>
+                <w:rFonts w:cstheme="minorHAnsi"/>
+              </w:rPr>
               <w:t>Location-based reports, issue descriptions, media and tracking</w:t>
             </w:r>
           </w:p>
@@ -2482,7 +2867,15 @@
             <w:hideMark/>
           </w:tcPr>
           <w:p>
+            <w:pPr>
+              <w:rPr>
+                <w:rFonts w:cstheme="minorHAnsi"/>
+              </w:rPr>
+            </w:pPr>
             <w:r>
+              <w:rPr>
+                <w:rFonts w:cstheme="minorHAnsi"/>
+              </w:rPr>
               <w:t>Focuses on general municipal/community issues rather than a focused campus environment.</w:t>
             </w:r>
           </w:p>
@@ -2500,9 +2893,15 @@
             <w:hideMark/>
           </w:tcPr>
           <w:p>
+            <w:pPr>
+              <w:rPr>
+                <w:rFonts w:cstheme="minorHAnsi"/>
+              </w:rPr>
+            </w:pPr>
             <w:r>
               <w:rPr>
                 <w:rStyle w:val="Strong"/>
+                <w:rFonts w:cstheme="minorHAnsi"/>
               </w:rPr>
               <w:t>SARRP India</w:t>
             </w:r>
@@ -2515,7 +2914,15 @@
             <w:hideMark/>
           </w:tcPr>
           <w:p>
+            <w:pPr>
+              <w:rPr>
+                <w:rFonts w:cstheme="minorHAnsi"/>
+              </w:rPr>
+            </w:pPr>
             <w:r>
+              <w:rPr>
+                <w:rFonts w:cstheme="minorHAnsi"/>
+              </w:rPr>
               <w:t>Animal rescue reporting</w:t>
             </w:r>
           </w:p>
@@ -2527,7 +2934,15 @@
             <w:hideMark/>
           </w:tcPr>
           <w:p>
+            <w:pPr>
+              <w:rPr>
+                <w:rFonts w:cstheme="minorHAnsi"/>
+              </w:rPr>
+            </w:pPr>
             <w:r>
+              <w:rPr>
+                <w:rFonts w:cstheme="minorHAnsi"/>
+              </w:rPr>
               <w:t>Injured/animal distress reports, photos, precise location and quick response</w:t>
             </w:r>
           </w:p>
@@ -2539,18 +2954,30 @@
             <w:hideMark/>
           </w:tcPr>
           <w:p>
+            <w:pPr>
+              <w:rPr>
+                <w:rFonts w:cstheme="minorHAnsi"/>
+              </w:rPr>
+            </w:pPr>
             <w:r>
+              <w:rPr>
+                <w:rFonts w:cstheme="minorHAnsi"/>
+              </w:rPr>
               <w:t>Focuses specifically on animal rescue and does not cover other environmental issues. (</w:t>
             </w:r>
             <w:hyperlink r:id="rId12" w:tooltip="SARRP INDIA - Apps on Google Play" w:history="1">
               <w:r>
                 <w:rPr>
                   <w:rStyle w:val="Hyperlink"/>
+                  <w:rFonts w:cstheme="minorHAnsi"/>
                 </w:rPr>
                 <w:t>Google Play</w:t>
               </w:r>
             </w:hyperlink>
             <w:r>
+              <w:rPr>
+                <w:rFonts w:cstheme="minorHAnsi"/>
+              </w:rPr>
               <w:t>)</w:t>
             </w:r>
           </w:p>
@@ -2560,9 +2987,194 @@
     <w:p>
       <w:pPr>
         <w:pStyle w:val="ListParagraph"/>
+        <w:numPr>
+          <w:ilvl w:val="0"/>
+          <w:numId w:val="17"/>
+        </w:numPr>
+        <w:spacing w:before="100" w:beforeAutospacing="1" w:after="0" w:line="240" w:lineRule="auto"/>
+        <w:rPr>
+          <w:rFonts w:eastAsia="Times New Roman" w:cstheme="minorHAnsi"/>
+          <w:kern w:val="0"/>
+          <w:sz w:val="24"/>
+          <w:szCs w:val="24"/>
+          <w:lang w:eastAsia="en-ID"/>
+          <w14:ligatures w14:val="none"/>
+        </w:rPr>
+      </w:pPr>
+      <w:r>
+        <w:rPr>
+          <w:rFonts w:eastAsia="Times New Roman" w:cstheme="minorHAnsi"/>
+          <w:b/>
+          <w:bCs/>
+          <w:kern w:val="0"/>
+          <w:sz w:val="27"/>
+          <w:szCs w:val="27"/>
+          <w:lang w:eastAsia="en-ID"/>
+          <w14:ligatures w14:val="none"/>
+        </w:rPr>
+        <w:t>Key Findings from Competitive Analysis</w:t>
+      </w:r>
+    </w:p>
+    <w:p>
+      <w:pPr>
+        <w:spacing w:after="0" w:line="240" w:lineRule="auto"/>
         <w:ind w:left="360"/>
         <w:rPr>
-          <w:rFonts w:ascii="Calibri" w:hAnsi="Calibri" w:cs="Calibri"/>
+          <w:rFonts w:eastAsia="Times New Roman" w:cstheme="minorHAnsi"/>
+          <w:kern w:val="0"/>
+          <w:sz w:val="24"/>
+          <w:szCs w:val="24"/>
+          <w:lang w:eastAsia="en-ID"/>
+          <w14:ligatures w14:val="none"/>
+        </w:rPr>
+      </w:pPr>
+      <w:r>
+        <w:rPr>
+          <w:rFonts w:eastAsia="Times New Roman" w:cstheme="minorHAnsi"/>
+          <w:kern w:val="0"/>
+          <w:sz w:val="24"/>
+          <w:szCs w:val="24"/>
+          <w:lang w:eastAsia="en-ID"/>
+          <w14:ligatures w14:val="none"/>
+        </w:rPr>
+        <w:t>Existing platforms show that photo + exact location + issue category can make reporting easier and more useful for authorities. Platforms such as Swachhata-MoHUA and Snap Send Solve also show the importance of giving users feedback about what happens aft</w:t>
+      </w:r>
+      <w:r>
+        <w:rPr>
+          <w:rFonts w:eastAsia="Times New Roman" w:cstheme="minorHAnsi"/>
+          <w:kern w:val="0"/>
+          <w:sz w:val="24"/>
+          <w:szCs w:val="24"/>
+          <w:lang w:eastAsia="en-ID"/>
+          <w14:ligatures w14:val="none"/>
+        </w:rPr>
+        <w:t>e</w:t>
+      </w:r>
+      <w:r>
+        <w:rPr>
+          <w:rFonts w:eastAsia="Times New Roman" w:cstheme="minorHAnsi"/>
+          <w:kern w:val="0"/>
+          <w:sz w:val="24"/>
+          <w:szCs w:val="24"/>
+          <w:lang w:eastAsia="en-ID"/>
+          <w14:ligatures w14:val="none"/>
+        </w:rPr>
+        <w:t xml:space="preserve">r a complaint is submitted. </w:t>
+      </w:r>
+    </w:p>
+    <w:p>
+      <w:pPr>
+        <w:spacing w:after="100" w:afterAutospacing="1" w:line="240" w:lineRule="auto"/>
+        <w:ind w:left="360"/>
+        <w:rPr>
+          <w:rFonts w:eastAsia="Times New Roman" w:cstheme="minorHAnsi"/>
+          <w:kern w:val="0"/>
+          <w:sz w:val="24"/>
+          <w:szCs w:val="24"/>
+          <w:lang w:eastAsia="en-ID"/>
+          <w14:ligatures w14:val="none"/>
+        </w:rPr>
+      </w:pPr>
+      <w:r>
+        <w:rPr>
+          <w:rFonts w:eastAsia="Times New Roman" w:cstheme="minorHAnsi"/>
+          <w:kern w:val="0"/>
+          <w:sz w:val="24"/>
+          <w:szCs w:val="24"/>
+          <w:lang w:eastAsia="en-ID"/>
+          <w14:ligatures w14:val="none"/>
+        </w:rPr>
+        <w:t>However, there is a gap between these systems and our target users. Most are designed for general citizens, cities, or specific organisations, rather than college students reporting problems within their campus.</w:t>
+      </w:r>
+    </w:p>
+    <w:p>
+      <w:pPr>
+        <w:pStyle w:val="ListParagraph"/>
+        <w:numPr>
+          <w:ilvl w:val="0"/>
+          <w:numId w:val="17"/>
+        </w:numPr>
+        <w:spacing w:after="0" w:line="240" w:lineRule="auto"/>
+        <w:rPr>
+          <w:rFonts w:eastAsia="Times New Roman" w:cstheme="minorHAnsi"/>
+          <w:kern w:val="0"/>
+          <w:sz w:val="24"/>
+          <w:szCs w:val="24"/>
+          <w:lang w:eastAsia="en-ID"/>
+          <w14:ligatures w14:val="none"/>
+        </w:rPr>
+      </w:pPr>
+      <w:r>
+        <w:rPr>
+          <w:rFonts w:eastAsia="Times New Roman" w:cstheme="minorHAnsi"/>
+          <w:b/>
+          <w:bCs/>
+          <w:kern w:val="0"/>
+          <w:sz w:val="27"/>
+          <w:szCs w:val="27"/>
+          <w:lang w:eastAsia="en-ID"/>
+          <w14:ligatures w14:val="none"/>
+        </w:rPr>
+        <w:t>Design Opportunity</w:t>
+      </w:r>
+    </w:p>
+    <w:p>
+      <w:pPr>
+        <w:spacing w:after="100" w:afterAutospacing="1" w:line="240" w:lineRule="auto"/>
+        <w:ind w:left="360"/>
+        <w:rPr>
+          <w:rFonts w:eastAsia="Times New Roman" w:cstheme="minorHAnsi"/>
+          <w:kern w:val="0"/>
+          <w:sz w:val="24"/>
+          <w:szCs w:val="24"/>
+          <w:lang w:eastAsia="en-ID"/>
+          <w14:ligatures w14:val="none"/>
+        </w:rPr>
+      </w:pPr>
+      <w:r>
+        <w:rPr>
+          <w:rFonts w:eastAsia="Times New Roman" w:cstheme="minorHAnsi"/>
+          <w:kern w:val="0"/>
+          <w:sz w:val="24"/>
+          <w:szCs w:val="24"/>
+          <w:lang w:eastAsia="en-ID"/>
+          <w14:ligatures w14:val="none"/>
+        </w:rPr>
+        <w:t xml:space="preserve">Our proposed system can combine the useful features of these platforms into a simple campus-focused environmental reporting system. Students could report issues such as garbage, pollution, water problems, greenery issues and injured/harmed animals, while providing a photo, location and short description. </w:t>
+      </w:r>
+      <w:r>
+        <w:rPr>
+          <w:rFonts w:eastAsia="Times New Roman" w:cstheme="minorHAnsi"/>
+          <w:kern w:val="0"/>
+          <w:sz w:val="24"/>
+          <w:szCs w:val="24"/>
+          <w:lang w:eastAsia="en-ID"/>
+          <w14:ligatures w14:val="none"/>
+        </w:rPr>
+        <w:lastRenderedPageBreak/>
+        <w:t>The system can also show the report status so students know whether action has been taken.</w:t>
+      </w:r>
+    </w:p>
+    <w:p>
+      <w:pPr>
+        <w:pStyle w:val="ListParagraph"/>
+        <w:ind w:left="0"/>
+        <w:rPr>
+          <w:rFonts w:cstheme="minorHAnsi"/>
+          <w:b/>
+          <w:bCs/>
+          <w:sz w:val="24"/>
+          <w:szCs w:val="24"/>
+          <w:u w:val="single"/>
+        </w:rPr>
+      </w:pPr>
+    </w:p>
+    <w:p>
+      <w:pPr>
+        <w:pStyle w:val="ListParagraph"/>
+        <w:ind w:left="360"/>
+        <w:rPr>
+          <w:rFonts w:cstheme="minorHAnsi"/>
           <w:b/>
           <w:bCs/>
           <w:sz w:val="32"/>
@@ -2570,6 +3182,1502 @@
           <w:u w:val="single"/>
         </w:rPr>
       </w:pPr>
+    </w:p>
+    <w:p>
+      <w:pPr>
+        <w:pStyle w:val="ListParagraph"/>
+        <w:numPr>
+          <w:ilvl w:val="0"/>
+          <w:numId w:val="16"/>
+        </w:numPr>
+        <w:rPr>
+          <w:rFonts w:cstheme="minorHAnsi"/>
+          <w:b/>
+          <w:bCs/>
+          <w:sz w:val="32"/>
+          <w:szCs w:val="32"/>
+          <w:u w:val="single"/>
+        </w:rPr>
+      </w:pPr>
+      <w:r>
+        <w:rPr>
+          <w:rFonts w:cstheme="minorHAnsi"/>
+          <w:b/>
+          <w:bCs/>
+          <w:sz w:val="32"/>
+          <w:szCs w:val="32"/>
+          <w:u w:val="single"/>
+        </w:rPr>
+        <w:t xml:space="preserve">Literature Review: </w:t>
+      </w:r>
+    </w:p>
+    <w:p>
+      <w:pPr>
+        <w:pStyle w:val="pdq2pgselectionanchorcontainer"/>
+        <w:numPr>
+          <w:ilvl w:val="0"/>
+          <w:numId w:val="17"/>
+        </w:numPr>
+        <w:spacing w:after="0" w:afterAutospacing="0"/>
+        <w:rPr>
+          <w:rFonts w:asciiTheme="minorHAnsi" w:hAnsiTheme="minorHAnsi" w:cstheme="minorHAnsi"/>
+        </w:rPr>
+      </w:pPr>
+      <w:r>
+        <w:rPr>
+          <w:rStyle w:val="Strong"/>
+          <w:rFonts w:asciiTheme="minorHAnsi" w:hAnsiTheme="minorHAnsi" w:cstheme="minorHAnsi"/>
+        </w:rPr>
+        <w:t>Crowdsourcing and Citizen Participation (2023)</w:t>
+      </w:r>
+      <w:r>
+        <w:rPr>
+          <w:rFonts w:asciiTheme="minorHAnsi" w:hAnsiTheme="minorHAnsi" w:cstheme="minorHAnsi"/>
+        </w:rPr>
+        <w:t xml:space="preserve">: </w:t>
+      </w:r>
+      <w:r>
+        <w:rPr>
+          <w:rFonts w:asciiTheme="minorHAnsi" w:hAnsiTheme="minorHAnsi" w:cstheme="minorHAnsi"/>
+        </w:rPr>
+        <w:t xml:space="preserve">Bastardo, </w:t>
+      </w:r>
+      <w:proofErr w:type="spellStart"/>
+      <w:r>
+        <w:rPr>
+          <w:rFonts w:asciiTheme="minorHAnsi" w:hAnsiTheme="minorHAnsi" w:cstheme="minorHAnsi"/>
+        </w:rPr>
+        <w:t>Pavão</w:t>
+      </w:r>
+      <w:proofErr w:type="spellEnd"/>
+      <w:r>
+        <w:rPr>
+          <w:rFonts w:asciiTheme="minorHAnsi" w:hAnsiTheme="minorHAnsi" w:cstheme="minorHAnsi"/>
+        </w:rPr>
+        <w:t xml:space="preserve"> and Rocha reviewed 29 studies on crowdsourcing technologies in smart cities. Their review found that participatory reporting and sensing are being used for areas such as infrastructure maintenance and environmental monitoring. The study also identified limited evidence about the effectiveness of many existing solutions. </w:t>
+      </w:r>
+    </w:p>
+    <w:p>
+      <w:pPr>
+        <w:pStyle w:val="pdq2pgselectionanchorcontainer"/>
+        <w:spacing w:before="0" w:beforeAutospacing="0"/>
+        <w:ind w:left="360"/>
+        <w:rPr>
+          <w:rFonts w:asciiTheme="minorHAnsi" w:hAnsiTheme="minorHAnsi" w:cstheme="minorHAnsi"/>
+        </w:rPr>
+      </w:pPr>
+      <w:r>
+        <w:rPr>
+          <w:rStyle w:val="Strong"/>
+          <w:rFonts w:asciiTheme="minorHAnsi" w:hAnsiTheme="minorHAnsi" w:cstheme="minorHAnsi"/>
+        </w:rPr>
+        <w:t>Relevance:</w:t>
+      </w:r>
+      <w:r>
+        <w:rPr>
+          <w:rFonts w:asciiTheme="minorHAnsi" w:hAnsiTheme="minorHAnsi" w:cstheme="minorHAnsi"/>
+        </w:rPr>
+        <w:t xml:space="preserve"> This supports the idea of involving students in reporting environmental problems around their campus.</w:t>
+      </w:r>
+    </w:p>
+    <w:p>
+      <w:pPr>
+        <w:pStyle w:val="NormalWeb"/>
+        <w:numPr>
+          <w:ilvl w:val="0"/>
+          <w:numId w:val="17"/>
+        </w:numPr>
+        <w:spacing w:before="0" w:beforeAutospacing="0" w:after="0" w:afterAutospacing="0"/>
+        <w:rPr>
+          <w:rFonts w:asciiTheme="minorHAnsi" w:hAnsiTheme="minorHAnsi" w:cstheme="minorHAnsi"/>
+        </w:rPr>
+      </w:pPr>
+      <w:r>
+        <w:rPr>
+          <w:rStyle w:val="Strong"/>
+          <w:rFonts w:asciiTheme="minorHAnsi" w:hAnsiTheme="minorHAnsi" w:cstheme="minorHAnsi"/>
+        </w:rPr>
+        <w:t>Mobile Civic Reporting (2013)</w:t>
+      </w:r>
+      <w:r>
+        <w:rPr>
+          <w:rFonts w:asciiTheme="minorHAnsi" w:hAnsiTheme="minorHAnsi" w:cstheme="minorHAnsi"/>
+        </w:rPr>
+        <w:t xml:space="preserve">: </w:t>
+      </w:r>
+      <w:r>
+        <w:rPr>
+          <w:rFonts w:asciiTheme="minorHAnsi" w:hAnsiTheme="minorHAnsi" w:cstheme="minorHAnsi"/>
+        </w:rPr>
+        <w:t xml:space="preserve">Santos, Rodrigues and Oliveira proposed a web and mobile system for reporting non-emergency urban problems. The system uses a location-based environment and allows users to attach multimedia information to reports. </w:t>
+      </w:r>
+    </w:p>
+    <w:p>
+      <w:pPr>
+        <w:pStyle w:val="NormalWeb"/>
+        <w:spacing w:before="0" w:beforeAutospacing="0"/>
+        <w:ind w:left="360"/>
+        <w:rPr>
+          <w:rFonts w:asciiTheme="minorHAnsi" w:hAnsiTheme="minorHAnsi" w:cstheme="minorHAnsi"/>
+        </w:rPr>
+      </w:pPr>
+      <w:r>
+        <w:rPr>
+          <w:rStyle w:val="Strong"/>
+          <w:rFonts w:asciiTheme="minorHAnsi" w:hAnsiTheme="minorHAnsi" w:cstheme="minorHAnsi"/>
+        </w:rPr>
+        <w:t>Relevance:</w:t>
+      </w:r>
+      <w:r>
+        <w:rPr>
+          <w:rFonts w:asciiTheme="minorHAnsi" w:hAnsiTheme="minorHAnsi" w:cstheme="minorHAnsi"/>
+        </w:rPr>
+        <w:t xml:space="preserve"> This supports using </w:t>
+      </w:r>
+      <w:r>
+        <w:rPr>
+          <w:rStyle w:val="Strong"/>
+          <w:rFonts w:asciiTheme="minorHAnsi" w:hAnsiTheme="minorHAnsi" w:cstheme="minorHAnsi"/>
+        </w:rPr>
+        <w:t>location and photos</w:t>
+      </w:r>
+      <w:r>
+        <w:rPr>
+          <w:rFonts w:asciiTheme="minorHAnsi" w:hAnsiTheme="minorHAnsi" w:cstheme="minorHAnsi"/>
+        </w:rPr>
+        <w:t xml:space="preserve"> as important information when reporting environmental issues.</w:t>
+      </w:r>
+    </w:p>
+    <w:p>
+      <w:pPr>
+        <w:pStyle w:val="NormalWeb"/>
+        <w:numPr>
+          <w:ilvl w:val="0"/>
+          <w:numId w:val="17"/>
+        </w:numPr>
+        <w:spacing w:before="0" w:beforeAutospacing="0" w:after="0" w:afterAutospacing="0"/>
+        <w:rPr>
+          <w:rFonts w:asciiTheme="minorHAnsi" w:hAnsiTheme="minorHAnsi" w:cstheme="minorHAnsi"/>
+        </w:rPr>
+      </w:pPr>
+      <w:r>
+        <w:rPr>
+          <w:rStyle w:val="Strong"/>
+          <w:rFonts w:asciiTheme="minorHAnsi" w:hAnsiTheme="minorHAnsi" w:cstheme="minorHAnsi"/>
+        </w:rPr>
+        <w:t>Campus Safety Reporting (2017)</w:t>
+      </w:r>
+      <w:r>
+        <w:rPr>
+          <w:rFonts w:asciiTheme="minorHAnsi" w:hAnsiTheme="minorHAnsi" w:cstheme="minorHAnsi"/>
+        </w:rPr>
+        <w:t xml:space="preserve">: </w:t>
+      </w:r>
+      <w:r>
+        <w:rPr>
+          <w:rFonts w:asciiTheme="minorHAnsi" w:hAnsiTheme="minorHAnsi" w:cstheme="minorHAnsi"/>
+        </w:rPr>
+        <w:t xml:space="preserve">Huang et al. studied mobile crowdsourcing for campus safety reporting. Their experiments showed that location context influenced people's reporting decisions, and they developed a location-based nudge mechanism to influence reporting behaviour. </w:t>
+      </w:r>
+    </w:p>
+    <w:p>
+      <w:pPr>
+        <w:pStyle w:val="NormalWeb"/>
+        <w:spacing w:before="0" w:beforeAutospacing="0" w:after="0" w:afterAutospacing="0"/>
+        <w:ind w:left="360"/>
+        <w:rPr>
+          <w:rFonts w:asciiTheme="minorHAnsi" w:hAnsiTheme="minorHAnsi" w:cstheme="minorHAnsi"/>
+        </w:rPr>
+      </w:pPr>
+      <w:r>
+        <w:rPr>
+          <w:rStyle w:val="Strong"/>
+          <w:rFonts w:asciiTheme="minorHAnsi" w:hAnsiTheme="minorHAnsi" w:cstheme="minorHAnsi"/>
+        </w:rPr>
+        <w:t>Relevance:</w:t>
+      </w:r>
+      <w:r>
+        <w:rPr>
+          <w:rFonts w:asciiTheme="minorHAnsi" w:hAnsiTheme="minorHAnsi" w:cstheme="minorHAnsi"/>
+        </w:rPr>
+        <w:t xml:space="preserve"> Since our target users are college students, this research supports making reporting </w:t>
+      </w:r>
+      <w:r>
+        <w:rPr>
+          <w:rStyle w:val="Strong"/>
+          <w:rFonts w:asciiTheme="minorHAnsi" w:hAnsiTheme="minorHAnsi" w:cstheme="minorHAnsi"/>
+        </w:rPr>
+        <w:t>location-aware and relevant to the campus environment</w:t>
+      </w:r>
+      <w:r>
+        <w:rPr>
+          <w:rFonts w:asciiTheme="minorHAnsi" w:hAnsiTheme="minorHAnsi" w:cstheme="minorHAnsi"/>
+        </w:rPr>
+        <w:t>.</w:t>
+      </w:r>
+    </w:p>
+    <w:p>
+      <w:pPr>
+        <w:pStyle w:val="NormalWeb"/>
+        <w:numPr>
+          <w:ilvl w:val="0"/>
+          <w:numId w:val="17"/>
+        </w:numPr>
+        <w:spacing w:before="240" w:beforeAutospacing="0" w:after="0" w:afterAutospacing="0"/>
+        <w:rPr>
+          <w:rFonts w:asciiTheme="minorHAnsi" w:hAnsiTheme="minorHAnsi" w:cstheme="minorHAnsi"/>
+        </w:rPr>
+      </w:pPr>
+      <w:r>
+        <w:rPr>
+          <w:rStyle w:val="Strong"/>
+          <w:rFonts w:asciiTheme="minorHAnsi" w:hAnsiTheme="minorHAnsi" w:cstheme="minorHAnsi"/>
+        </w:rPr>
+        <w:t>Pro-social Behaviour in Crowdsourcing (2019)</w:t>
+      </w:r>
+      <w:r>
+        <w:rPr>
+          <w:rFonts w:asciiTheme="minorHAnsi" w:hAnsiTheme="minorHAnsi" w:cstheme="minorHAnsi"/>
+        </w:rPr>
+        <w:br/>
+        <w:t xml:space="preserve">Komninos studied a mobile crowdsourcing system used for monitoring beach conditions. The study found that participation was strongly influenced by altruistic motives and that openly sharing collected information could provide benefits to users and public bodies. </w:t>
+      </w:r>
+    </w:p>
+    <w:p>
+      <w:pPr>
+        <w:pStyle w:val="NormalWeb"/>
+        <w:spacing w:before="0" w:beforeAutospacing="0" w:after="0" w:afterAutospacing="0"/>
+        <w:ind w:left="360"/>
+        <w:rPr>
+          <w:rFonts w:asciiTheme="minorHAnsi" w:hAnsiTheme="minorHAnsi" w:cstheme="minorHAnsi"/>
+        </w:rPr>
+      </w:pPr>
+      <w:r>
+        <w:rPr>
+          <w:rStyle w:val="Strong"/>
+          <w:rFonts w:asciiTheme="minorHAnsi" w:hAnsiTheme="minorHAnsi" w:cstheme="minorHAnsi"/>
+        </w:rPr>
+        <w:t>Relevance:</w:t>
+      </w:r>
+      <w:r>
+        <w:rPr>
+          <w:rFonts w:asciiTheme="minorHAnsi" w:hAnsiTheme="minorHAnsi" w:cstheme="minorHAnsi"/>
+        </w:rPr>
+        <w:t xml:space="preserve"> This suggests that students may participate in environmental reporting when they can see that their contributions provide a benefit to the wider campus community.</w:t>
+      </w:r>
+    </w:p>
+    <w:p>
+      <w:pPr>
+        <w:pStyle w:val="ListParagraph"/>
+        <w:ind w:left="360"/>
+        <w:rPr>
+          <w:rFonts w:cstheme="minorHAnsi"/>
+          <w:b/>
+          <w:bCs/>
+          <w:sz w:val="32"/>
+          <w:szCs w:val="32"/>
+          <w:u w:val="single"/>
+        </w:rPr>
+      </w:pPr>
+    </w:p>
+    <w:p>
+      <w:pPr>
+        <w:pStyle w:val="ListParagraph"/>
+        <w:ind w:left="360"/>
+        <w:rPr>
+          <w:rFonts w:cstheme="minorHAnsi"/>
+          <w:b/>
+          <w:bCs/>
+          <w:sz w:val="32"/>
+          <w:szCs w:val="32"/>
+          <w:u w:val="single"/>
+        </w:rPr>
+      </w:pPr>
+    </w:p>
+    <w:p>
+      <w:pPr>
+        <w:pStyle w:val="ListParagraph"/>
+        <w:numPr>
+          <w:ilvl w:val="0"/>
+          <w:numId w:val="16"/>
+        </w:numPr>
+        <w:rPr>
+          <w:rFonts w:cstheme="minorHAnsi"/>
+          <w:b/>
+          <w:bCs/>
+          <w:sz w:val="32"/>
+          <w:szCs w:val="32"/>
+          <w:u w:val="single"/>
+        </w:rPr>
+      </w:pPr>
+      <w:r>
+        <w:rPr>
+          <w:rFonts w:cstheme="minorHAnsi"/>
+          <w:b/>
+          <w:bCs/>
+          <w:sz w:val="32"/>
+          <w:szCs w:val="32"/>
+          <w:u w:val="single"/>
+        </w:rPr>
+        <w:lastRenderedPageBreak/>
+        <w:t>Survey Images:</w:t>
+      </w:r>
+    </w:p>
+    <w:p>
+      <w:pPr>
+        <w:rPr>
+          <w:rFonts w:cstheme="minorHAnsi"/>
+          <w:b/>
+          <w:bCs/>
+          <w:sz w:val="32"/>
+          <w:szCs w:val="32"/>
+          <w:u w:val="single"/>
+        </w:rPr>
+      </w:pPr>
+      <w:r>
+        <w:rPr>
+          <w:rFonts w:cstheme="minorHAnsi"/>
+          <w:b/>
+          <w:bCs/>
+          <w:noProof/>
+          <w:sz w:val="32"/>
+          <w:szCs w:val="32"/>
+          <w:u w:val="single"/>
+        </w:rPr>
+        <w:drawing>
+          <wp:inline distT="0" distB="0" distL="0" distR="0" wp14:anchorId="1A40EAEA" wp14:editId="2DF7F1BD">
+            <wp:extent cx="4239260" cy="1784350"/>
+            <wp:effectExtent l="0" t="0" r="8890" b="6350"/>
+            <wp:docPr id="814937375" name="Picture 1"/>
+            <wp:cNvGraphicFramePr>
+              <a:graphicFrameLocks xmlns:a="http://schemas.openxmlformats.org/drawingml/2006/main" noChangeAspect="1"/>
+            </wp:cNvGraphicFramePr>
+            <a:graphic xmlns:a="http://schemas.openxmlformats.org/drawingml/2006/main">
+              <a:graphicData uri="http://schemas.openxmlformats.org/drawingml/2006/picture">
+                <pic:pic xmlns:pic="http://schemas.openxmlformats.org/drawingml/2006/picture">
+                  <pic:nvPicPr>
+                    <pic:cNvPr id="814937375" name="Picture 814937375"/>
+                    <pic:cNvPicPr/>
+                  </pic:nvPicPr>
+                  <pic:blipFill>
+                    <a:blip r:embed="rId13">
+                      <a:extLst>
+                        <a:ext uri="{28A0092B-C50C-407E-A947-70E740481C1C}">
+                          <a14:useLocalDpi xmlns:a14="http://schemas.microsoft.com/office/drawing/2010/main" val="0"/>
+                        </a:ext>
+                      </a:extLst>
+                    </a:blip>
+                    <a:stretch>
+                      <a:fillRect/>
+                    </a:stretch>
+                  </pic:blipFill>
+                  <pic:spPr>
+                    <a:xfrm>
+                      <a:off x="0" y="0"/>
+                      <a:ext cx="4239260" cy="1784350"/>
+                    </a:xfrm>
+                    <a:prstGeom prst="rect">
+                      <a:avLst/>
+                    </a:prstGeom>
+                  </pic:spPr>
+                </pic:pic>
+              </a:graphicData>
+            </a:graphic>
+          </wp:inline>
+        </w:drawing>
+      </w:r>
+    </w:p>
+    <w:p>
+      <w:pPr>
+        <w:rPr>
+          <w:rFonts w:cstheme="minorHAnsi"/>
+          <w:b/>
+          <w:bCs/>
+          <w:sz w:val="32"/>
+          <w:szCs w:val="32"/>
+          <w:u w:val="single"/>
+        </w:rPr>
+      </w:pPr>
+      <w:r>
+        <w:rPr>
+          <w:rFonts w:cstheme="minorHAnsi"/>
+          <w:b/>
+          <w:bCs/>
+          <w:noProof/>
+          <w:sz w:val="32"/>
+          <w:szCs w:val="32"/>
+          <w:u w:val="single"/>
+        </w:rPr>
+        <w:drawing>
+          <wp:inline distT="0" distB="0" distL="0" distR="0" wp14:anchorId="14746237" wp14:editId="04FD65CD">
+            <wp:extent cx="4239260" cy="1724660"/>
+            <wp:effectExtent l="0" t="0" r="8890" b="8890"/>
+            <wp:docPr id="1301370843" name="Picture 2"/>
+            <wp:cNvGraphicFramePr>
+              <a:graphicFrameLocks xmlns:a="http://schemas.openxmlformats.org/drawingml/2006/main" noChangeAspect="1"/>
+            </wp:cNvGraphicFramePr>
+            <a:graphic xmlns:a="http://schemas.openxmlformats.org/drawingml/2006/main">
+              <a:graphicData uri="http://schemas.openxmlformats.org/drawingml/2006/picture">
+                <pic:pic xmlns:pic="http://schemas.openxmlformats.org/drawingml/2006/picture">
+                  <pic:nvPicPr>
+                    <pic:cNvPr id="1301370843" name="Picture 1301370843"/>
+                    <pic:cNvPicPr/>
+                  </pic:nvPicPr>
+                  <pic:blipFill>
+                    <a:blip r:embed="rId14">
+                      <a:extLst>
+                        <a:ext uri="{28A0092B-C50C-407E-A947-70E740481C1C}">
+                          <a14:useLocalDpi xmlns:a14="http://schemas.microsoft.com/office/drawing/2010/main" val="0"/>
+                        </a:ext>
+                      </a:extLst>
+                    </a:blip>
+                    <a:stretch>
+                      <a:fillRect/>
+                    </a:stretch>
+                  </pic:blipFill>
+                  <pic:spPr>
+                    <a:xfrm>
+                      <a:off x="0" y="0"/>
+                      <a:ext cx="4239260" cy="1724660"/>
+                    </a:xfrm>
+                    <a:prstGeom prst="rect">
+                      <a:avLst/>
+                    </a:prstGeom>
+                  </pic:spPr>
+                </pic:pic>
+              </a:graphicData>
+            </a:graphic>
+          </wp:inline>
+        </w:drawing>
+      </w:r>
+    </w:p>
+    <w:p>
+      <w:pPr>
+        <w:rPr>
+          <w:rFonts w:cstheme="minorHAnsi"/>
+          <w:b/>
+          <w:bCs/>
+          <w:sz w:val="32"/>
+          <w:szCs w:val="32"/>
+          <w:u w:val="single"/>
+        </w:rPr>
+      </w:pPr>
+      <w:r>
+        <w:rPr>
+          <w:rFonts w:cstheme="minorHAnsi"/>
+          <w:b/>
+          <w:bCs/>
+          <w:noProof/>
+          <w:sz w:val="32"/>
+          <w:szCs w:val="32"/>
+          <w:u w:val="single"/>
+        </w:rPr>
+        <w:drawing>
+          <wp:inline distT="0" distB="0" distL="0" distR="0" wp14:anchorId="54B0F989" wp14:editId="478C0EDC">
+            <wp:extent cx="4239260" cy="1945005"/>
+            <wp:effectExtent l="0" t="0" r="8890" b="0"/>
+            <wp:docPr id="595012629" name="Picture 3"/>
+            <wp:cNvGraphicFramePr>
+              <a:graphicFrameLocks xmlns:a="http://schemas.openxmlformats.org/drawingml/2006/main" noChangeAspect="1"/>
+            </wp:cNvGraphicFramePr>
+            <a:graphic xmlns:a="http://schemas.openxmlformats.org/drawingml/2006/main">
+              <a:graphicData uri="http://schemas.openxmlformats.org/drawingml/2006/picture">
+                <pic:pic xmlns:pic="http://schemas.openxmlformats.org/drawingml/2006/picture">
+                  <pic:nvPicPr>
+                    <pic:cNvPr id="595012629" name="Picture 595012629"/>
+                    <pic:cNvPicPr/>
+                  </pic:nvPicPr>
+                  <pic:blipFill>
+                    <a:blip r:embed="rId15">
+                      <a:extLst>
+                        <a:ext uri="{28A0092B-C50C-407E-A947-70E740481C1C}">
+                          <a14:useLocalDpi xmlns:a14="http://schemas.microsoft.com/office/drawing/2010/main" val="0"/>
+                        </a:ext>
+                      </a:extLst>
+                    </a:blip>
+                    <a:stretch>
+                      <a:fillRect/>
+                    </a:stretch>
+                  </pic:blipFill>
+                  <pic:spPr>
+                    <a:xfrm>
+                      <a:off x="0" y="0"/>
+                      <a:ext cx="4239260" cy="1945005"/>
+                    </a:xfrm>
+                    <a:prstGeom prst="rect">
+                      <a:avLst/>
+                    </a:prstGeom>
+                  </pic:spPr>
+                </pic:pic>
+              </a:graphicData>
+            </a:graphic>
+          </wp:inline>
+        </w:drawing>
+      </w:r>
+    </w:p>
+    <w:p>
+      <w:pPr>
+        <w:rPr>
+          <w:rFonts w:cstheme="minorHAnsi"/>
+          <w:b/>
+          <w:bCs/>
+          <w:sz w:val="32"/>
+          <w:szCs w:val="32"/>
+          <w:u w:val="single"/>
+        </w:rPr>
+      </w:pPr>
+      <w:r>
+        <w:rPr>
+          <w:rFonts w:cstheme="minorHAnsi"/>
+          <w:b/>
+          <w:bCs/>
+          <w:noProof/>
+          <w:sz w:val="32"/>
+          <w:szCs w:val="32"/>
+          <w:u w:val="single"/>
+        </w:rPr>
+        <w:drawing>
+          <wp:inline distT="0" distB="0" distL="0" distR="0" wp14:anchorId="38F9DC4B" wp14:editId="4DFC6BAF">
+            <wp:extent cx="4239260" cy="1939925"/>
+            <wp:effectExtent l="0" t="0" r="8890" b="3175"/>
+            <wp:docPr id="594583457" name="Picture 4"/>
+            <wp:cNvGraphicFramePr>
+              <a:graphicFrameLocks xmlns:a="http://schemas.openxmlformats.org/drawingml/2006/main" noChangeAspect="1"/>
+            </wp:cNvGraphicFramePr>
+            <a:graphic xmlns:a="http://schemas.openxmlformats.org/drawingml/2006/main">
+              <a:graphicData uri="http://schemas.openxmlformats.org/drawingml/2006/picture">
+                <pic:pic xmlns:pic="http://schemas.openxmlformats.org/drawingml/2006/picture">
+                  <pic:nvPicPr>
+                    <pic:cNvPr id="594583457" name="Picture 594583457"/>
+                    <pic:cNvPicPr/>
+                  </pic:nvPicPr>
+                  <pic:blipFill>
+                    <a:blip r:embed="rId16">
+                      <a:extLst>
+                        <a:ext uri="{28A0092B-C50C-407E-A947-70E740481C1C}">
+                          <a14:useLocalDpi xmlns:a14="http://schemas.microsoft.com/office/drawing/2010/main" val="0"/>
+                        </a:ext>
+                      </a:extLst>
+                    </a:blip>
+                    <a:stretch>
+                      <a:fillRect/>
+                    </a:stretch>
+                  </pic:blipFill>
+                  <pic:spPr>
+                    <a:xfrm>
+                      <a:off x="0" y="0"/>
+                      <a:ext cx="4239260" cy="1939925"/>
+                    </a:xfrm>
+                    <a:prstGeom prst="rect">
+                      <a:avLst/>
+                    </a:prstGeom>
+                  </pic:spPr>
+                </pic:pic>
+              </a:graphicData>
+            </a:graphic>
+          </wp:inline>
+        </w:drawing>
+      </w:r>
+    </w:p>
+    <w:p>
+      <w:pPr>
+        <w:rPr>
+          <w:rFonts w:cstheme="minorHAnsi"/>
+          <w:b/>
+          <w:bCs/>
+          <w:sz w:val="32"/>
+          <w:szCs w:val="32"/>
+          <w:u w:val="single"/>
+        </w:rPr>
+      </w:pPr>
+      <w:r>
+        <w:rPr>
+          <w:rFonts w:cstheme="minorHAnsi"/>
+          <w:b/>
+          <w:bCs/>
+          <w:noProof/>
+          <w:sz w:val="32"/>
+          <w:szCs w:val="32"/>
+          <w:u w:val="single"/>
+        </w:rPr>
+        <w:lastRenderedPageBreak/>
+        <w:drawing>
+          <wp:inline distT="0" distB="0" distL="0" distR="0" wp14:anchorId="17A010C9" wp14:editId="2F4CE9D2">
+            <wp:extent cx="4239260" cy="1958340"/>
+            <wp:effectExtent l="0" t="0" r="8890" b="3810"/>
+            <wp:docPr id="1891801127" name="Picture 5"/>
+            <wp:cNvGraphicFramePr>
+              <a:graphicFrameLocks xmlns:a="http://schemas.openxmlformats.org/drawingml/2006/main" noChangeAspect="1"/>
+            </wp:cNvGraphicFramePr>
+            <a:graphic xmlns:a="http://schemas.openxmlformats.org/drawingml/2006/main">
+              <a:graphicData uri="http://schemas.openxmlformats.org/drawingml/2006/picture">
+                <pic:pic xmlns:pic="http://schemas.openxmlformats.org/drawingml/2006/picture">
+                  <pic:nvPicPr>
+                    <pic:cNvPr id="1891801127" name="Picture 1891801127"/>
+                    <pic:cNvPicPr/>
+                  </pic:nvPicPr>
+                  <pic:blipFill>
+                    <a:blip r:embed="rId17">
+                      <a:extLst>
+                        <a:ext uri="{28A0092B-C50C-407E-A947-70E740481C1C}">
+                          <a14:useLocalDpi xmlns:a14="http://schemas.microsoft.com/office/drawing/2010/main" val="0"/>
+                        </a:ext>
+                      </a:extLst>
+                    </a:blip>
+                    <a:stretch>
+                      <a:fillRect/>
+                    </a:stretch>
+                  </pic:blipFill>
+                  <pic:spPr>
+                    <a:xfrm>
+                      <a:off x="0" y="0"/>
+                      <a:ext cx="4239260" cy="1958340"/>
+                    </a:xfrm>
+                    <a:prstGeom prst="rect">
+                      <a:avLst/>
+                    </a:prstGeom>
+                  </pic:spPr>
+                </pic:pic>
+              </a:graphicData>
+            </a:graphic>
+          </wp:inline>
+        </w:drawing>
+      </w:r>
+    </w:p>
+    <w:p>
+      <w:pPr>
+        <w:rPr>
+          <w:rFonts w:cstheme="minorHAnsi"/>
+          <w:b/>
+          <w:bCs/>
+          <w:sz w:val="32"/>
+          <w:szCs w:val="32"/>
+          <w:u w:val="single"/>
+        </w:rPr>
+      </w:pPr>
+      <w:r>
+        <w:rPr>
+          <w:rFonts w:cstheme="minorHAnsi"/>
+          <w:b/>
+          <w:bCs/>
+          <w:noProof/>
+          <w:sz w:val="32"/>
+          <w:szCs w:val="32"/>
+          <w:u w:val="single"/>
+        </w:rPr>
+        <w:drawing>
+          <wp:inline distT="0" distB="0" distL="0" distR="0" wp14:anchorId="589898C0" wp14:editId="4EC5956C">
+            <wp:extent cx="4239260" cy="1718945"/>
+            <wp:effectExtent l="0" t="0" r="8890" b="0"/>
+            <wp:docPr id="489189662" name="Picture 6"/>
+            <wp:cNvGraphicFramePr>
+              <a:graphicFrameLocks xmlns:a="http://schemas.openxmlformats.org/drawingml/2006/main" noChangeAspect="1"/>
+            </wp:cNvGraphicFramePr>
+            <a:graphic xmlns:a="http://schemas.openxmlformats.org/drawingml/2006/main">
+              <a:graphicData uri="http://schemas.openxmlformats.org/drawingml/2006/picture">
+                <pic:pic xmlns:pic="http://schemas.openxmlformats.org/drawingml/2006/picture">
+                  <pic:nvPicPr>
+                    <pic:cNvPr id="489189662" name="Picture 489189662"/>
+                    <pic:cNvPicPr/>
+                  </pic:nvPicPr>
+                  <pic:blipFill>
+                    <a:blip r:embed="rId18">
+                      <a:extLst>
+                        <a:ext uri="{28A0092B-C50C-407E-A947-70E740481C1C}">
+                          <a14:useLocalDpi xmlns:a14="http://schemas.microsoft.com/office/drawing/2010/main" val="0"/>
+                        </a:ext>
+                      </a:extLst>
+                    </a:blip>
+                    <a:stretch>
+                      <a:fillRect/>
+                    </a:stretch>
+                  </pic:blipFill>
+                  <pic:spPr>
+                    <a:xfrm>
+                      <a:off x="0" y="0"/>
+                      <a:ext cx="4239260" cy="1718945"/>
+                    </a:xfrm>
+                    <a:prstGeom prst="rect">
+                      <a:avLst/>
+                    </a:prstGeom>
+                  </pic:spPr>
+                </pic:pic>
+              </a:graphicData>
+            </a:graphic>
+          </wp:inline>
+        </w:drawing>
+      </w:r>
+    </w:p>
+    <w:p>
+      <w:pPr>
+        <w:rPr>
+          <w:rFonts w:cstheme="minorHAnsi"/>
+          <w:b/>
+          <w:bCs/>
+          <w:sz w:val="32"/>
+          <w:szCs w:val="32"/>
+          <w:u w:val="single"/>
+        </w:rPr>
+      </w:pPr>
+      <w:r>
+        <w:rPr>
+          <w:rFonts w:cstheme="minorHAnsi"/>
+          <w:b/>
+          <w:bCs/>
+          <w:noProof/>
+          <w:sz w:val="32"/>
+          <w:szCs w:val="32"/>
+          <w:u w:val="single"/>
+        </w:rPr>
+        <w:drawing>
+          <wp:inline distT="0" distB="0" distL="0" distR="0" wp14:anchorId="6F545235" wp14:editId="2679B38F">
+            <wp:extent cx="4239260" cy="1696720"/>
+            <wp:effectExtent l="0" t="0" r="8890" b="0"/>
+            <wp:docPr id="1638202900" name="Picture 7"/>
+            <wp:cNvGraphicFramePr>
+              <a:graphicFrameLocks xmlns:a="http://schemas.openxmlformats.org/drawingml/2006/main" noChangeAspect="1"/>
+            </wp:cNvGraphicFramePr>
+            <a:graphic xmlns:a="http://schemas.openxmlformats.org/drawingml/2006/main">
+              <a:graphicData uri="http://schemas.openxmlformats.org/drawingml/2006/picture">
+                <pic:pic xmlns:pic="http://schemas.openxmlformats.org/drawingml/2006/picture">
+                  <pic:nvPicPr>
+                    <pic:cNvPr id="1638202900" name="Picture 1638202900"/>
+                    <pic:cNvPicPr/>
+                  </pic:nvPicPr>
+                  <pic:blipFill>
+                    <a:blip r:embed="rId19">
+                      <a:extLst>
+                        <a:ext uri="{28A0092B-C50C-407E-A947-70E740481C1C}">
+                          <a14:useLocalDpi xmlns:a14="http://schemas.microsoft.com/office/drawing/2010/main" val="0"/>
+                        </a:ext>
+                      </a:extLst>
+                    </a:blip>
+                    <a:stretch>
+                      <a:fillRect/>
+                    </a:stretch>
+                  </pic:blipFill>
+                  <pic:spPr>
+                    <a:xfrm>
+                      <a:off x="0" y="0"/>
+                      <a:ext cx="4239260" cy="1696720"/>
+                    </a:xfrm>
+                    <a:prstGeom prst="rect">
+                      <a:avLst/>
+                    </a:prstGeom>
+                  </pic:spPr>
+                </pic:pic>
+              </a:graphicData>
+            </a:graphic>
+          </wp:inline>
+        </w:drawing>
+      </w:r>
+    </w:p>
+    <w:p>
+      <w:pPr>
+        <w:rPr>
+          <w:rFonts w:cstheme="minorHAnsi"/>
+          <w:b/>
+          <w:bCs/>
+          <w:sz w:val="32"/>
+          <w:szCs w:val="32"/>
+          <w:u w:val="single"/>
+        </w:rPr>
+      </w:pPr>
+      <w:r>
+        <w:rPr>
+          <w:rFonts w:cstheme="minorHAnsi"/>
+          <w:b/>
+          <w:bCs/>
+          <w:noProof/>
+          <w:sz w:val="32"/>
+          <w:szCs w:val="32"/>
+          <w:u w:val="single"/>
+        </w:rPr>
+        <w:drawing>
+          <wp:inline distT="0" distB="0" distL="0" distR="0" wp14:anchorId="6E49FE36" wp14:editId="27A6FB06">
+            <wp:extent cx="4239260" cy="1956435"/>
+            <wp:effectExtent l="0" t="0" r="8890" b="5715"/>
+            <wp:docPr id="1885799753" name="Picture 8"/>
+            <wp:cNvGraphicFramePr>
+              <a:graphicFrameLocks xmlns:a="http://schemas.openxmlformats.org/drawingml/2006/main" noChangeAspect="1"/>
+            </wp:cNvGraphicFramePr>
+            <a:graphic xmlns:a="http://schemas.openxmlformats.org/drawingml/2006/main">
+              <a:graphicData uri="http://schemas.openxmlformats.org/drawingml/2006/picture">
+                <pic:pic xmlns:pic="http://schemas.openxmlformats.org/drawingml/2006/picture">
+                  <pic:nvPicPr>
+                    <pic:cNvPr id="1885799753" name="Picture 1885799753"/>
+                    <pic:cNvPicPr/>
+                  </pic:nvPicPr>
+                  <pic:blipFill>
+                    <a:blip r:embed="rId20">
+                      <a:extLst>
+                        <a:ext uri="{28A0092B-C50C-407E-A947-70E740481C1C}">
+                          <a14:useLocalDpi xmlns:a14="http://schemas.microsoft.com/office/drawing/2010/main" val="0"/>
+                        </a:ext>
+                      </a:extLst>
+                    </a:blip>
+                    <a:stretch>
+                      <a:fillRect/>
+                    </a:stretch>
+                  </pic:blipFill>
+                  <pic:spPr>
+                    <a:xfrm>
+                      <a:off x="0" y="0"/>
+                      <a:ext cx="4239260" cy="1956435"/>
+                    </a:xfrm>
+                    <a:prstGeom prst="rect">
+                      <a:avLst/>
+                    </a:prstGeom>
+                  </pic:spPr>
+                </pic:pic>
+              </a:graphicData>
+            </a:graphic>
+          </wp:inline>
+        </w:drawing>
+      </w:r>
+    </w:p>
+    <w:p>
+      <w:pPr>
+        <w:rPr>
+          <w:rFonts w:cstheme="minorHAnsi"/>
+          <w:b/>
+          <w:bCs/>
+          <w:sz w:val="32"/>
+          <w:szCs w:val="32"/>
+          <w:u w:val="single"/>
+        </w:rPr>
+      </w:pPr>
+      <w:r>
+        <w:rPr>
+          <w:rFonts w:cstheme="minorHAnsi"/>
+          <w:b/>
+          <w:bCs/>
+          <w:noProof/>
+          <w:sz w:val="32"/>
+          <w:szCs w:val="32"/>
+          <w:u w:val="single"/>
+        </w:rPr>
+        <w:lastRenderedPageBreak/>
+        <w:drawing>
+          <wp:inline distT="0" distB="0" distL="0" distR="0" wp14:anchorId="344C2C48" wp14:editId="259ABFA6">
+            <wp:extent cx="4239260" cy="2041525"/>
+            <wp:effectExtent l="0" t="0" r="8890" b="0"/>
+            <wp:docPr id="985269549" name="Picture 9"/>
+            <wp:cNvGraphicFramePr>
+              <a:graphicFrameLocks xmlns:a="http://schemas.openxmlformats.org/drawingml/2006/main" noChangeAspect="1"/>
+            </wp:cNvGraphicFramePr>
+            <a:graphic xmlns:a="http://schemas.openxmlformats.org/drawingml/2006/main">
+              <a:graphicData uri="http://schemas.openxmlformats.org/drawingml/2006/picture">
+                <pic:pic xmlns:pic="http://schemas.openxmlformats.org/drawingml/2006/picture">
+                  <pic:nvPicPr>
+                    <pic:cNvPr id="985269549" name="Picture 985269549"/>
+                    <pic:cNvPicPr/>
+                  </pic:nvPicPr>
+                  <pic:blipFill>
+                    <a:blip r:embed="rId21">
+                      <a:extLst>
+                        <a:ext uri="{28A0092B-C50C-407E-A947-70E740481C1C}">
+                          <a14:useLocalDpi xmlns:a14="http://schemas.microsoft.com/office/drawing/2010/main" val="0"/>
+                        </a:ext>
+                      </a:extLst>
+                    </a:blip>
+                    <a:stretch>
+                      <a:fillRect/>
+                    </a:stretch>
+                  </pic:blipFill>
+                  <pic:spPr>
+                    <a:xfrm>
+                      <a:off x="0" y="0"/>
+                      <a:ext cx="4239260" cy="2041525"/>
+                    </a:xfrm>
+                    <a:prstGeom prst="rect">
+                      <a:avLst/>
+                    </a:prstGeom>
+                  </pic:spPr>
+                </pic:pic>
+              </a:graphicData>
+            </a:graphic>
+          </wp:inline>
+        </w:drawing>
+      </w:r>
+    </w:p>
+    <w:p>
+      <w:pPr>
+        <w:rPr>
+          <w:rFonts w:cstheme="minorHAnsi"/>
+          <w:b/>
+          <w:bCs/>
+          <w:sz w:val="32"/>
+          <w:szCs w:val="32"/>
+          <w:u w:val="single"/>
+        </w:rPr>
+      </w:pPr>
+      <w:r>
+        <w:rPr>
+          <w:rFonts w:cstheme="minorHAnsi"/>
+          <w:b/>
+          <w:bCs/>
+          <w:noProof/>
+          <w:sz w:val="32"/>
+          <w:szCs w:val="32"/>
+          <w:u w:val="single"/>
+        </w:rPr>
+        <w:drawing>
+          <wp:inline distT="0" distB="0" distL="0" distR="0" wp14:anchorId="04619457" wp14:editId="554B041E">
+            <wp:extent cx="4239260" cy="2005965"/>
+            <wp:effectExtent l="0" t="0" r="8890" b="0"/>
+            <wp:docPr id="1850953485" name="Picture 10"/>
+            <wp:cNvGraphicFramePr>
+              <a:graphicFrameLocks xmlns:a="http://schemas.openxmlformats.org/drawingml/2006/main" noChangeAspect="1"/>
+            </wp:cNvGraphicFramePr>
+            <a:graphic xmlns:a="http://schemas.openxmlformats.org/drawingml/2006/main">
+              <a:graphicData uri="http://schemas.openxmlformats.org/drawingml/2006/picture">
+                <pic:pic xmlns:pic="http://schemas.openxmlformats.org/drawingml/2006/picture">
+                  <pic:nvPicPr>
+                    <pic:cNvPr id="1850953485" name="Picture 1850953485"/>
+                    <pic:cNvPicPr/>
+                  </pic:nvPicPr>
+                  <pic:blipFill>
+                    <a:blip r:embed="rId22">
+                      <a:extLst>
+                        <a:ext uri="{28A0092B-C50C-407E-A947-70E740481C1C}">
+                          <a14:useLocalDpi xmlns:a14="http://schemas.microsoft.com/office/drawing/2010/main" val="0"/>
+                        </a:ext>
+                      </a:extLst>
+                    </a:blip>
+                    <a:stretch>
+                      <a:fillRect/>
+                    </a:stretch>
+                  </pic:blipFill>
+                  <pic:spPr>
+                    <a:xfrm>
+                      <a:off x="0" y="0"/>
+                      <a:ext cx="4239260" cy="2005965"/>
+                    </a:xfrm>
+                    <a:prstGeom prst="rect">
+                      <a:avLst/>
+                    </a:prstGeom>
+                  </pic:spPr>
+                </pic:pic>
+              </a:graphicData>
+            </a:graphic>
+          </wp:inline>
+        </w:drawing>
+      </w:r>
+    </w:p>
+    <w:p>
+      <w:pPr>
+        <w:rPr>
+          <w:rFonts w:cstheme="minorHAnsi"/>
+          <w:b/>
+          <w:bCs/>
+          <w:sz w:val="32"/>
+          <w:szCs w:val="32"/>
+          <w:u w:val="single"/>
+        </w:rPr>
+      </w:pPr>
+      <w:r>
+        <w:rPr>
+          <w:rFonts w:cstheme="minorHAnsi"/>
+          <w:b/>
+          <w:bCs/>
+          <w:noProof/>
+          <w:sz w:val="32"/>
+          <w:szCs w:val="32"/>
+          <w:u w:val="single"/>
+        </w:rPr>
+        <w:drawing>
+          <wp:inline distT="0" distB="0" distL="0" distR="0" wp14:anchorId="4D03CC92" wp14:editId="58DC0648">
+            <wp:extent cx="4239260" cy="1875155"/>
+            <wp:effectExtent l="0" t="0" r="8890" b="0"/>
+            <wp:docPr id="895261093" name="Picture 11"/>
+            <wp:cNvGraphicFramePr>
+              <a:graphicFrameLocks xmlns:a="http://schemas.openxmlformats.org/drawingml/2006/main" noChangeAspect="1"/>
+            </wp:cNvGraphicFramePr>
+            <a:graphic xmlns:a="http://schemas.openxmlformats.org/drawingml/2006/main">
+              <a:graphicData uri="http://schemas.openxmlformats.org/drawingml/2006/picture">
+                <pic:pic xmlns:pic="http://schemas.openxmlformats.org/drawingml/2006/picture">
+                  <pic:nvPicPr>
+                    <pic:cNvPr id="895261093" name="Picture 895261093"/>
+                    <pic:cNvPicPr/>
+                  </pic:nvPicPr>
+                  <pic:blipFill>
+                    <a:blip r:embed="rId23">
+                      <a:extLst>
+                        <a:ext uri="{28A0092B-C50C-407E-A947-70E740481C1C}">
+                          <a14:useLocalDpi xmlns:a14="http://schemas.microsoft.com/office/drawing/2010/main" val="0"/>
+                        </a:ext>
+                      </a:extLst>
+                    </a:blip>
+                    <a:stretch>
+                      <a:fillRect/>
+                    </a:stretch>
+                  </pic:blipFill>
+                  <pic:spPr>
+                    <a:xfrm>
+                      <a:off x="0" y="0"/>
+                      <a:ext cx="4239260" cy="1875155"/>
+                    </a:xfrm>
+                    <a:prstGeom prst="rect">
+                      <a:avLst/>
+                    </a:prstGeom>
+                  </pic:spPr>
+                </pic:pic>
+              </a:graphicData>
+            </a:graphic>
+          </wp:inline>
+        </w:drawing>
+      </w:r>
+    </w:p>
+    <w:p>
+      <w:pPr>
+        <w:rPr>
+          <w:rFonts w:cstheme="minorHAnsi"/>
+          <w:b/>
+          <w:bCs/>
+          <w:sz w:val="32"/>
+          <w:szCs w:val="32"/>
+          <w:u w:val="single"/>
+        </w:rPr>
+      </w:pPr>
+      <w:r>
+        <w:rPr>
+          <w:rFonts w:cstheme="minorHAnsi"/>
+          <w:b/>
+          <w:bCs/>
+          <w:noProof/>
+          <w:sz w:val="32"/>
+          <w:szCs w:val="32"/>
+          <w:u w:val="single"/>
+        </w:rPr>
+        <w:drawing>
+          <wp:inline distT="0" distB="0" distL="0" distR="0" wp14:anchorId="64D5757F" wp14:editId="23C279F7">
+            <wp:extent cx="4239260" cy="1868805"/>
+            <wp:effectExtent l="0" t="0" r="8890" b="0"/>
+            <wp:docPr id="1339234813" name="Picture 12"/>
+            <wp:cNvGraphicFramePr>
+              <a:graphicFrameLocks xmlns:a="http://schemas.openxmlformats.org/drawingml/2006/main" noChangeAspect="1"/>
+            </wp:cNvGraphicFramePr>
+            <a:graphic xmlns:a="http://schemas.openxmlformats.org/drawingml/2006/main">
+              <a:graphicData uri="http://schemas.openxmlformats.org/drawingml/2006/picture">
+                <pic:pic xmlns:pic="http://schemas.openxmlformats.org/drawingml/2006/picture">
+                  <pic:nvPicPr>
+                    <pic:cNvPr id="1339234813" name="Picture 1339234813"/>
+                    <pic:cNvPicPr/>
+                  </pic:nvPicPr>
+                  <pic:blipFill>
+                    <a:blip r:embed="rId24">
+                      <a:extLst>
+                        <a:ext uri="{28A0092B-C50C-407E-A947-70E740481C1C}">
+                          <a14:useLocalDpi xmlns:a14="http://schemas.microsoft.com/office/drawing/2010/main" val="0"/>
+                        </a:ext>
+                      </a:extLst>
+                    </a:blip>
+                    <a:stretch>
+                      <a:fillRect/>
+                    </a:stretch>
+                  </pic:blipFill>
+                  <pic:spPr>
+                    <a:xfrm>
+                      <a:off x="0" y="0"/>
+                      <a:ext cx="4239260" cy="1868805"/>
+                    </a:xfrm>
+                    <a:prstGeom prst="rect">
+                      <a:avLst/>
+                    </a:prstGeom>
+                  </pic:spPr>
+                </pic:pic>
+              </a:graphicData>
+            </a:graphic>
+          </wp:inline>
+        </w:drawing>
+      </w:r>
+    </w:p>
+    <w:p>
+      <w:pPr>
+        <w:rPr>
+          <w:rFonts w:cstheme="minorHAnsi"/>
+          <w:b/>
+          <w:bCs/>
+          <w:sz w:val="32"/>
+          <w:szCs w:val="32"/>
+          <w:u w:val="single"/>
+        </w:rPr>
+      </w:pPr>
+      <w:r>
+        <w:rPr>
+          <w:rFonts w:cstheme="minorHAnsi"/>
+          <w:b/>
+          <w:bCs/>
+          <w:noProof/>
+          <w:sz w:val="32"/>
+          <w:szCs w:val="32"/>
+          <w:u w:val="single"/>
+        </w:rPr>
+        <w:lastRenderedPageBreak/>
+        <w:drawing>
+          <wp:inline distT="0" distB="0" distL="0" distR="0" wp14:anchorId="0A0BB10E" wp14:editId="503F4648">
+            <wp:extent cx="4239260" cy="2041525"/>
+            <wp:effectExtent l="0" t="0" r="8890" b="0"/>
+            <wp:docPr id="390389848" name="Picture 13"/>
+            <wp:cNvGraphicFramePr>
+              <a:graphicFrameLocks xmlns:a="http://schemas.openxmlformats.org/drawingml/2006/main" noChangeAspect="1"/>
+            </wp:cNvGraphicFramePr>
+            <a:graphic xmlns:a="http://schemas.openxmlformats.org/drawingml/2006/main">
+              <a:graphicData uri="http://schemas.openxmlformats.org/drawingml/2006/picture">
+                <pic:pic xmlns:pic="http://schemas.openxmlformats.org/drawingml/2006/picture">
+                  <pic:nvPicPr>
+                    <pic:cNvPr id="390389848" name="Picture 390389848"/>
+                    <pic:cNvPicPr/>
+                  </pic:nvPicPr>
+                  <pic:blipFill>
+                    <a:blip r:embed="rId25">
+                      <a:extLst>
+                        <a:ext uri="{28A0092B-C50C-407E-A947-70E740481C1C}">
+                          <a14:useLocalDpi xmlns:a14="http://schemas.microsoft.com/office/drawing/2010/main" val="0"/>
+                        </a:ext>
+                      </a:extLst>
+                    </a:blip>
+                    <a:stretch>
+                      <a:fillRect/>
+                    </a:stretch>
+                  </pic:blipFill>
+                  <pic:spPr>
+                    <a:xfrm>
+                      <a:off x="0" y="0"/>
+                      <a:ext cx="4239260" cy="2041525"/>
+                    </a:xfrm>
+                    <a:prstGeom prst="rect">
+                      <a:avLst/>
+                    </a:prstGeom>
+                  </pic:spPr>
+                </pic:pic>
+              </a:graphicData>
+            </a:graphic>
+          </wp:inline>
+        </w:drawing>
+      </w:r>
+    </w:p>
+    <w:p>
+      <w:pPr>
+        <w:rPr>
+          <w:rFonts w:cstheme="minorHAnsi"/>
+          <w:b/>
+          <w:bCs/>
+          <w:sz w:val="32"/>
+          <w:szCs w:val="32"/>
+          <w:u w:val="single"/>
+        </w:rPr>
+      </w:pPr>
+      <w:r>
+        <w:rPr>
+          <w:rFonts w:cstheme="minorHAnsi"/>
+          <w:b/>
+          <w:bCs/>
+          <w:noProof/>
+          <w:sz w:val="32"/>
+          <w:szCs w:val="32"/>
+          <w:u w:val="single"/>
+        </w:rPr>
+        <w:drawing>
+          <wp:inline distT="0" distB="0" distL="0" distR="0" wp14:anchorId="594E74C8" wp14:editId="66FB3972">
+            <wp:extent cx="4239260" cy="1680210"/>
+            <wp:effectExtent l="0" t="0" r="8890" b="0"/>
+            <wp:docPr id="273160248" name="Picture 14"/>
+            <wp:cNvGraphicFramePr>
+              <a:graphicFrameLocks xmlns:a="http://schemas.openxmlformats.org/drawingml/2006/main" noChangeAspect="1"/>
+            </wp:cNvGraphicFramePr>
+            <a:graphic xmlns:a="http://schemas.openxmlformats.org/drawingml/2006/main">
+              <a:graphicData uri="http://schemas.openxmlformats.org/drawingml/2006/picture">
+                <pic:pic xmlns:pic="http://schemas.openxmlformats.org/drawingml/2006/picture">
+                  <pic:nvPicPr>
+                    <pic:cNvPr id="273160248" name="Picture 273160248"/>
+                    <pic:cNvPicPr/>
+                  </pic:nvPicPr>
+                  <pic:blipFill>
+                    <a:blip r:embed="rId26">
+                      <a:extLst>
+                        <a:ext uri="{28A0092B-C50C-407E-A947-70E740481C1C}">
+                          <a14:useLocalDpi xmlns:a14="http://schemas.microsoft.com/office/drawing/2010/main" val="0"/>
+                        </a:ext>
+                      </a:extLst>
+                    </a:blip>
+                    <a:stretch>
+                      <a:fillRect/>
+                    </a:stretch>
+                  </pic:blipFill>
+                  <pic:spPr>
+                    <a:xfrm>
+                      <a:off x="0" y="0"/>
+                      <a:ext cx="4239260" cy="1680210"/>
+                    </a:xfrm>
+                    <a:prstGeom prst="rect">
+                      <a:avLst/>
+                    </a:prstGeom>
+                  </pic:spPr>
+                </pic:pic>
+              </a:graphicData>
+            </a:graphic>
+          </wp:inline>
+        </w:drawing>
+      </w:r>
+    </w:p>
+    <w:p>
+      <w:pPr>
+        <w:rPr>
+          <w:rFonts w:cstheme="minorHAnsi"/>
+          <w:b/>
+          <w:bCs/>
+          <w:sz w:val="32"/>
+          <w:szCs w:val="32"/>
+          <w:u w:val="single"/>
+        </w:rPr>
+      </w:pPr>
+      <w:r>
+        <w:rPr>
+          <w:rFonts w:cstheme="minorHAnsi"/>
+          <w:b/>
+          <w:bCs/>
+          <w:noProof/>
+          <w:sz w:val="32"/>
+          <w:szCs w:val="32"/>
+          <w:u w:val="single"/>
+        </w:rPr>
+        <w:drawing>
+          <wp:inline distT="0" distB="0" distL="0" distR="0" wp14:anchorId="27500937" wp14:editId="4437C718">
+            <wp:extent cx="4239260" cy="1995170"/>
+            <wp:effectExtent l="0" t="0" r="8890" b="5080"/>
+            <wp:docPr id="2013105750" name="Picture 15"/>
+            <wp:cNvGraphicFramePr>
+              <a:graphicFrameLocks xmlns:a="http://schemas.openxmlformats.org/drawingml/2006/main" noChangeAspect="1"/>
+            </wp:cNvGraphicFramePr>
+            <a:graphic xmlns:a="http://schemas.openxmlformats.org/drawingml/2006/main">
+              <a:graphicData uri="http://schemas.openxmlformats.org/drawingml/2006/picture">
+                <pic:pic xmlns:pic="http://schemas.openxmlformats.org/drawingml/2006/picture">
+                  <pic:nvPicPr>
+                    <pic:cNvPr id="2013105750" name="Picture 2013105750"/>
+                    <pic:cNvPicPr/>
+                  </pic:nvPicPr>
+                  <pic:blipFill>
+                    <a:blip r:embed="rId27">
+                      <a:extLst>
+                        <a:ext uri="{28A0092B-C50C-407E-A947-70E740481C1C}">
+                          <a14:useLocalDpi xmlns:a14="http://schemas.microsoft.com/office/drawing/2010/main" val="0"/>
+                        </a:ext>
+                      </a:extLst>
+                    </a:blip>
+                    <a:stretch>
+                      <a:fillRect/>
+                    </a:stretch>
+                  </pic:blipFill>
+                  <pic:spPr>
+                    <a:xfrm>
+                      <a:off x="0" y="0"/>
+                      <a:ext cx="4239260" cy="1995170"/>
+                    </a:xfrm>
+                    <a:prstGeom prst="rect">
+                      <a:avLst/>
+                    </a:prstGeom>
+                  </pic:spPr>
+                </pic:pic>
+              </a:graphicData>
+            </a:graphic>
+          </wp:inline>
+        </w:drawing>
+      </w:r>
+    </w:p>
+    <w:p>
+      <w:pPr>
+        <w:rPr>
+          <w:rFonts w:cstheme="minorHAnsi"/>
+          <w:b/>
+          <w:bCs/>
+          <w:sz w:val="32"/>
+          <w:szCs w:val="32"/>
+          <w:u w:val="single"/>
+        </w:rPr>
+      </w:pPr>
+      <w:r>
+        <w:rPr>
+          <w:rFonts w:cstheme="minorHAnsi"/>
+          <w:b/>
+          <w:bCs/>
+          <w:noProof/>
+          <w:sz w:val="32"/>
+          <w:szCs w:val="32"/>
+          <w:u w:val="single"/>
+        </w:rPr>
+        <w:drawing>
+          <wp:inline distT="0" distB="0" distL="0" distR="0" wp14:anchorId="470728BD" wp14:editId="15458513">
+            <wp:extent cx="4239260" cy="1708150"/>
+            <wp:effectExtent l="0" t="0" r="8890" b="6350"/>
+            <wp:docPr id="417281532" name="Picture 16"/>
+            <wp:cNvGraphicFramePr>
+              <a:graphicFrameLocks xmlns:a="http://schemas.openxmlformats.org/drawingml/2006/main" noChangeAspect="1"/>
+            </wp:cNvGraphicFramePr>
+            <a:graphic xmlns:a="http://schemas.openxmlformats.org/drawingml/2006/main">
+              <a:graphicData uri="http://schemas.openxmlformats.org/drawingml/2006/picture">
+                <pic:pic xmlns:pic="http://schemas.openxmlformats.org/drawingml/2006/picture">
+                  <pic:nvPicPr>
+                    <pic:cNvPr id="417281532" name="Picture 417281532"/>
+                    <pic:cNvPicPr/>
+                  </pic:nvPicPr>
+                  <pic:blipFill>
+                    <a:blip r:embed="rId28">
+                      <a:extLst>
+                        <a:ext uri="{28A0092B-C50C-407E-A947-70E740481C1C}">
+                          <a14:useLocalDpi xmlns:a14="http://schemas.microsoft.com/office/drawing/2010/main" val="0"/>
+                        </a:ext>
+                      </a:extLst>
+                    </a:blip>
+                    <a:stretch>
+                      <a:fillRect/>
+                    </a:stretch>
+                  </pic:blipFill>
+                  <pic:spPr>
+                    <a:xfrm>
+                      <a:off x="0" y="0"/>
+                      <a:ext cx="4239260" cy="1708150"/>
+                    </a:xfrm>
+                    <a:prstGeom prst="rect">
+                      <a:avLst/>
+                    </a:prstGeom>
+                  </pic:spPr>
+                </pic:pic>
+              </a:graphicData>
+            </a:graphic>
+          </wp:inline>
+        </w:drawing>
+      </w:r>
+    </w:p>
+    <w:p>
+      <w:pPr>
+        <w:rPr>
+          <w:rFonts w:cstheme="minorHAnsi"/>
+          <w:b/>
+          <w:bCs/>
+          <w:sz w:val="32"/>
+          <w:szCs w:val="32"/>
+          <w:u w:val="single"/>
+        </w:rPr>
+      </w:pPr>
+      <w:r>
+        <w:rPr>
+          <w:rFonts w:cstheme="minorHAnsi"/>
+          <w:b/>
+          <w:bCs/>
+          <w:noProof/>
+          <w:sz w:val="32"/>
+          <w:szCs w:val="32"/>
+          <w:u w:val="single"/>
+        </w:rPr>
+        <w:lastRenderedPageBreak/>
+        <w:drawing>
+          <wp:inline distT="0" distB="0" distL="0" distR="0" wp14:anchorId="48490568" wp14:editId="03E1BACA">
+            <wp:extent cx="4239260" cy="1701165"/>
+            <wp:effectExtent l="0" t="0" r="8890" b="0"/>
+            <wp:docPr id="1333059078" name="Picture 17"/>
+            <wp:cNvGraphicFramePr>
+              <a:graphicFrameLocks xmlns:a="http://schemas.openxmlformats.org/drawingml/2006/main" noChangeAspect="1"/>
+            </wp:cNvGraphicFramePr>
+            <a:graphic xmlns:a="http://schemas.openxmlformats.org/drawingml/2006/main">
+              <a:graphicData uri="http://schemas.openxmlformats.org/drawingml/2006/picture">
+                <pic:pic xmlns:pic="http://schemas.openxmlformats.org/drawingml/2006/picture">
+                  <pic:nvPicPr>
+                    <pic:cNvPr id="1333059078" name="Picture 1333059078"/>
+                    <pic:cNvPicPr/>
+                  </pic:nvPicPr>
+                  <pic:blipFill>
+                    <a:blip r:embed="rId29">
+                      <a:extLst>
+                        <a:ext uri="{28A0092B-C50C-407E-A947-70E740481C1C}">
+                          <a14:useLocalDpi xmlns:a14="http://schemas.microsoft.com/office/drawing/2010/main" val="0"/>
+                        </a:ext>
+                      </a:extLst>
+                    </a:blip>
+                    <a:stretch>
+                      <a:fillRect/>
+                    </a:stretch>
+                  </pic:blipFill>
+                  <pic:spPr>
+                    <a:xfrm>
+                      <a:off x="0" y="0"/>
+                      <a:ext cx="4239260" cy="1701165"/>
+                    </a:xfrm>
+                    <a:prstGeom prst="rect">
+                      <a:avLst/>
+                    </a:prstGeom>
+                  </pic:spPr>
+                </pic:pic>
+              </a:graphicData>
+            </a:graphic>
+          </wp:inline>
+        </w:drawing>
+      </w:r>
+    </w:p>
+    <w:p>
+      <w:pPr>
+        <w:rPr>
+          <w:rFonts w:cstheme="minorHAnsi"/>
+          <w:b/>
+          <w:bCs/>
+          <w:sz w:val="32"/>
+          <w:szCs w:val="32"/>
+          <w:u w:val="single"/>
+        </w:rPr>
+      </w:pPr>
+      <w:r>
+        <w:rPr>
+          <w:rFonts w:cstheme="minorHAnsi"/>
+          <w:b/>
+          <w:bCs/>
+          <w:noProof/>
+          <w:sz w:val="32"/>
+          <w:szCs w:val="32"/>
+          <w:u w:val="single"/>
+        </w:rPr>
+        <w:drawing>
+          <wp:inline distT="0" distB="0" distL="0" distR="0" wp14:anchorId="21D6E92A" wp14:editId="5229F6F9">
+            <wp:extent cx="4239260" cy="2085975"/>
+            <wp:effectExtent l="0" t="0" r="8890" b="9525"/>
+            <wp:docPr id="466864709" name="Picture 18"/>
+            <wp:cNvGraphicFramePr>
+              <a:graphicFrameLocks xmlns:a="http://schemas.openxmlformats.org/drawingml/2006/main" noChangeAspect="1"/>
+            </wp:cNvGraphicFramePr>
+            <a:graphic xmlns:a="http://schemas.openxmlformats.org/drawingml/2006/main">
+              <a:graphicData uri="http://schemas.openxmlformats.org/drawingml/2006/picture">
+                <pic:pic xmlns:pic="http://schemas.openxmlformats.org/drawingml/2006/picture">
+                  <pic:nvPicPr>
+                    <pic:cNvPr id="466864709" name="Picture 466864709"/>
+                    <pic:cNvPicPr/>
+                  </pic:nvPicPr>
+                  <pic:blipFill>
+                    <a:blip r:embed="rId30">
+                      <a:extLst>
+                        <a:ext uri="{28A0092B-C50C-407E-A947-70E740481C1C}">
+                          <a14:useLocalDpi xmlns:a14="http://schemas.microsoft.com/office/drawing/2010/main" val="0"/>
+                        </a:ext>
+                      </a:extLst>
+                    </a:blip>
+                    <a:stretch>
+                      <a:fillRect/>
+                    </a:stretch>
+                  </pic:blipFill>
+                  <pic:spPr>
+                    <a:xfrm>
+                      <a:off x="0" y="0"/>
+                      <a:ext cx="4239260" cy="2085975"/>
+                    </a:xfrm>
+                    <a:prstGeom prst="rect">
+                      <a:avLst/>
+                    </a:prstGeom>
+                  </pic:spPr>
+                </pic:pic>
+              </a:graphicData>
+            </a:graphic>
+          </wp:inline>
+        </w:drawing>
+      </w:r>
     </w:p>
     <w:sectPr>
       <w:pgSz w:w="11906" w:h="16838" w:code="9"/>
@@ -2923,6 +5031,155 @@
     </w:lvl>
   </w:abstractNum>
   <w:abstractNum w:abstractNumId="3" w15:restartNumberingAfterBreak="0">
+    <w:nsid w:val="1FF95931"/>
+    <w:multiLevelType w:val="multilevel"/>
+    <w:tmpl w:val="D3B08A56"/>
+    <w:lvl w:ilvl="0">
+      <w:start w:val="1"/>
+      <w:numFmt w:val="bullet"/>
+      <w:lvlText w:val=""/>
+      <w:lvlJc w:val="left"/>
+      <w:pPr>
+        <w:tabs>
+          <w:tab w:val="num" w:pos="720"/>
+        </w:tabs>
+        <w:ind w:left="720" w:hanging="360"/>
+      </w:pPr>
+      <w:rPr>
+        <w:rFonts w:ascii="Symbol" w:hAnsi="Symbol" w:hint="default"/>
+        <w:sz w:val="20"/>
+      </w:rPr>
+    </w:lvl>
+    <w:lvl w:ilvl="1" w:tentative="1">
+      <w:start w:val="1"/>
+      <w:numFmt w:val="bullet"/>
+      <w:lvlText w:val="o"/>
+      <w:lvlJc w:val="left"/>
+      <w:pPr>
+        <w:tabs>
+          <w:tab w:val="num" w:pos="1440"/>
+        </w:tabs>
+        <w:ind w:left="1440" w:hanging="360"/>
+      </w:pPr>
+      <w:rPr>
+        <w:rFonts w:ascii="Courier New" w:hAnsi="Courier New" w:hint="default"/>
+        <w:sz w:val="20"/>
+      </w:rPr>
+    </w:lvl>
+    <w:lvl w:ilvl="2" w:tentative="1">
+      <w:start w:val="1"/>
+      <w:numFmt w:val="bullet"/>
+      <w:lvlText w:val=""/>
+      <w:lvlJc w:val="left"/>
+      <w:pPr>
+        <w:tabs>
+          <w:tab w:val="num" w:pos="2160"/>
+        </w:tabs>
+        <w:ind w:left="2160" w:hanging="360"/>
+      </w:pPr>
+      <w:rPr>
+        <w:rFonts w:ascii="Wingdings" w:hAnsi="Wingdings" w:hint="default"/>
+        <w:sz w:val="20"/>
+      </w:rPr>
+    </w:lvl>
+    <w:lvl w:ilvl="3" w:tentative="1">
+      <w:start w:val="1"/>
+      <w:numFmt w:val="bullet"/>
+      <w:lvlText w:val=""/>
+      <w:lvlJc w:val="left"/>
+      <w:pPr>
+        <w:tabs>
+          <w:tab w:val="num" w:pos="2880"/>
+        </w:tabs>
+        <w:ind w:left="2880" w:hanging="360"/>
+      </w:pPr>
+      <w:rPr>
+        <w:rFonts w:ascii="Wingdings" w:hAnsi="Wingdings" w:hint="default"/>
+        <w:sz w:val="20"/>
+      </w:rPr>
+    </w:lvl>
+    <w:lvl w:ilvl="4" w:tentative="1">
+      <w:start w:val="1"/>
+      <w:numFmt w:val="bullet"/>
+      <w:lvlText w:val=""/>
+      <w:lvlJc w:val="left"/>
+      <w:pPr>
+        <w:tabs>
+          <w:tab w:val="num" w:pos="3600"/>
+        </w:tabs>
+        <w:ind w:left="3600" w:hanging="360"/>
+      </w:pPr>
+      <w:rPr>
+        <w:rFonts w:ascii="Wingdings" w:hAnsi="Wingdings" w:hint="default"/>
+        <w:sz w:val="20"/>
+      </w:rPr>
+    </w:lvl>
+    <w:lvl w:ilvl="5" w:tentative="1">
+      <w:start w:val="1"/>
+      <w:numFmt w:val="bullet"/>
+      <w:lvlText w:val=""/>
+      <w:lvlJc w:val="left"/>
+      <w:pPr>
+        <w:tabs>
+          <w:tab w:val="num" w:pos="4320"/>
+        </w:tabs>
+        <w:ind w:left="4320" w:hanging="360"/>
+      </w:pPr>
+      <w:rPr>
+        <w:rFonts w:ascii="Wingdings" w:hAnsi="Wingdings" w:hint="default"/>
+        <w:sz w:val="20"/>
+      </w:rPr>
+    </w:lvl>
+    <w:lvl w:ilvl="6" w:tentative="1">
+      <w:start w:val="1"/>
+      <w:numFmt w:val="bullet"/>
+      <w:lvlText w:val=""/>
+      <w:lvlJc w:val="left"/>
+      <w:pPr>
+        <w:tabs>
+          <w:tab w:val="num" w:pos="5040"/>
+        </w:tabs>
+        <w:ind w:left="5040" w:hanging="360"/>
+      </w:pPr>
+      <w:rPr>
+        <w:rFonts w:ascii="Wingdings" w:hAnsi="Wingdings" w:hint="default"/>
+        <w:sz w:val="20"/>
+      </w:rPr>
+    </w:lvl>
+    <w:lvl w:ilvl="7" w:tentative="1">
+      <w:start w:val="1"/>
+      <w:numFmt w:val="bullet"/>
+      <w:lvlText w:val=""/>
+      <w:lvlJc w:val="left"/>
+      <w:pPr>
+        <w:tabs>
+          <w:tab w:val="num" w:pos="5760"/>
+        </w:tabs>
+        <w:ind w:left="5760" w:hanging="360"/>
+      </w:pPr>
+      <w:rPr>
+        <w:rFonts w:ascii="Wingdings" w:hAnsi="Wingdings" w:hint="default"/>
+        <w:sz w:val="20"/>
+      </w:rPr>
+    </w:lvl>
+    <w:lvl w:ilvl="8" w:tentative="1">
+      <w:start w:val="1"/>
+      <w:numFmt w:val="bullet"/>
+      <w:lvlText w:val=""/>
+      <w:lvlJc w:val="left"/>
+      <w:pPr>
+        <w:tabs>
+          <w:tab w:val="num" w:pos="6480"/>
+        </w:tabs>
+        <w:ind w:left="6480" w:hanging="360"/>
+      </w:pPr>
+      <w:rPr>
+        <w:rFonts w:ascii="Wingdings" w:hAnsi="Wingdings" w:hint="default"/>
+        <w:sz w:val="20"/>
+      </w:rPr>
+    </w:lvl>
+  </w:abstractNum>
+  <w:abstractNum w:abstractNumId="4" w15:restartNumberingAfterBreak="0">
     <w:nsid w:val="21131BCF"/>
     <w:multiLevelType w:val="hybridMultilevel"/>
     <w:tmpl w:val="A82AC992"/>
@@ -3035,7 +5292,7 @@
       </w:rPr>
     </w:lvl>
   </w:abstractNum>
-  <w:abstractNum w:abstractNumId="4" w15:restartNumberingAfterBreak="0">
+  <w:abstractNum w:abstractNumId="5" w15:restartNumberingAfterBreak="0">
     <w:nsid w:val="23F47C24"/>
     <w:multiLevelType w:val="hybridMultilevel"/>
     <w:tmpl w:val="9F40C752"/>
@@ -3148,7 +5405,7 @@
       </w:rPr>
     </w:lvl>
   </w:abstractNum>
-  <w:abstractNum w:abstractNumId="5" w15:restartNumberingAfterBreak="0">
+  <w:abstractNum w:abstractNumId="6" w15:restartNumberingAfterBreak="0">
     <w:nsid w:val="28C71234"/>
     <w:multiLevelType w:val="hybridMultilevel"/>
     <w:tmpl w:val="A6DE36AC"/>
@@ -3261,7 +5518,7 @@
       </w:rPr>
     </w:lvl>
   </w:abstractNum>
-  <w:abstractNum w:abstractNumId="6" w15:restartNumberingAfterBreak="0">
+  <w:abstractNum w:abstractNumId="7" w15:restartNumberingAfterBreak="0">
     <w:nsid w:val="32454DFA"/>
     <w:multiLevelType w:val="hybridMultilevel"/>
     <w:tmpl w:val="4E0EDE18"/>
@@ -3374,7 +5631,7 @@
       </w:rPr>
     </w:lvl>
   </w:abstractNum>
-  <w:abstractNum w:abstractNumId="7" w15:restartNumberingAfterBreak="0">
+  <w:abstractNum w:abstractNumId="8" w15:restartNumberingAfterBreak="0">
     <w:nsid w:val="3ACE262C"/>
     <w:multiLevelType w:val="hybridMultilevel"/>
     <w:tmpl w:val="073E3B42"/>
@@ -3487,7 +5744,7 @@
       </w:rPr>
     </w:lvl>
   </w:abstractNum>
-  <w:abstractNum w:abstractNumId="8" w15:restartNumberingAfterBreak="0">
+  <w:abstractNum w:abstractNumId="9" w15:restartNumberingAfterBreak="0">
     <w:nsid w:val="3F415134"/>
     <w:multiLevelType w:val="multilevel"/>
     <w:tmpl w:val="1032C42C"/>
@@ -3600,7 +5857,7 @@
       </w:pPr>
     </w:lvl>
   </w:abstractNum>
-  <w:abstractNum w:abstractNumId="9" w15:restartNumberingAfterBreak="0">
+  <w:abstractNum w:abstractNumId="10" w15:restartNumberingAfterBreak="0">
     <w:nsid w:val="4E2E11E9"/>
     <w:multiLevelType w:val="hybridMultilevel"/>
     <w:tmpl w:val="21F86F80"/>
@@ -3689,7 +5946,7 @@
       </w:pPr>
     </w:lvl>
   </w:abstractNum>
-  <w:abstractNum w:abstractNumId="10" w15:restartNumberingAfterBreak="0">
+  <w:abstractNum w:abstractNumId="11" w15:restartNumberingAfterBreak="0">
     <w:nsid w:val="542C51A9"/>
     <w:multiLevelType w:val="hybridMultilevel"/>
     <w:tmpl w:val="16F4D386"/>
@@ -3802,7 +6059,7 @@
       </w:rPr>
     </w:lvl>
   </w:abstractNum>
-  <w:abstractNum w:abstractNumId="11" w15:restartNumberingAfterBreak="0">
+  <w:abstractNum w:abstractNumId="12" w15:restartNumberingAfterBreak="0">
     <w:nsid w:val="5B4E0AB3"/>
     <w:multiLevelType w:val="hybridMultilevel"/>
     <w:tmpl w:val="3718EF28"/>
@@ -3915,7 +6172,7 @@
       </w:rPr>
     </w:lvl>
   </w:abstractNum>
-  <w:abstractNum w:abstractNumId="12" w15:restartNumberingAfterBreak="0">
+  <w:abstractNum w:abstractNumId="13" w15:restartNumberingAfterBreak="0">
     <w:nsid w:val="5F394EC8"/>
     <w:multiLevelType w:val="hybridMultilevel"/>
     <w:tmpl w:val="0F64C60C"/>
@@ -4028,7 +6285,120 @@
       </w:rPr>
     </w:lvl>
   </w:abstractNum>
-  <w:abstractNum w:abstractNumId="13" w15:restartNumberingAfterBreak="0">
+  <w:abstractNum w:abstractNumId="14" w15:restartNumberingAfterBreak="0">
+    <w:nsid w:val="645301BA"/>
+    <w:multiLevelType w:val="hybridMultilevel"/>
+    <w:tmpl w:val="CD6E746A"/>
+    <w:lvl w:ilvl="0" w:tplc="38090001">
+      <w:start w:val="1"/>
+      <w:numFmt w:val="bullet"/>
+      <w:lvlText w:val=""/>
+      <w:lvlJc w:val="left"/>
+      <w:pPr>
+        <w:ind w:left="360" w:hanging="360"/>
+      </w:pPr>
+      <w:rPr>
+        <w:rFonts w:ascii="Symbol" w:hAnsi="Symbol" w:hint="default"/>
+      </w:rPr>
+    </w:lvl>
+    <w:lvl w:ilvl="1" w:tplc="38090003" w:tentative="1">
+      <w:start w:val="1"/>
+      <w:numFmt w:val="bullet"/>
+      <w:lvlText w:val="o"/>
+      <w:lvlJc w:val="left"/>
+      <w:pPr>
+        <w:ind w:left="1080" w:hanging="360"/>
+      </w:pPr>
+      <w:rPr>
+        <w:rFonts w:ascii="Courier New" w:hAnsi="Courier New" w:cs="Courier New" w:hint="default"/>
+      </w:rPr>
+    </w:lvl>
+    <w:lvl w:ilvl="2" w:tplc="38090005" w:tentative="1">
+      <w:start w:val="1"/>
+      <w:numFmt w:val="bullet"/>
+      <w:lvlText w:val=""/>
+      <w:lvlJc w:val="left"/>
+      <w:pPr>
+        <w:ind w:left="1800" w:hanging="360"/>
+      </w:pPr>
+      <w:rPr>
+        <w:rFonts w:ascii="Wingdings" w:hAnsi="Wingdings" w:hint="default"/>
+      </w:rPr>
+    </w:lvl>
+    <w:lvl w:ilvl="3" w:tplc="38090001" w:tentative="1">
+      <w:start w:val="1"/>
+      <w:numFmt w:val="bullet"/>
+      <w:lvlText w:val=""/>
+      <w:lvlJc w:val="left"/>
+      <w:pPr>
+        <w:ind w:left="2520" w:hanging="360"/>
+      </w:pPr>
+      <w:rPr>
+        <w:rFonts w:ascii="Symbol" w:hAnsi="Symbol" w:hint="default"/>
+      </w:rPr>
+    </w:lvl>
+    <w:lvl w:ilvl="4" w:tplc="38090003" w:tentative="1">
+      <w:start w:val="1"/>
+      <w:numFmt w:val="bullet"/>
+      <w:lvlText w:val="o"/>
+      <w:lvlJc w:val="left"/>
+      <w:pPr>
+        <w:ind w:left="3240" w:hanging="360"/>
+      </w:pPr>
+      <w:rPr>
+        <w:rFonts w:ascii="Courier New" w:hAnsi="Courier New" w:cs="Courier New" w:hint="default"/>
+      </w:rPr>
+    </w:lvl>
+    <w:lvl w:ilvl="5" w:tplc="38090005" w:tentative="1">
+      <w:start w:val="1"/>
+      <w:numFmt w:val="bullet"/>
+      <w:lvlText w:val=""/>
+      <w:lvlJc w:val="left"/>
+      <w:pPr>
+        <w:ind w:left="3960" w:hanging="360"/>
+      </w:pPr>
+      <w:rPr>
+        <w:rFonts w:ascii="Wingdings" w:hAnsi="Wingdings" w:hint="default"/>
+      </w:rPr>
+    </w:lvl>
+    <w:lvl w:ilvl="6" w:tplc="38090001" w:tentative="1">
+      <w:start w:val="1"/>
+      <w:numFmt w:val="bullet"/>
+      <w:lvlText w:val=""/>
+      <w:lvlJc w:val="left"/>
+      <w:pPr>
+        <w:ind w:left="4680" w:hanging="360"/>
+      </w:pPr>
+      <w:rPr>
+        <w:rFonts w:ascii="Symbol" w:hAnsi="Symbol" w:hint="default"/>
+      </w:rPr>
+    </w:lvl>
+    <w:lvl w:ilvl="7" w:tplc="38090003" w:tentative="1">
+      <w:start w:val="1"/>
+      <w:numFmt w:val="bullet"/>
+      <w:lvlText w:val="o"/>
+      <w:lvlJc w:val="left"/>
+      <w:pPr>
+        <w:ind w:left="5400" w:hanging="360"/>
+      </w:pPr>
+      <w:rPr>
+        <w:rFonts w:ascii="Courier New" w:hAnsi="Courier New" w:cs="Courier New" w:hint="default"/>
+      </w:rPr>
+    </w:lvl>
+    <w:lvl w:ilvl="8" w:tplc="38090005" w:tentative="1">
+      <w:start w:val="1"/>
+      <w:numFmt w:val="bullet"/>
+      <w:lvlText w:val=""/>
+      <w:lvlJc w:val="left"/>
+      <w:pPr>
+        <w:ind w:left="6120" w:hanging="360"/>
+      </w:pPr>
+      <w:rPr>
+        <w:rFonts w:ascii="Wingdings" w:hAnsi="Wingdings" w:hint="default"/>
+      </w:rPr>
+    </w:lvl>
+  </w:abstractNum>
+  <w:abstractNum w:abstractNumId="15" w15:restartNumberingAfterBreak="0">
     <w:nsid w:val="68FF4E2A"/>
     <w:multiLevelType w:val="hybridMultilevel"/>
     <w:tmpl w:val="7152B988"/>
@@ -4141,7 +6511,7 @@
       </w:rPr>
     </w:lvl>
   </w:abstractNum>
-  <w:abstractNum w:abstractNumId="14" w15:restartNumberingAfterBreak="0">
+  <w:abstractNum w:abstractNumId="16" w15:restartNumberingAfterBreak="0">
     <w:nsid w:val="72FD1A33"/>
     <w:multiLevelType w:val="hybridMultilevel"/>
     <w:tmpl w:val="9B9889CC"/>
@@ -4254,7 +6624,7 @@
       </w:rPr>
     </w:lvl>
   </w:abstractNum>
-  <w:abstractNum w:abstractNumId="15" w15:restartNumberingAfterBreak="0">
+  <w:abstractNum w:abstractNumId="17" w15:restartNumberingAfterBreak="0">
     <w:nsid w:val="7DDC2C5D"/>
     <w:multiLevelType w:val="hybridMultilevel"/>
     <w:tmpl w:val="71625B72"/>
@@ -4341,52 +6711,58 @@
     </w:lvl>
   </w:abstractNum>
   <w:num w:numId="1" w16cid:durableId="1809200027">
-    <w:abstractNumId w:val="15"/>
+    <w:abstractNumId w:val="17"/>
   </w:num>
   <w:num w:numId="2" w16cid:durableId="730688397">
-    <w:abstractNumId w:val="11"/>
+    <w:abstractNumId w:val="12"/>
   </w:num>
   <w:num w:numId="3" w16cid:durableId="1535188990">
     <w:abstractNumId w:val="0"/>
   </w:num>
   <w:num w:numId="4" w16cid:durableId="33503827">
-    <w:abstractNumId w:val="5"/>
+    <w:abstractNumId w:val="6"/>
   </w:num>
   <w:num w:numId="5" w16cid:durableId="2045251870">
-    <w:abstractNumId w:val="13"/>
+    <w:abstractNumId w:val="15"/>
   </w:num>
   <w:num w:numId="6" w16cid:durableId="507410150">
-    <w:abstractNumId w:val="4"/>
+    <w:abstractNumId w:val="5"/>
   </w:num>
   <w:num w:numId="7" w16cid:durableId="1915117267">
     <w:abstractNumId w:val="2"/>
   </w:num>
   <w:num w:numId="8" w16cid:durableId="793593595">
-    <w:abstractNumId w:val="8"/>
+    <w:abstractNumId w:val="9"/>
   </w:num>
   <w:num w:numId="9" w16cid:durableId="1761902449">
-    <w:abstractNumId w:val="12"/>
+    <w:abstractNumId w:val="13"/>
   </w:num>
   <w:num w:numId="10" w16cid:durableId="419906982">
-    <w:abstractNumId w:val="6"/>
+    <w:abstractNumId w:val="7"/>
   </w:num>
   <w:num w:numId="11" w16cid:durableId="676008323">
-    <w:abstractNumId w:val="14"/>
+    <w:abstractNumId w:val="16"/>
   </w:num>
   <w:num w:numId="12" w16cid:durableId="1459959176">
-    <w:abstractNumId w:val="10"/>
+    <w:abstractNumId w:val="11"/>
   </w:num>
   <w:num w:numId="13" w16cid:durableId="1364549147">
     <w:abstractNumId w:val="1"/>
   </w:num>
   <w:num w:numId="14" w16cid:durableId="1410276354">
-    <w:abstractNumId w:val="3"/>
+    <w:abstractNumId w:val="4"/>
   </w:num>
   <w:num w:numId="15" w16cid:durableId="1425148522">
-    <w:abstractNumId w:val="7"/>
+    <w:abstractNumId w:val="8"/>
   </w:num>
   <w:num w:numId="16" w16cid:durableId="1380279366">
-    <w:abstractNumId w:val="9"/>
+    <w:abstractNumId w:val="10"/>
+  </w:num>
+  <w:num w:numId="17" w16cid:durableId="679816817">
+    <w:abstractNumId w:val="14"/>
+  </w:num>
+  <w:num w:numId="18" w16cid:durableId="1310401935">
+    <w:abstractNumId w:val="3"/>
   </w:num>
 </w:numbering>
 </file>
@@ -5374,6 +7750,22 @@
       <w:shd w:val="clear" w:color="auto" w:fill="E1DFDD"/>
     </w:rPr>
   </w:style>
+  <w:style w:type="paragraph" w:customStyle="1" w:styleId="pdq2pgselectionanchorcontainer">
+    <w:name w:val="pdq2pg_selectionanchorcontainer"/>
+    <w:basedOn w:val="Normal"/>
+    <w:rsid w:val="00DB37CD"/>
+    <w:pPr>
+      <w:spacing w:before="100" w:beforeAutospacing="1" w:after="100" w:afterAutospacing="1" w:line="240" w:lineRule="auto"/>
+    </w:pPr>
+    <w:rPr>
+      <w:rFonts w:ascii="Times New Roman" w:eastAsia="Times New Roman" w:hAnsi="Times New Roman" w:cs="Times New Roman"/>
+      <w:kern w:val="0"/>
+      <w:sz w:val="24"/>
+      <w:szCs w:val="24"/>
+      <w:lang w:eastAsia="en-ID"/>
+      <w14:ligatures w14:val="none"/>
+    </w:rPr>
+  </w:style>
 </w:styles>
 </file>
 

</xml_diff>

<commit_message>
Add Shivang_12316885_IXD803.pdf to CA1 directory
</commit_message>
<xml_diff>
--- a/IXD803/Mine/CA's/CA1/CA1.docx
+++ b/IXD803/Mine/CA's/CA1/CA1.docx
@@ -2,6 +2,424 @@
 <file path=word/document.xml><?xml version="1.0" encoding="utf-8"?>
 <w:document xmlns:wpc="http://schemas.microsoft.com/office/word/2010/wordprocessingCanvas" xmlns:cx="http://schemas.microsoft.com/office/drawing/2014/chartex" xmlns:cx1="http://schemas.microsoft.com/office/drawing/2015/9/8/chartex" xmlns:cx2="http://schemas.microsoft.com/office/drawing/2015/10/21/chartex" xmlns:cx3="http://schemas.microsoft.com/office/drawing/2016/5/9/chartex" xmlns:cx4="http://schemas.microsoft.com/office/drawing/2016/5/10/chartex" xmlns:cx5="http://schemas.microsoft.com/office/drawing/2016/5/11/chartex" xmlns:cx6="http://schemas.microsoft.com/office/drawing/2016/5/12/chartex" xmlns:cx7="http://schemas.microsoft.com/office/drawing/2016/5/13/chartex" xmlns:cx8="http://schemas.microsoft.com/office/drawing/2016/5/14/chartex" xmlns:mc="http://schemas.openxmlformats.org/markup-compatibility/2006" xmlns:aink="http://schemas.microsoft.com/office/drawing/2016/ink" xmlns:am3d="http://schemas.microsoft.com/office/drawing/2017/model3d" xmlns:o="urn:schemas-microsoft-com:office:office" xmlns:oel="http://schemas.microsoft.com/office/2019/extlst" xmlns:r="http://schemas.openxmlformats.org/officeDocument/2006/relationships" xmlns:m="http://schemas.openxmlformats.org/officeDocument/2006/math" xmlns:v="urn:schemas-microsoft-com:vml" xmlns:wp14="http://schemas.microsoft.com/office/word/2010/wordprocessingDrawing" xmlns:wp="http://schemas.openxmlformats.org/drawingml/2006/wordprocessingDrawing" xmlns:w10="urn:schemas-microsoft-com:office:word" xmlns:w="http://schemas.openxmlformats.org/wordprocessingml/2006/main" xmlns:w14="http://schemas.microsoft.com/office/word/2010/wordml" xmlns:w15="http://schemas.microsoft.com/office/word/2012/wordml" xmlns:w16cex="http://schemas.microsoft.com/office/word/2018/wordml/cex" xmlns:w16cid="http://schemas.microsoft.com/office/word/2016/wordml/cid" xmlns:w16="http://schemas.microsoft.com/office/word/2018/wordml" xmlns:w16du="http://schemas.microsoft.com/office/word/2023/wordml/word16du" xmlns:w16sdtdh="http://schemas.microsoft.com/office/word/2020/wordml/sdtdatahash" xmlns:w16sdtfl="http://schemas.microsoft.com/office/word/2024/wordml/sdtformatlock" xmlns:w16se="http://schemas.microsoft.com/office/word/2015/wordml/symex" xmlns:wpg="http://schemas.microsoft.com/office/word/2010/wordprocessingGroup" xmlns:wpi="http://schemas.microsoft.com/office/word/2010/wordprocessingInk" xmlns:wne="http://schemas.microsoft.com/office/word/2006/wordml" xmlns:wps="http://schemas.microsoft.com/office/word/2010/wordprocessingShape" mc:Ignorable="w14 w15 w16se w16cid w16 w16cex w16sdtdh w16sdtfl w16du wp14">
   <w:body>
+    <w:p>
+      <w:pPr>
+        <w:jc w:val="center"/>
+        <w:rPr>
+          <w:rFonts w:cstheme="minorHAnsi"/>
+          <w:b/>
+          <w:bCs/>
+          <w:sz w:val="36"/>
+          <w:szCs w:val="36"/>
+          <w:u w:val="single"/>
+        </w:rPr>
+      </w:pPr>
+    </w:p>
+    <w:p>
+      <w:pPr>
+        <w:jc w:val="center"/>
+        <w:rPr>
+          <w:rFonts w:cstheme="minorHAnsi"/>
+          <w:b/>
+          <w:bCs/>
+          <w:sz w:val="36"/>
+          <w:szCs w:val="36"/>
+          <w:u w:val="single"/>
+        </w:rPr>
+      </w:pPr>
+      <w:r>
+        <w:rPr>
+          <w:rFonts w:cstheme="minorHAnsi"/>
+          <w:b/>
+          <w:bCs/>
+          <w:noProof/>
+          <w:sz w:val="36"/>
+          <w:szCs w:val="36"/>
+        </w:rPr>
+        <w:drawing>
+          <wp:inline distT="0" distB="0" distL="0" distR="0" wp14:anchorId="10831F10" wp14:editId="130395DA">
+            <wp:extent cx="3752850" cy="1219200"/>
+            <wp:effectExtent l="0" t="0" r="0" b="0"/>
+            <wp:docPr id="1490521367" name="Picture 1"/>
+            <wp:cNvGraphicFramePr>
+              <a:graphicFrameLocks xmlns:a="http://schemas.openxmlformats.org/drawingml/2006/main" noChangeAspect="1"/>
+            </wp:cNvGraphicFramePr>
+            <a:graphic xmlns:a="http://schemas.openxmlformats.org/drawingml/2006/main">
+              <a:graphicData uri="http://schemas.openxmlformats.org/drawingml/2006/picture">
+                <pic:pic xmlns:pic="http://schemas.openxmlformats.org/drawingml/2006/picture">
+                  <pic:nvPicPr>
+                    <pic:cNvPr id="1490521367" name="Picture 1490521367"/>
+                    <pic:cNvPicPr/>
+                  </pic:nvPicPr>
+                  <pic:blipFill>
+                    <a:blip r:embed="rId6">
+                      <a:extLst>
+                        <a:ext uri="{28A0092B-C50C-407E-A947-70E740481C1C}">
+                          <a14:useLocalDpi xmlns:a14="http://schemas.microsoft.com/office/drawing/2010/main" val="0"/>
+                        </a:ext>
+                      </a:extLst>
+                    </a:blip>
+                    <a:stretch>
+                      <a:fillRect/>
+                    </a:stretch>
+                  </pic:blipFill>
+                  <pic:spPr>
+                    <a:xfrm>
+                      <a:off x="0" y="0"/>
+                      <a:ext cx="3752850" cy="1219200"/>
+                    </a:xfrm>
+                    <a:prstGeom prst="rect">
+                      <a:avLst/>
+                    </a:prstGeom>
+                  </pic:spPr>
+                </pic:pic>
+              </a:graphicData>
+            </a:graphic>
+          </wp:inline>
+        </w:drawing>
+      </w:r>
+    </w:p>
+    <w:p>
+      <w:pPr>
+        <w:jc w:val="center"/>
+        <w:rPr>
+          <w:rFonts w:cstheme="minorHAnsi"/>
+          <w:b/>
+          <w:bCs/>
+          <w:sz w:val="36"/>
+          <w:szCs w:val="36"/>
+          <w:u w:val="single"/>
+        </w:rPr>
+      </w:pPr>
+    </w:p>
+    <w:p>
+      <w:pPr>
+        <w:jc w:val="center"/>
+        <w:rPr>
+          <w:rFonts w:cstheme="minorHAnsi"/>
+          <w:b/>
+          <w:bCs/>
+          <w:sz w:val="36"/>
+          <w:szCs w:val="36"/>
+          <w:u w:val="single"/>
+        </w:rPr>
+      </w:pPr>
+    </w:p>
+    <w:p>
+      <w:pPr>
+        <w:jc w:val="center"/>
+        <w:rPr>
+          <w:rFonts w:cstheme="minorHAnsi"/>
+          <w:sz w:val="36"/>
+          <w:szCs w:val="36"/>
+        </w:rPr>
+      </w:pPr>
+      <w:r>
+        <w:rPr>
+          <w:rFonts w:cstheme="minorHAnsi"/>
+          <w:b/>
+          <w:bCs/>
+          <w:sz w:val="36"/>
+          <w:szCs w:val="36"/>
+          <w:u w:val="single"/>
+        </w:rPr>
+        <w:t>Submitted to:</w:t>
+      </w:r>
+      <w:r>
+        <w:rPr>
+          <w:rFonts w:cstheme="minorHAnsi"/>
+          <w:sz w:val="36"/>
+          <w:szCs w:val="36"/>
+        </w:rPr>
+        <w:t xml:space="preserve"> Sayari Roy</w:t>
+      </w:r>
+    </w:p>
+    <w:p>
+      <w:pPr>
+        <w:jc w:val="center"/>
+        <w:rPr>
+          <w:rFonts w:cstheme="minorHAnsi"/>
+          <w:b/>
+          <w:bCs/>
+          <w:sz w:val="28"/>
+          <w:szCs w:val="28"/>
+          <w:u w:val="single"/>
+        </w:rPr>
+      </w:pPr>
+    </w:p>
+    <w:p>
+      <w:pPr>
+        <w:jc w:val="center"/>
+        <w:rPr>
+          <w:rFonts w:cstheme="minorHAnsi"/>
+          <w:sz w:val="32"/>
+          <w:szCs w:val="32"/>
+        </w:rPr>
+      </w:pPr>
+      <w:r>
+        <w:rPr>
+          <w:rFonts w:cstheme="minorHAnsi"/>
+          <w:b/>
+          <w:bCs/>
+          <w:sz w:val="32"/>
+          <w:szCs w:val="32"/>
+          <w:u w:val="single"/>
+        </w:rPr>
+        <w:t xml:space="preserve">Submitted By: </w:t>
+      </w:r>
+    </w:p>
+    <w:p>
+      <w:pPr>
+        <w:jc w:val="center"/>
+        <w:rPr>
+          <w:rFonts w:cstheme="minorHAnsi"/>
+          <w:sz w:val="32"/>
+          <w:szCs w:val="32"/>
+        </w:rPr>
+      </w:pPr>
+      <w:r>
+        <w:rPr>
+          <w:rFonts w:cstheme="minorHAnsi"/>
+          <w:b/>
+          <w:bCs/>
+          <w:sz w:val="32"/>
+          <w:szCs w:val="32"/>
+        </w:rPr>
+        <w:t>Name:</w:t>
+      </w:r>
+      <w:r>
+        <w:rPr>
+          <w:rFonts w:cstheme="minorHAnsi"/>
+          <w:sz w:val="32"/>
+          <w:szCs w:val="32"/>
+        </w:rPr>
+        <w:t xml:space="preserve"> Shivang Chaurasia</w:t>
+      </w:r>
+    </w:p>
+    <w:p>
+      <w:pPr>
+        <w:jc w:val="center"/>
+        <w:rPr>
+          <w:rFonts w:cstheme="minorHAnsi"/>
+          <w:sz w:val="32"/>
+          <w:szCs w:val="32"/>
+        </w:rPr>
+      </w:pPr>
+      <w:r>
+        <w:rPr>
+          <w:rFonts w:cstheme="minorHAnsi"/>
+          <w:b/>
+          <w:bCs/>
+          <w:sz w:val="32"/>
+          <w:szCs w:val="32"/>
+        </w:rPr>
+        <w:t>Roll No:</w:t>
+      </w:r>
+      <w:r>
+        <w:rPr>
+          <w:rFonts w:cstheme="minorHAnsi"/>
+          <w:sz w:val="32"/>
+          <w:szCs w:val="32"/>
+        </w:rPr>
+        <w:t xml:space="preserve"> 16</w:t>
+      </w:r>
+    </w:p>
+    <w:p>
+      <w:pPr>
+        <w:jc w:val="center"/>
+        <w:rPr>
+          <w:rFonts w:cstheme="minorHAnsi"/>
+          <w:sz w:val="32"/>
+          <w:szCs w:val="32"/>
+        </w:rPr>
+      </w:pPr>
+      <w:r>
+        <w:rPr>
+          <w:rFonts w:cstheme="minorHAnsi"/>
+          <w:b/>
+          <w:bCs/>
+          <w:sz w:val="32"/>
+          <w:szCs w:val="32"/>
+        </w:rPr>
+        <w:t>Registration No:</w:t>
+      </w:r>
+      <w:r>
+        <w:rPr>
+          <w:rFonts w:cstheme="minorHAnsi"/>
+          <w:sz w:val="32"/>
+          <w:szCs w:val="32"/>
+        </w:rPr>
+        <w:t xml:space="preserve"> 12316885</w:t>
+      </w:r>
+    </w:p>
+    <w:p>
+      <w:pPr>
+        <w:jc w:val="center"/>
+        <w:rPr>
+          <w:rFonts w:cstheme="minorHAnsi"/>
+          <w:sz w:val="32"/>
+          <w:szCs w:val="32"/>
+        </w:rPr>
+      </w:pPr>
+      <w:r>
+        <w:rPr>
+          <w:rFonts w:cstheme="minorHAnsi"/>
+          <w:b/>
+          <w:bCs/>
+          <w:sz w:val="32"/>
+          <w:szCs w:val="32"/>
+          <w:u w:val="single"/>
+        </w:rPr>
+        <w:t>Course Code</w:t>
+      </w:r>
+      <w:r>
+        <w:rPr>
+          <w:rFonts w:cstheme="minorHAnsi"/>
+          <w:b/>
+          <w:bCs/>
+          <w:sz w:val="32"/>
+          <w:szCs w:val="32"/>
+          <w:u w:val="single"/>
+        </w:rPr>
+        <w:t xml:space="preserve">: </w:t>
+      </w:r>
+      <w:r>
+        <w:rPr>
+          <w:rFonts w:cstheme="minorHAnsi"/>
+          <w:sz w:val="32"/>
+          <w:szCs w:val="32"/>
+        </w:rPr>
+        <w:t>IXD803</w:t>
+      </w:r>
+    </w:p>
+    <w:p>
+      <w:pPr>
+        <w:jc w:val="center"/>
+        <w:rPr>
+          <w:rFonts w:cstheme="minorHAnsi"/>
+          <w:b/>
+          <w:bCs/>
+          <w:sz w:val="28"/>
+          <w:szCs w:val="28"/>
+          <w:u w:val="single"/>
+        </w:rPr>
+      </w:pPr>
+    </w:p>
+    <w:p>
+      <w:pPr>
+        <w:jc w:val="center"/>
+        <w:rPr>
+          <w:rFonts w:cstheme="minorHAnsi"/>
+          <w:b/>
+          <w:bCs/>
+          <w:sz w:val="28"/>
+          <w:szCs w:val="28"/>
+          <w:u w:val="single"/>
+        </w:rPr>
+      </w:pPr>
+    </w:p>
+    <w:p>
+      <w:pPr>
+        <w:jc w:val="center"/>
+        <w:rPr>
+          <w:rFonts w:cstheme="minorHAnsi"/>
+          <w:b/>
+          <w:bCs/>
+          <w:sz w:val="28"/>
+          <w:szCs w:val="28"/>
+          <w:u w:val="single"/>
+        </w:rPr>
+      </w:pPr>
+    </w:p>
+    <w:p>
+      <w:pPr>
+        <w:jc w:val="center"/>
+        <w:rPr>
+          <w:rFonts w:cstheme="minorHAnsi"/>
+          <w:b/>
+          <w:bCs/>
+          <w:sz w:val="28"/>
+          <w:szCs w:val="28"/>
+          <w:u w:val="single"/>
+        </w:rPr>
+      </w:pPr>
+    </w:p>
+    <w:p>
+      <w:pPr>
+        <w:jc w:val="center"/>
+        <w:rPr>
+          <w:rFonts w:cstheme="minorHAnsi"/>
+          <w:b/>
+          <w:bCs/>
+          <w:sz w:val="28"/>
+          <w:szCs w:val="28"/>
+          <w:u w:val="single"/>
+        </w:rPr>
+      </w:pPr>
+    </w:p>
+    <w:p>
+      <w:pPr>
+        <w:jc w:val="center"/>
+        <w:rPr>
+          <w:rFonts w:cstheme="minorHAnsi"/>
+          <w:b/>
+          <w:bCs/>
+          <w:sz w:val="28"/>
+          <w:szCs w:val="28"/>
+          <w:u w:val="single"/>
+        </w:rPr>
+      </w:pPr>
+    </w:p>
+    <w:p>
+      <w:pPr>
+        <w:jc w:val="center"/>
+        <w:rPr>
+          <w:rFonts w:cstheme="minorHAnsi"/>
+          <w:sz w:val="36"/>
+          <w:szCs w:val="36"/>
+        </w:rPr>
+      </w:pPr>
+    </w:p>
+    <w:p>
+      <w:pPr>
+        <w:jc w:val="center"/>
+        <w:rPr>
+          <w:rFonts w:cstheme="minorHAnsi"/>
+          <w:sz w:val="36"/>
+          <w:szCs w:val="36"/>
+        </w:rPr>
+      </w:pPr>
+    </w:p>
+    <w:p>
+      <w:pPr>
+        <w:jc w:val="center"/>
+        <w:rPr>
+          <w:rFonts w:cstheme="minorHAnsi"/>
+          <w:sz w:val="36"/>
+          <w:szCs w:val="36"/>
+        </w:rPr>
+      </w:pPr>
+    </w:p>
+    <w:p>
+      <w:pPr>
+        <w:jc w:val="center"/>
+        <w:rPr>
+          <w:rFonts w:cstheme="minorHAnsi"/>
+          <w:sz w:val="36"/>
+          <w:szCs w:val="36"/>
+        </w:rPr>
+      </w:pPr>
+    </w:p>
+    <w:p>
+      <w:pPr>
+        <w:jc w:val="center"/>
+        <w:rPr>
+          <w:rFonts w:cstheme="minorHAnsi"/>
+          <w:sz w:val="36"/>
+          <w:szCs w:val="36"/>
+        </w:rPr>
+      </w:pPr>
+    </w:p>
     <w:p>
       <w:pPr>
         <w:jc w:val="center"/>
@@ -181,11 +599,8 @@
     <w:p>
       <w:pPr>
         <w:pStyle w:val="ListParagraph"/>
-        <w:numPr>
-          <w:ilvl w:val="0"/>
-          <w:numId w:val="15"/>
-        </w:numPr>
         <w:spacing w:after="0" w:line="240" w:lineRule="auto"/>
+        <w:ind w:left="360"/>
         <w:rPr>
           <w:rFonts w:eastAsia="Times New Roman" w:cstheme="minorHAnsi"/>
           <w:kern w:val="0"/>
@@ -195,20 +610,15 @@
           <w14:ligatures w14:val="none"/>
         </w:rPr>
       </w:pPr>
-      <w:r>
-        <w:rPr>
-          <w:rFonts w:eastAsia="Times New Roman" w:cstheme="minorHAnsi"/>
-          <w:b/>
-          <w:bCs/>
-          <w:kern w:val="0"/>
-          <w:sz w:val="24"/>
-          <w:szCs w:val="24"/>
-          <w:lang w:eastAsia="en-ID"/>
-          <w14:ligatures w14:val="none"/>
-        </w:rPr>
-        <w:t>Air Pollution Awareness &amp; Monitoring:</w:t>
-      </w:r>
-      <w:r>
+    </w:p>
+    <w:p>
+      <w:pPr>
+        <w:pStyle w:val="ListParagraph"/>
+        <w:numPr>
+          <w:ilvl w:val="0"/>
+          <w:numId w:val="15"/>
+        </w:numPr>
+        <w:spacing w:after="0" w:line="240" w:lineRule="auto"/>
         <w:rPr>
           <w:rFonts w:eastAsia="Times New Roman" w:cstheme="minorHAnsi"/>
           <w:kern w:val="0"/>
@@ -217,6 +627,29 @@
           <w:lang w:eastAsia="en-ID"/>
           <w14:ligatures w14:val="none"/>
         </w:rPr>
+      </w:pPr>
+      <w:r>
+        <w:rPr>
+          <w:rFonts w:eastAsia="Times New Roman" w:cstheme="minorHAnsi"/>
+          <w:b/>
+          <w:bCs/>
+          <w:kern w:val="0"/>
+          <w:sz w:val="24"/>
+          <w:szCs w:val="24"/>
+          <w:lang w:eastAsia="en-ID"/>
+          <w14:ligatures w14:val="none"/>
+        </w:rPr>
+        <w:t>Air Pollution Awareness &amp; Monitoring:</w:t>
+      </w:r>
+      <w:r>
+        <w:rPr>
+          <w:rFonts w:eastAsia="Times New Roman" w:cstheme="minorHAnsi"/>
+          <w:kern w:val="0"/>
+          <w:sz w:val="24"/>
+          <w:szCs w:val="24"/>
+          <w:lang w:eastAsia="en-ID"/>
+          <w14:ligatures w14:val="none"/>
+        </w:rPr>
         <w:br/>
         <w:t>People have limited awareness of the air quality around them and find it difficult to understand pollution levels, major pollution sources, and appropriate actions to reduce exposure.</w:t>
       </w:r>
@@ -281,6 +714,80 @@
       <w:pPr>
         <w:spacing w:after="0" w:line="240" w:lineRule="auto"/>
         <w:rPr>
+          <w:rFonts w:cstheme="minorHAnsi"/>
+        </w:rPr>
+      </w:pPr>
+      <w:r>
+        <w:rPr>
+          <w:rFonts w:cstheme="minorHAnsi"/>
+          <w:noProof/>
+        </w:rPr>
+        <w:drawing>
+          <wp:anchor distT="0" distB="0" distL="114300" distR="114300" simplePos="0" relativeHeight="251669504" behindDoc="1" locked="0" layoutInCell="1" allowOverlap="1" wp14:anchorId="733E0A86" wp14:editId="74AEFEF5">
+            <wp:simplePos x="0" y="0"/>
+            <wp:positionH relativeFrom="column">
+              <wp:posOffset>3035300</wp:posOffset>
+            </wp:positionH>
+            <wp:positionV relativeFrom="paragraph">
+              <wp:posOffset>55245</wp:posOffset>
+            </wp:positionV>
+            <wp:extent cx="2136775" cy="1514475"/>
+            <wp:effectExtent l="0" t="0" r="0" b="9525"/>
+            <wp:wrapTight wrapText="bothSides">
+              <wp:wrapPolygon edited="0">
+                <wp:start x="0" y="0"/>
+                <wp:lineTo x="0" y="21464"/>
+                <wp:lineTo x="21375" y="21464"/>
+                <wp:lineTo x="21375" y="0"/>
+                <wp:lineTo x="0" y="0"/>
+              </wp:wrapPolygon>
+            </wp:wrapTight>
+            <wp:docPr id="752691783" name="Picture 12"/>
+            <wp:cNvGraphicFramePr>
+              <a:graphicFrameLocks xmlns:a="http://schemas.openxmlformats.org/drawingml/2006/main" noChangeAspect="1"/>
+            </wp:cNvGraphicFramePr>
+            <a:graphic xmlns:a="http://schemas.openxmlformats.org/drawingml/2006/main">
+              <a:graphicData uri="http://schemas.openxmlformats.org/drawingml/2006/picture">
+                <pic:pic xmlns:pic="http://schemas.openxmlformats.org/drawingml/2006/picture">
+                  <pic:nvPicPr>
+                    <pic:cNvPr id="752691783" name="Picture 752691783"/>
+                    <pic:cNvPicPr/>
+                  </pic:nvPicPr>
+                  <pic:blipFill>
+                    <a:blip r:embed="rId7">
+                      <a:extLst>
+                        <a:ext uri="{28A0092B-C50C-407E-A947-70E740481C1C}">
+                          <a14:useLocalDpi xmlns:a14="http://schemas.microsoft.com/office/drawing/2010/main" val="0"/>
+                        </a:ext>
+                      </a:extLst>
+                    </a:blip>
+                    <a:stretch>
+                      <a:fillRect/>
+                    </a:stretch>
+                  </pic:blipFill>
+                  <pic:spPr>
+                    <a:xfrm>
+                      <a:off x="0" y="0"/>
+                      <a:ext cx="2136775" cy="1514475"/>
+                    </a:xfrm>
+                    <a:prstGeom prst="rect">
+                      <a:avLst/>
+                    </a:prstGeom>
+                  </pic:spPr>
+                </pic:pic>
+              </a:graphicData>
+            </a:graphic>
+            <wp14:sizeRelH relativeFrom="margin">
+              <wp14:pctWidth>0</wp14:pctWidth>
+            </wp14:sizeRelH>
+            <wp14:sizeRelV relativeFrom="margin">
+              <wp14:pctHeight>0</wp14:pctHeight>
+            </wp14:sizeRelV>
+          </wp:anchor>
+        </w:drawing>
+      </w:r>
+      <w:r>
+        <w:rPr>
           <w:rFonts w:eastAsia="Times New Roman" w:cstheme="minorHAnsi"/>
           <w:b/>
           <w:bCs/>
@@ -291,7 +798,8 @@
           <w:lang w:eastAsia="en-ID"/>
           <w14:ligatures w14:val="none"/>
         </w:rPr>
-      </w:pPr>
+        <w:t>Reasoning for Choosing Environmental Issue Reporting:</w:t>
+      </w:r>
       <w:r>
         <w:rPr>
           <w:rFonts w:eastAsia="Times New Roman" w:cstheme="minorHAnsi"/>
@@ -304,9 +812,56 @@
           <w:lang w:eastAsia="en-ID"/>
           <w14:ligatures w14:val="none"/>
         </w:rPr>
-        <w:t>Reasoning for Choosing Environmental Issue Reporting:</w:t>
-      </w:r>
-      <w:r>
+        <w:br/>
+      </w:r>
+      <w:r>
+        <w:rPr>
+          <w:rFonts w:cstheme="minorHAnsi"/>
+        </w:rPr>
+        <w:t xml:space="preserve">I chose </w:t>
+      </w:r>
+      <w:r>
+        <w:rPr>
+          <w:rStyle w:val="Strong"/>
+          <w:rFonts w:cstheme="minorHAnsi"/>
+        </w:rPr>
+        <w:t>Environmental Issue Reporting</w:t>
+      </w:r>
+      <w:r>
+        <w:rPr>
+          <w:rFonts w:cstheme="minorHAnsi"/>
+        </w:rPr>
+        <w:t xml:space="preserve"> because citizens frequently encounter issues such as illegal dumping, overflowing garbage, and pollution but often lack a simple way to report them to the right authorities. The problem has a direct impact on community cleanliness and sustainability. It also offers clear user pain points and good scope for research and designing a user-</w:t>
+      </w:r>
+      <w:proofErr w:type="spellStart"/>
+      <w:r>
+        <w:rPr>
+          <w:rFonts w:cstheme="minorHAnsi"/>
+        </w:rPr>
+        <w:t>centered</w:t>
+      </w:r>
+      <w:proofErr w:type="spellEnd"/>
+      <w:r>
+        <w:rPr>
+          <w:rFonts w:cstheme="minorHAnsi"/>
+        </w:rPr>
+        <w:t xml:space="preserve"> digital solution.</w:t>
+      </w:r>
+    </w:p>
+    <w:p>
+      <w:pPr>
+        <w:spacing w:after="0" w:line="240" w:lineRule="auto"/>
+        <w:rPr>
+          <w:rFonts w:cstheme="minorHAnsi"/>
+          <w:sz w:val="10"/>
+          <w:szCs w:val="10"/>
+        </w:rPr>
+      </w:pPr>
+    </w:p>
+    <w:p>
+      <w:pPr>
+        <w:spacing w:after="0" w:line="240" w:lineRule="auto"/>
+        <w:jc w:val="center"/>
         <w:rPr>
           <w:rFonts w:eastAsia="Times New Roman" w:cstheme="minorHAnsi"/>
           <w:b/>
@@ -318,40 +873,49 @@
           <w:lang w:eastAsia="en-ID"/>
           <w14:ligatures w14:val="none"/>
         </w:rPr>
-        <w:br/>
-      </w:r>
-      <w:r>
-        <w:rPr>
-          <w:rFonts w:cstheme="minorHAnsi"/>
-        </w:rPr>
-        <w:t xml:space="preserve">I chose </w:t>
-      </w:r>
-      <w:r>
-        <w:rPr>
-          <w:rStyle w:val="Strong"/>
-          <w:rFonts w:cstheme="minorHAnsi"/>
-        </w:rPr>
-        <w:t>Environmental Issue Reporting</w:t>
-      </w:r>
-      <w:r>
-        <w:rPr>
-          <w:rFonts w:cstheme="minorHAnsi"/>
-        </w:rPr>
-        <w:t xml:space="preserve"> because citizens frequently encounter issues such as illegal dumping, overflowing garbage, and pollution but often lack a simple way to report them to the right authorities. The problem has a direct impact on community cleanliness and sustainability. It also offers clear user pain points and good scope for research and designing a user-</w:t>
-      </w:r>
-      <w:proofErr w:type="spellStart"/>
-      <w:r>
-        <w:rPr>
-          <w:rFonts w:cstheme="minorHAnsi"/>
-        </w:rPr>
-        <w:t>centered</w:t>
-      </w:r>
-      <w:proofErr w:type="spellEnd"/>
-      <w:r>
-        <w:rPr>
-          <w:rFonts w:cstheme="minorHAnsi"/>
-        </w:rPr>
-        <w:t xml:space="preserve"> digital solution.</w:t>
+      </w:pPr>
+      <w:r>
+        <w:rPr>
+          <w:rFonts w:cstheme="minorHAnsi"/>
+          <w:sz w:val="36"/>
+          <w:szCs w:val="36"/>
+        </w:rPr>
+        <w:lastRenderedPageBreak/>
+        <w:drawing>
+          <wp:inline distT="0" distB="0" distL="0" distR="0" wp14:anchorId="54FFAFB7" wp14:editId="3D42F3F2">
+            <wp:extent cx="4703978" cy="2628900"/>
+            <wp:effectExtent l="0" t="0" r="1905" b="0"/>
+            <wp:docPr id="753963638" name="Picture 1"/>
+            <wp:cNvGraphicFramePr>
+              <a:graphicFrameLocks xmlns:a="http://schemas.openxmlformats.org/drawingml/2006/main" noChangeAspect="1"/>
+            </wp:cNvGraphicFramePr>
+            <a:graphic xmlns:a="http://schemas.openxmlformats.org/drawingml/2006/main">
+              <a:graphicData uri="http://schemas.openxmlformats.org/drawingml/2006/picture">
+                <pic:pic xmlns:pic="http://schemas.openxmlformats.org/drawingml/2006/picture">
+                  <pic:nvPicPr>
+                    <pic:cNvPr id="753963638" name=""/>
+                    <pic:cNvPicPr/>
+                  </pic:nvPicPr>
+                  <pic:blipFill>
+                    <a:blip r:embed="rId8"/>
+                    <a:stretch>
+                      <a:fillRect/>
+                    </a:stretch>
+                  </pic:blipFill>
+                  <pic:spPr>
+                    <a:xfrm>
+                      <a:off x="0" y="0"/>
+                      <a:ext cx="4731921" cy="2644517"/>
+                    </a:xfrm>
+                    <a:prstGeom prst="rect">
+                      <a:avLst/>
+                    </a:prstGeom>
+                  </pic:spPr>
+                </pic:pic>
+              </a:graphicData>
+            </a:graphic>
+          </wp:inline>
+        </w:drawing>
       </w:r>
     </w:p>
     <w:p>
@@ -369,6 +933,20 @@
     </w:p>
     <w:p>
       <w:pPr>
+        <w:spacing w:after="0" w:line="240" w:lineRule="auto"/>
+        <w:jc w:val="center"/>
+        <w:rPr>
+          <w:rFonts w:eastAsia="Times New Roman" w:cstheme="minorHAnsi"/>
+          <w:kern w:val="0"/>
+          <w:sz w:val="24"/>
+          <w:szCs w:val="24"/>
+          <w:lang w:eastAsia="en-ID"/>
+          <w14:ligatures w14:val="none"/>
+        </w:rPr>
+      </w:pPr>
+    </w:p>
+    <w:p>
+      <w:pPr>
         <w:rPr>
           <w:rFonts w:cstheme="minorHAnsi"/>
           <w:b/>
@@ -462,11 +1040,89 @@
       <w:r>
         <w:rPr>
           <w:rFonts w:eastAsia="Times New Roman" w:cstheme="minorHAnsi"/>
+          <w:noProof/>
+          <w:kern w:val="0"/>
+          <w:sz w:val="24"/>
+          <w:szCs w:val="24"/>
+          <w:lang w:eastAsia="en-ID"/>
+        </w:rPr>
+        <w:drawing>
+          <wp:anchor distT="0" distB="0" distL="114300" distR="114300" simplePos="0" relativeHeight="251658240" behindDoc="1" locked="0" layoutInCell="1" allowOverlap="1" wp14:anchorId="33958587" wp14:editId="280BEB8D">
+            <wp:simplePos x="0" y="0"/>
+            <wp:positionH relativeFrom="column">
+              <wp:posOffset>3086735</wp:posOffset>
+            </wp:positionH>
+            <wp:positionV relativeFrom="paragraph">
+              <wp:posOffset>314325</wp:posOffset>
+            </wp:positionV>
+            <wp:extent cx="2148840" cy="2148840"/>
+            <wp:effectExtent l="0" t="0" r="3810" b="3810"/>
+            <wp:wrapTight wrapText="bothSides">
+              <wp:wrapPolygon edited="0">
+                <wp:start x="0" y="0"/>
+                <wp:lineTo x="0" y="21447"/>
+                <wp:lineTo x="21447" y="21447"/>
+                <wp:lineTo x="21447" y="0"/>
+                <wp:lineTo x="0" y="0"/>
+              </wp:wrapPolygon>
+            </wp:wrapTight>
+            <wp:docPr id="1492956219" name="Picture 2"/>
+            <wp:cNvGraphicFramePr>
+              <a:graphicFrameLocks xmlns:a="http://schemas.openxmlformats.org/drawingml/2006/main" noChangeAspect="1"/>
+            </wp:cNvGraphicFramePr>
+            <a:graphic xmlns:a="http://schemas.openxmlformats.org/drawingml/2006/main">
+              <a:graphicData uri="http://schemas.openxmlformats.org/drawingml/2006/picture">
+                <pic:pic xmlns:pic="http://schemas.openxmlformats.org/drawingml/2006/picture">
+                  <pic:nvPicPr>
+                    <pic:cNvPr id="1492956219" name="Picture 1492956219"/>
+                    <pic:cNvPicPr/>
+                  </pic:nvPicPr>
+                  <pic:blipFill>
+                    <a:blip r:embed="rId9" cstate="print">
+                      <a:extLst>
+                        <a:ext uri="{28A0092B-C50C-407E-A947-70E740481C1C}">
+                          <a14:useLocalDpi xmlns:a14="http://schemas.microsoft.com/office/drawing/2010/main" val="0"/>
+                        </a:ext>
+                      </a:extLst>
+                    </a:blip>
+                    <a:stretch>
+                      <a:fillRect/>
+                    </a:stretch>
+                  </pic:blipFill>
+                  <pic:spPr>
+                    <a:xfrm>
+                      <a:off x="0" y="0"/>
+                      <a:ext cx="2148840" cy="2148840"/>
+                    </a:xfrm>
+                    <a:prstGeom prst="rect">
+                      <a:avLst/>
+                    </a:prstGeom>
+                  </pic:spPr>
+                </pic:pic>
+              </a:graphicData>
+            </a:graphic>
+          </wp:anchor>
+        </w:drawing>
+      </w:r>
+      <w:r>
+        <w:rPr>
+          <w:rFonts w:eastAsia="Times New Roman" w:cstheme="minorHAnsi"/>
           <w:kern w:val="0"/>
           <w:lang w:eastAsia="en-ID"/>
           <w14:ligatures w14:val="none"/>
         </w:rPr>
         <w:t>Students often notice environmental problems around the college campus, such as garbage, overflowing dustbins, pollution, water wastage, and other unhygienic conditions. Sometimes students also come across injured or harmed animals on roads but do not know whom to contact for help.</w:t>
+      </w:r>
+      <w:r>
+        <w:rPr>
+          <w:rFonts w:eastAsia="Times New Roman" w:cstheme="minorHAnsi"/>
+          <w:noProof/>
+          <w:kern w:val="0"/>
+          <w:sz w:val="24"/>
+          <w:szCs w:val="24"/>
+          <w:lang w:eastAsia="en-ID"/>
+        </w:rPr>
+        <w:t xml:space="preserve"> </w:t>
       </w:r>
     </w:p>
     <w:p>
@@ -490,17 +1146,7 @@
           <w:lang w:eastAsia="en-ID"/>
           <w14:ligatures w14:val="none"/>
         </w:rPr>
-        <w:t xml:space="preserve">The main problem is that there is no simple and convenient way for students to report these issues with proper location and evidence. Our idea is to create a platform where students </w:t>
-      </w:r>
-      <w:r>
-        <w:rPr>
-          <w:rFonts w:eastAsia="Times New Roman" w:cstheme="minorHAnsi"/>
-          <w:kern w:val="0"/>
-          <w:lang w:eastAsia="en-ID"/>
-          <w14:ligatures w14:val="none"/>
-        </w:rPr>
-        <w:lastRenderedPageBreak/>
-        <w:t>can report an issue by adding a photo, location, and short description.</w:t>
+        <w:t>The main problem is that there is no simple and convenient way for students to report these issues with proper location and evidence. Our idea is to create a platform where students can report an issue by adding a photo, location, and short description.</w:t>
       </w:r>
     </w:p>
     <w:p>
@@ -621,6 +1267,20 @@
     <w:p>
       <w:pPr>
         <w:pStyle w:val="ListParagraph"/>
+        <w:ind w:left="1080"/>
+        <w:rPr>
+          <w:rFonts w:cstheme="minorHAnsi"/>
+          <w:b/>
+          <w:bCs/>
+          <w:sz w:val="28"/>
+          <w:szCs w:val="28"/>
+          <w:u w:val="single"/>
+        </w:rPr>
+      </w:pPr>
+    </w:p>
+    <w:p>
+      <w:pPr>
+        <w:pStyle w:val="ListParagraph"/>
         <w:numPr>
           <w:ilvl w:val="0"/>
           <w:numId w:val="1"/>
@@ -643,6 +1303,7 @@
           <w:szCs w:val="28"/>
           <w:u w:val="single"/>
         </w:rPr>
+        <w:lastRenderedPageBreak/>
         <w:t>Research Location:</w:t>
       </w:r>
     </w:p>
@@ -820,6 +1481,79 @@
       </w:pPr>
       <w:r>
         <w:rPr>
+          <w:rFonts w:cstheme="minorHAnsi"/>
+          <w:b/>
+          <w:bCs/>
+          <w:noProof/>
+          <w:sz w:val="28"/>
+          <w:szCs w:val="28"/>
+        </w:rPr>
+        <w:drawing>
+          <wp:anchor distT="0" distB="0" distL="114300" distR="114300" simplePos="0" relativeHeight="251659264" behindDoc="1" locked="0" layoutInCell="1" allowOverlap="1" wp14:anchorId="18AC10DA" wp14:editId="01C6CCFB">
+            <wp:simplePos x="0" y="0"/>
+            <wp:positionH relativeFrom="column">
+              <wp:posOffset>3406775</wp:posOffset>
+            </wp:positionH>
+            <wp:positionV relativeFrom="paragraph">
+              <wp:posOffset>38735</wp:posOffset>
+            </wp:positionV>
+            <wp:extent cx="1821180" cy="2427605"/>
+            <wp:effectExtent l="0" t="0" r="7620" b="0"/>
+            <wp:wrapTight wrapText="bothSides">
+              <wp:wrapPolygon edited="0">
+                <wp:start x="0" y="0"/>
+                <wp:lineTo x="0" y="21357"/>
+                <wp:lineTo x="21464" y="21357"/>
+                <wp:lineTo x="21464" y="0"/>
+                <wp:lineTo x="0" y="0"/>
+              </wp:wrapPolygon>
+            </wp:wrapTight>
+            <wp:docPr id="1287094051" name="Picture 1"/>
+            <wp:cNvGraphicFramePr>
+              <a:graphicFrameLocks xmlns:a="http://schemas.openxmlformats.org/drawingml/2006/main" noChangeAspect="1"/>
+            </wp:cNvGraphicFramePr>
+            <a:graphic xmlns:a="http://schemas.openxmlformats.org/drawingml/2006/main">
+              <a:graphicData uri="http://schemas.openxmlformats.org/drawingml/2006/picture">
+                <pic:pic xmlns:pic="http://schemas.openxmlformats.org/drawingml/2006/picture">
+                  <pic:nvPicPr>
+                    <pic:cNvPr id="1663293217" name="Picture 1663293217"/>
+                    <pic:cNvPicPr/>
+                  </pic:nvPicPr>
+                  <pic:blipFill>
+                    <a:blip r:embed="rId10" cstate="print">
+                      <a:extLst>
+                        <a:ext uri="{28A0092B-C50C-407E-A947-70E740481C1C}">
+                          <a14:useLocalDpi xmlns:a14="http://schemas.microsoft.com/office/drawing/2010/main" val="0"/>
+                        </a:ext>
+                      </a:extLst>
+                    </a:blip>
+                    <a:stretch>
+                      <a:fillRect/>
+                    </a:stretch>
+                  </pic:blipFill>
+                  <pic:spPr>
+                    <a:xfrm>
+                      <a:off x="0" y="0"/>
+                      <a:ext cx="1821180" cy="2427605"/>
+                    </a:xfrm>
+                    <a:prstGeom prst="rect">
+                      <a:avLst/>
+                    </a:prstGeom>
+                  </pic:spPr>
+                </pic:pic>
+              </a:graphicData>
+            </a:graphic>
+            <wp14:sizeRelH relativeFrom="margin">
+              <wp14:pctWidth>0</wp14:pctWidth>
+            </wp14:sizeRelH>
+            <wp14:sizeRelV relativeFrom="margin">
+              <wp14:pctHeight>0</wp14:pctHeight>
+            </wp14:sizeRelV>
+          </wp:anchor>
+        </w:drawing>
+      </w:r>
+      <w:r>
+        <w:rPr>
           <w:rFonts w:eastAsia="Times New Roman" w:cstheme="minorHAnsi"/>
           <w:kern w:val="0"/>
           <w:sz w:val="24"/>
@@ -1027,6 +1761,17 @@
         </w:rPr>
         <w:t>What features would make you use an environmental reporting system?</w:t>
       </w:r>
+      <w:r>
+        <w:rPr>
+          <w:rFonts w:cstheme="minorHAnsi"/>
+          <w:b/>
+          <w:bCs/>
+          <w:noProof/>
+          <w:sz w:val="28"/>
+          <w:szCs w:val="28"/>
+        </w:rPr>
+        <w:t xml:space="preserve"> </w:t>
+      </w:r>
     </w:p>
     <w:p>
       <w:pPr>
@@ -1097,6 +1842,73 @@
       </w:pPr>
       <w:r>
         <w:rPr>
+          <w:rFonts w:eastAsia="Times New Roman" w:cstheme="minorHAnsi"/>
+          <w:noProof/>
+          <w:kern w:val="0"/>
+          <w:sz w:val="24"/>
+          <w:szCs w:val="24"/>
+          <w:lang w:eastAsia="en-ID"/>
+        </w:rPr>
+        <w:drawing>
+          <wp:anchor distT="0" distB="0" distL="114300" distR="114300" simplePos="0" relativeHeight="251665408" behindDoc="1" locked="0" layoutInCell="1" allowOverlap="1" wp14:anchorId="05A9F617" wp14:editId="4AD9F208">
+            <wp:simplePos x="0" y="0"/>
+            <wp:positionH relativeFrom="column">
+              <wp:posOffset>3406775</wp:posOffset>
+            </wp:positionH>
+            <wp:positionV relativeFrom="paragraph">
+              <wp:posOffset>488950</wp:posOffset>
+            </wp:positionV>
+            <wp:extent cx="1371600" cy="1386840"/>
+            <wp:effectExtent l="0" t="0" r="0" b="3810"/>
+            <wp:wrapTight wrapText="bothSides">
+              <wp:wrapPolygon edited="0">
+                <wp:start x="0" y="0"/>
+                <wp:lineTo x="0" y="21363"/>
+                <wp:lineTo x="21300" y="21363"/>
+                <wp:lineTo x="21300" y="0"/>
+                <wp:lineTo x="0" y="0"/>
+              </wp:wrapPolygon>
+            </wp:wrapTight>
+            <wp:docPr id="627417477" name="Picture 8"/>
+            <wp:cNvGraphicFramePr>
+              <a:graphicFrameLocks xmlns:a="http://schemas.openxmlformats.org/drawingml/2006/main" noChangeAspect="1"/>
+            </wp:cNvGraphicFramePr>
+            <a:graphic xmlns:a="http://schemas.openxmlformats.org/drawingml/2006/main">
+              <a:graphicData uri="http://schemas.openxmlformats.org/drawingml/2006/picture">
+                <pic:pic xmlns:pic="http://schemas.openxmlformats.org/drawingml/2006/picture">
+                  <pic:nvPicPr>
+                    <pic:cNvPr id="627417477" name="Picture 627417477"/>
+                    <pic:cNvPicPr/>
+                  </pic:nvPicPr>
+                  <pic:blipFill>
+                    <a:blip r:embed="rId11">
+                      <a:extLst>
+                        <a:ext uri="{28A0092B-C50C-407E-A947-70E740481C1C}">
+                          <a14:useLocalDpi xmlns:a14="http://schemas.microsoft.com/office/drawing/2010/main" val="0"/>
+                        </a:ext>
+                      </a:extLst>
+                    </a:blip>
+                    <a:stretch>
+                      <a:fillRect/>
+                    </a:stretch>
+                  </pic:blipFill>
+                  <pic:spPr>
+                    <a:xfrm>
+                      <a:off x="0" y="0"/>
+                      <a:ext cx="1371600" cy="1386840"/>
+                    </a:xfrm>
+                    <a:prstGeom prst="rect">
+                      <a:avLst/>
+                    </a:prstGeom>
+                  </pic:spPr>
+                </pic:pic>
+              </a:graphicData>
+            </a:graphic>
+          </wp:anchor>
+        </w:drawing>
+      </w:r>
+      <w:r>
+        <w:rPr>
           <w:rFonts w:cstheme="minorHAnsi"/>
         </w:rPr>
         <w:t>Some students said that they usually do not report these problems because they are not sure whom they should contact. Because of this, they often ignore the issue and continue with their work.</w:t>
@@ -1122,7 +1934,6 @@
         <w:rPr>
           <w:rFonts w:cstheme="minorHAnsi"/>
         </w:rPr>
-        <w:lastRenderedPageBreak/>
         <w:t>One important concern was injured or harmed animals. Students mentioned that they have seen animals on roads that appeared injured, but they were not sure which person or organization could help them.</w:t>
       </w:r>
     </w:p>
@@ -1146,7 +1957,21 @@
         <w:rPr>
           <w:rFonts w:cstheme="minorHAnsi"/>
         </w:rPr>
-        <w:t>Students also felt that taking a photograph would make the complaint more clear. They said that adding the exact location would make it easier for the concerned person to find the problem.</w:t>
+        <w:t xml:space="preserve">Students also felt that taking a photograph would make the complaint </w:t>
+      </w:r>
+      <w:proofErr w:type="gramStart"/>
+      <w:r>
+        <w:rPr>
+          <w:rFonts w:cstheme="minorHAnsi"/>
+        </w:rPr>
+        <w:t>more clear</w:t>
+      </w:r>
+      <w:proofErr w:type="gramEnd"/>
+      <w:r>
+        <w:rPr>
+          <w:rFonts w:cstheme="minorHAnsi"/>
+        </w:rPr>
+        <w:t>. They said that adding the exact location would make it easier for the concerned person to find the problem.</w:t>
       </w:r>
     </w:p>
     <w:p>
@@ -1169,6 +1994,7 @@
         <w:rPr>
           <w:rFonts w:cstheme="minorHAnsi"/>
         </w:rPr>
+        <w:lastRenderedPageBreak/>
         <w:t>Overall, students preferred a system that is quick and easy to use. They also felt that knowing the status of their complaint would make them more interested in using such a platform.</w:t>
       </w:r>
     </w:p>
@@ -1255,6 +2081,76 @@
       </w:pPr>
       <w:r>
         <w:rPr>
+          <w:rFonts w:eastAsia="Times New Roman" w:cstheme="minorHAnsi"/>
+          <w:noProof/>
+          <w:kern w:val="0"/>
+          <w:sz w:val="24"/>
+          <w:szCs w:val="24"/>
+          <w:lang w:eastAsia="en-ID"/>
+        </w:rPr>
+        <w:drawing>
+          <wp:anchor distT="0" distB="0" distL="114300" distR="114300" simplePos="0" relativeHeight="251662336" behindDoc="1" locked="0" layoutInCell="1" allowOverlap="1" wp14:anchorId="73F4AF29" wp14:editId="5EA55846">
+            <wp:simplePos x="0" y="0"/>
+            <wp:positionH relativeFrom="column">
+              <wp:posOffset>3406775</wp:posOffset>
+            </wp:positionH>
+            <wp:positionV relativeFrom="paragraph">
+              <wp:posOffset>2540</wp:posOffset>
+            </wp:positionV>
+            <wp:extent cx="1386840" cy="1356360"/>
+            <wp:effectExtent l="0" t="0" r="3810" b="0"/>
+            <wp:wrapTight wrapText="bothSides">
+              <wp:wrapPolygon edited="0">
+                <wp:start x="0" y="0"/>
+                <wp:lineTo x="0" y="21309"/>
+                <wp:lineTo x="21363" y="21309"/>
+                <wp:lineTo x="21363" y="0"/>
+                <wp:lineTo x="0" y="0"/>
+              </wp:wrapPolygon>
+            </wp:wrapTight>
+            <wp:docPr id="970678570" name="Picture 5"/>
+            <wp:cNvGraphicFramePr>
+              <a:graphicFrameLocks xmlns:a="http://schemas.openxmlformats.org/drawingml/2006/main" noChangeAspect="1"/>
+            </wp:cNvGraphicFramePr>
+            <a:graphic xmlns:a="http://schemas.openxmlformats.org/drawingml/2006/main">
+              <a:graphicData uri="http://schemas.openxmlformats.org/drawingml/2006/picture">
+                <pic:pic xmlns:pic="http://schemas.openxmlformats.org/drawingml/2006/picture">
+                  <pic:nvPicPr>
+                    <pic:cNvPr id="970678570" name="Picture 970678570"/>
+                    <pic:cNvPicPr/>
+                  </pic:nvPicPr>
+                  <pic:blipFill>
+                    <a:blip r:embed="rId12">
+                      <a:extLst>
+                        <a:ext uri="{28A0092B-C50C-407E-A947-70E740481C1C}">
+                          <a14:useLocalDpi xmlns:a14="http://schemas.microsoft.com/office/drawing/2010/main" val="0"/>
+                        </a:ext>
+                      </a:extLst>
+                    </a:blip>
+                    <a:stretch>
+                      <a:fillRect/>
+                    </a:stretch>
+                  </pic:blipFill>
+                  <pic:spPr>
+                    <a:xfrm>
+                      <a:off x="0" y="0"/>
+                      <a:ext cx="1386840" cy="1356360"/>
+                    </a:xfrm>
+                    <a:prstGeom prst="rect">
+                      <a:avLst/>
+                    </a:prstGeom>
+                  </pic:spPr>
+                </pic:pic>
+              </a:graphicData>
+            </a:graphic>
+            <wp14:sizeRelV relativeFrom="margin">
+              <wp14:pctHeight>0</wp14:pctHeight>
+            </wp14:sizeRelV>
+          </wp:anchor>
+        </w:drawing>
+      </w:r>
+      <w:r>
+        <w:rPr>
           <w:rFonts w:cstheme="minorHAnsi"/>
         </w:rPr>
         <w:t>The main reason seemed to be the lack of a simple reporting process. Students often did not know where to report an issue or whether their complaint would actually be considered.</w:t>
@@ -1336,6 +2232,7 @@
           <w:u w:val="single"/>
         </w:rPr>
       </w:pPr>
+      <w:proofErr w:type="gramStart"/>
       <w:r>
         <w:rPr>
           <w:rFonts w:cstheme="minorHAnsi"/>
@@ -1345,7 +2242,19 @@
           <w:szCs w:val="28"/>
           <w:u w:val="single"/>
         </w:rPr>
-        <w:t>Pain  Points:</w:t>
+        <w:t>Pain  Points</w:t>
+      </w:r>
+      <w:proofErr w:type="gramEnd"/>
+      <w:r>
+        <w:rPr>
+          <w:rFonts w:cstheme="minorHAnsi"/>
+          <w:b/>
+          <w:bCs/>
+          <w:sz w:val="28"/>
+          <w:szCs w:val="28"/>
+          <w:u w:val="single"/>
+        </w:rPr>
+        <w:t>:</w:t>
       </w:r>
     </w:p>
     <w:p>
@@ -1390,6 +2299,74 @@
       <w:r>
         <w:rPr>
           <w:rFonts w:cstheme="minorHAnsi"/>
+          <w:b/>
+          <w:bCs/>
+          <w:noProof/>
+          <w:sz w:val="28"/>
+          <w:szCs w:val="28"/>
+          <w:u w:val="single"/>
+        </w:rPr>
+        <w:drawing>
+          <wp:anchor distT="0" distB="0" distL="114300" distR="114300" simplePos="0" relativeHeight="251663360" behindDoc="1" locked="0" layoutInCell="1" allowOverlap="1" wp14:anchorId="1DECE579" wp14:editId="044B8C73">
+            <wp:simplePos x="0" y="0"/>
+            <wp:positionH relativeFrom="column">
+              <wp:posOffset>3422015</wp:posOffset>
+            </wp:positionH>
+            <wp:positionV relativeFrom="paragraph">
+              <wp:posOffset>329565</wp:posOffset>
+            </wp:positionV>
+            <wp:extent cx="1371600" cy="1371600"/>
+            <wp:effectExtent l="0" t="0" r="0" b="0"/>
+            <wp:wrapTight wrapText="bothSides">
+              <wp:wrapPolygon edited="0">
+                <wp:start x="0" y="0"/>
+                <wp:lineTo x="0" y="21300"/>
+                <wp:lineTo x="21300" y="21300"/>
+                <wp:lineTo x="21300" y="0"/>
+                <wp:lineTo x="0" y="0"/>
+              </wp:wrapPolygon>
+            </wp:wrapTight>
+            <wp:docPr id="2084280134" name="Picture 6"/>
+            <wp:cNvGraphicFramePr>
+              <a:graphicFrameLocks xmlns:a="http://schemas.openxmlformats.org/drawingml/2006/main" noChangeAspect="1"/>
+            </wp:cNvGraphicFramePr>
+            <a:graphic xmlns:a="http://schemas.openxmlformats.org/drawingml/2006/main">
+              <a:graphicData uri="http://schemas.openxmlformats.org/drawingml/2006/picture">
+                <pic:pic xmlns:pic="http://schemas.openxmlformats.org/drawingml/2006/picture">
+                  <pic:nvPicPr>
+                    <pic:cNvPr id="2084280134" name="Picture 2084280134"/>
+                    <pic:cNvPicPr/>
+                  </pic:nvPicPr>
+                  <pic:blipFill>
+                    <a:blip r:embed="rId13">
+                      <a:extLst>
+                        <a:ext uri="{28A0092B-C50C-407E-A947-70E740481C1C}">
+                          <a14:useLocalDpi xmlns:a14="http://schemas.microsoft.com/office/drawing/2010/main" val="0"/>
+                        </a:ext>
+                      </a:extLst>
+                    </a:blip>
+                    <a:stretch>
+                      <a:fillRect/>
+                    </a:stretch>
+                  </pic:blipFill>
+                  <pic:spPr>
+                    <a:xfrm>
+                      <a:off x="0" y="0"/>
+                      <a:ext cx="1371600" cy="1371600"/>
+                    </a:xfrm>
+                    <a:prstGeom prst="rect">
+                      <a:avLst/>
+                    </a:prstGeom>
+                  </pic:spPr>
+                </pic:pic>
+              </a:graphicData>
+            </a:graphic>
+          </wp:anchor>
+        </w:drawing>
+      </w:r>
+      <w:r>
+        <w:rPr>
+          <w:rFonts w:cstheme="minorHAnsi"/>
         </w:rPr>
         <w:t xml:space="preserve">Another problem is that students are often unsure about </w:t>
       </w:r>
@@ -1475,6 +2452,62 @@
         </w:rPr>
         <w:t>Students also do not always know what happens after they report an issue. They would prefer to see whether their complaint is being reviewed or resolved.</w:t>
       </w:r>
+    </w:p>
+    <w:p>
+      <w:pPr>
+        <w:pStyle w:val="ListParagraph"/>
+        <w:ind w:left="360"/>
+        <w:rPr>
+          <w:rFonts w:cstheme="minorHAnsi"/>
+          <w:b/>
+          <w:bCs/>
+          <w:sz w:val="28"/>
+          <w:szCs w:val="28"/>
+          <w:u w:val="single"/>
+        </w:rPr>
+      </w:pPr>
+    </w:p>
+    <w:p>
+      <w:pPr>
+        <w:pStyle w:val="ListParagraph"/>
+        <w:ind w:left="360"/>
+        <w:rPr>
+          <w:rFonts w:cstheme="minorHAnsi"/>
+          <w:b/>
+          <w:bCs/>
+          <w:sz w:val="28"/>
+          <w:szCs w:val="28"/>
+          <w:u w:val="single"/>
+        </w:rPr>
+      </w:pPr>
+    </w:p>
+    <w:p>
+      <w:pPr>
+        <w:pStyle w:val="ListParagraph"/>
+        <w:ind w:left="360"/>
+        <w:rPr>
+          <w:rFonts w:cstheme="minorHAnsi"/>
+          <w:b/>
+          <w:bCs/>
+          <w:sz w:val="28"/>
+          <w:szCs w:val="28"/>
+          <w:u w:val="single"/>
+        </w:rPr>
+      </w:pPr>
+    </w:p>
+    <w:p>
+      <w:pPr>
+        <w:pStyle w:val="ListParagraph"/>
+        <w:ind w:left="360"/>
+        <w:rPr>
+          <w:rFonts w:cstheme="minorHAnsi"/>
+          <w:b/>
+          <w:bCs/>
+          <w:sz w:val="28"/>
+          <w:szCs w:val="28"/>
+          <w:u w:val="single"/>
+        </w:rPr>
+      </w:pPr>
     </w:p>
     <w:p>
       <w:pPr>
@@ -1581,6 +2614,73 @@
       <w:r>
         <w:rPr>
           <w:rFonts w:eastAsia="Times New Roman" w:cstheme="minorHAnsi"/>
+          <w:noProof/>
+          <w:kern w:val="0"/>
+          <w:sz w:val="24"/>
+          <w:szCs w:val="24"/>
+          <w:lang w:eastAsia="en-ID"/>
+        </w:rPr>
+        <w:drawing>
+          <wp:anchor distT="0" distB="0" distL="114300" distR="114300" simplePos="0" relativeHeight="251661312" behindDoc="1" locked="0" layoutInCell="1" allowOverlap="1" wp14:anchorId="444A94D1" wp14:editId="06E28CEC">
+            <wp:simplePos x="0" y="0"/>
+            <wp:positionH relativeFrom="column">
+              <wp:posOffset>3185795</wp:posOffset>
+            </wp:positionH>
+            <wp:positionV relativeFrom="paragraph">
+              <wp:posOffset>307340</wp:posOffset>
+            </wp:positionV>
+            <wp:extent cx="1486029" cy="1394581"/>
+            <wp:effectExtent l="0" t="0" r="0" b="0"/>
+            <wp:wrapTight wrapText="bothSides">
+              <wp:wrapPolygon edited="0">
+                <wp:start x="0" y="0"/>
+                <wp:lineTo x="0" y="21246"/>
+                <wp:lineTo x="21323" y="21246"/>
+                <wp:lineTo x="21323" y="0"/>
+                <wp:lineTo x="0" y="0"/>
+              </wp:wrapPolygon>
+            </wp:wrapTight>
+            <wp:docPr id="2100040957" name="Picture 4"/>
+            <wp:cNvGraphicFramePr>
+              <a:graphicFrameLocks xmlns:a="http://schemas.openxmlformats.org/drawingml/2006/main" noChangeAspect="1"/>
+            </wp:cNvGraphicFramePr>
+            <a:graphic xmlns:a="http://schemas.openxmlformats.org/drawingml/2006/main">
+              <a:graphicData uri="http://schemas.openxmlformats.org/drawingml/2006/picture">
+                <pic:pic xmlns:pic="http://schemas.openxmlformats.org/drawingml/2006/picture">
+                  <pic:nvPicPr>
+                    <pic:cNvPr id="2100040957" name="Picture 2100040957"/>
+                    <pic:cNvPicPr/>
+                  </pic:nvPicPr>
+                  <pic:blipFill>
+                    <a:blip r:embed="rId14">
+                      <a:extLst>
+                        <a:ext uri="{28A0092B-C50C-407E-A947-70E740481C1C}">
+                          <a14:useLocalDpi xmlns:a14="http://schemas.microsoft.com/office/drawing/2010/main" val="0"/>
+                        </a:ext>
+                      </a:extLst>
+                    </a:blip>
+                    <a:stretch>
+                      <a:fillRect/>
+                    </a:stretch>
+                  </pic:blipFill>
+                  <pic:spPr>
+                    <a:xfrm>
+                      <a:off x="0" y="0"/>
+                      <a:ext cx="1486029" cy="1394581"/>
+                    </a:xfrm>
+                    <a:prstGeom prst="rect">
+                      <a:avLst/>
+                    </a:prstGeom>
+                  </pic:spPr>
+                </pic:pic>
+              </a:graphicData>
+            </a:graphic>
+          </wp:anchor>
+        </w:drawing>
+      </w:r>
+      <w:r>
+        <w:rPr>
+          <w:rFonts w:eastAsia="Times New Roman" w:cstheme="minorHAnsi"/>
           <w:kern w:val="0"/>
           <w:sz w:val="24"/>
           <w:szCs w:val="24"/>
@@ -1723,22 +2823,77 @@
       <w:r>
         <w:rPr>
           <w:rFonts w:eastAsia="Times New Roman" w:cstheme="minorHAnsi"/>
+          <w:noProof/>
           <w:kern w:val="0"/>
           <w:sz w:val="24"/>
           <w:szCs w:val="24"/>
           <w:lang w:eastAsia="en-ID"/>
-          <w14:ligatures w14:val="none"/>
-        </w:rPr>
-        <w:t xml:space="preserve">The seriousness of an issue can affect how students respond to it. Issues such as injured animals or situations that may cause immediate harm may need a faster response than regular environmental complaints. </w:t>
-      </w:r>
-    </w:p>
-    <w:p>
-      <w:pPr>
-        <w:numPr>
-          <w:ilvl w:val="0"/>
-          <w:numId w:val="14"/>
-        </w:numPr>
-        <w:spacing w:before="100" w:beforeAutospacing="1" w:after="100" w:afterAutospacing="1" w:line="240" w:lineRule="auto"/>
+        </w:rPr>
+        <w:drawing>
+          <wp:anchor distT="0" distB="0" distL="114300" distR="114300" simplePos="0" relativeHeight="251660288" behindDoc="1" locked="0" layoutInCell="1" allowOverlap="1" wp14:anchorId="0C7C9781" wp14:editId="3A058B89">
+            <wp:simplePos x="0" y="0"/>
+            <wp:positionH relativeFrom="column">
+              <wp:posOffset>3566795</wp:posOffset>
+            </wp:positionH>
+            <wp:positionV relativeFrom="paragraph">
+              <wp:posOffset>71120</wp:posOffset>
+            </wp:positionV>
+            <wp:extent cx="1318260" cy="1180465"/>
+            <wp:effectExtent l="0" t="0" r="0" b="635"/>
+            <wp:wrapTight wrapText="bothSides">
+              <wp:wrapPolygon edited="0">
+                <wp:start x="0" y="0"/>
+                <wp:lineTo x="0" y="21263"/>
+                <wp:lineTo x="21225" y="21263"/>
+                <wp:lineTo x="21225" y="0"/>
+                <wp:lineTo x="0" y="0"/>
+              </wp:wrapPolygon>
+            </wp:wrapTight>
+            <wp:docPr id="1105527388" name="Picture 3"/>
+            <wp:cNvGraphicFramePr>
+              <a:graphicFrameLocks xmlns:a="http://schemas.openxmlformats.org/drawingml/2006/main" noChangeAspect="1"/>
+            </wp:cNvGraphicFramePr>
+            <a:graphic xmlns:a="http://schemas.openxmlformats.org/drawingml/2006/main">
+              <a:graphicData uri="http://schemas.openxmlformats.org/drawingml/2006/picture">
+                <pic:pic xmlns:pic="http://schemas.openxmlformats.org/drawingml/2006/picture">
+                  <pic:nvPicPr>
+                    <pic:cNvPr id="1105527388" name="Picture 1105527388"/>
+                    <pic:cNvPicPr/>
+                  </pic:nvPicPr>
+                  <pic:blipFill>
+                    <a:blip r:embed="rId15" cstate="print">
+                      <a:extLst>
+                        <a:ext uri="{28A0092B-C50C-407E-A947-70E740481C1C}">
+                          <a14:useLocalDpi xmlns:a14="http://schemas.microsoft.com/office/drawing/2010/main" val="0"/>
+                        </a:ext>
+                      </a:extLst>
+                    </a:blip>
+                    <a:stretch>
+                      <a:fillRect/>
+                    </a:stretch>
+                  </pic:blipFill>
+                  <pic:spPr>
+                    <a:xfrm>
+                      <a:off x="0" y="0"/>
+                      <a:ext cx="1318260" cy="1180465"/>
+                    </a:xfrm>
+                    <a:prstGeom prst="rect">
+                      <a:avLst/>
+                    </a:prstGeom>
+                  </pic:spPr>
+                </pic:pic>
+              </a:graphicData>
+            </a:graphic>
+            <wp14:sizeRelH relativeFrom="margin">
+              <wp14:pctWidth>0</wp14:pctWidth>
+            </wp14:sizeRelH>
+            <wp14:sizeRelV relativeFrom="margin">
+              <wp14:pctHeight>0</wp14:pctHeight>
+            </wp14:sizeRelV>
+          </wp:anchor>
+        </w:drawing>
+      </w:r>
+      <w:r>
         <w:rPr>
           <w:rFonts w:eastAsia="Times New Roman" w:cstheme="minorHAnsi"/>
           <w:kern w:val="0"/>
@@ -1747,8 +2902,16 @@
           <w:lang w:eastAsia="en-ID"/>
           <w14:ligatures w14:val="none"/>
         </w:rPr>
-      </w:pPr>
-      <w:r>
+        <w:t xml:space="preserve">The seriousness of an issue can affect how students respond to it. Issues such as injured animals or situations that may cause immediate harm may need a faster response than regular environmental complaints. </w:t>
+      </w:r>
+    </w:p>
+    <w:p>
+      <w:pPr>
+        <w:numPr>
+          <w:ilvl w:val="0"/>
+          <w:numId w:val="14"/>
+        </w:numPr>
+        <w:spacing w:before="100" w:beforeAutospacing="1" w:after="100" w:afterAutospacing="1" w:line="240" w:lineRule="auto"/>
         <w:rPr>
           <w:rFonts w:eastAsia="Times New Roman" w:cstheme="minorHAnsi"/>
           <w:kern w:val="0"/>
@@ -1757,177 +2920,18 @@
           <w:lang w:eastAsia="en-ID"/>
           <w14:ligatures w14:val="none"/>
         </w:rPr>
+      </w:pPr>
+      <w:r>
+        <w:rPr>
+          <w:rFonts w:eastAsia="Times New Roman" w:cstheme="minorHAnsi"/>
+          <w:kern w:val="0"/>
+          <w:sz w:val="24"/>
+          <w:szCs w:val="24"/>
+          <w:lang w:eastAsia="en-ID"/>
+          <w14:ligatures w14:val="none"/>
+        </w:rPr>
         <w:t xml:space="preserve">Students are more likely to report issues when they feel their report can lead to actual action. Knowing that the report will reach the right person or department can encourage them to participate. </w:t>
       </w:r>
-    </w:p>
-    <w:p>
-      <w:pPr>
-        <w:pStyle w:val="ListParagraph"/>
-        <w:rPr>
-          <w:rFonts w:cstheme="minorHAnsi"/>
-          <w:b/>
-          <w:bCs/>
-          <w:sz w:val="28"/>
-          <w:szCs w:val="28"/>
-          <w:u w:val="single"/>
-        </w:rPr>
-      </w:pPr>
-    </w:p>
-    <w:p>
-      <w:pPr>
-        <w:pStyle w:val="ListParagraph"/>
-        <w:rPr>
-          <w:rFonts w:cstheme="minorHAnsi"/>
-          <w:b/>
-          <w:bCs/>
-          <w:sz w:val="28"/>
-          <w:szCs w:val="28"/>
-          <w:u w:val="single"/>
-        </w:rPr>
-      </w:pPr>
-    </w:p>
-    <w:p>
-      <w:pPr>
-        <w:pStyle w:val="ListParagraph"/>
-        <w:rPr>
-          <w:rFonts w:cstheme="minorHAnsi"/>
-          <w:b/>
-          <w:bCs/>
-          <w:sz w:val="28"/>
-          <w:szCs w:val="28"/>
-          <w:u w:val="single"/>
-        </w:rPr>
-      </w:pPr>
-    </w:p>
-    <w:p>
-      <w:pPr>
-        <w:pStyle w:val="ListParagraph"/>
-        <w:rPr>
-          <w:rFonts w:cstheme="minorHAnsi"/>
-          <w:b/>
-          <w:bCs/>
-          <w:sz w:val="28"/>
-          <w:szCs w:val="28"/>
-          <w:u w:val="single"/>
-        </w:rPr>
-      </w:pPr>
-    </w:p>
-    <w:p>
-      <w:pPr>
-        <w:pStyle w:val="ListParagraph"/>
-        <w:rPr>
-          <w:rFonts w:cstheme="minorHAnsi"/>
-          <w:b/>
-          <w:bCs/>
-          <w:sz w:val="28"/>
-          <w:szCs w:val="28"/>
-          <w:u w:val="single"/>
-        </w:rPr>
-      </w:pPr>
-    </w:p>
-    <w:p>
-      <w:pPr>
-        <w:pStyle w:val="ListParagraph"/>
-        <w:rPr>
-          <w:rFonts w:cstheme="minorHAnsi"/>
-          <w:b/>
-          <w:bCs/>
-          <w:sz w:val="28"/>
-          <w:szCs w:val="28"/>
-          <w:u w:val="single"/>
-        </w:rPr>
-      </w:pPr>
-    </w:p>
-    <w:p>
-      <w:pPr>
-        <w:pStyle w:val="ListParagraph"/>
-        <w:rPr>
-          <w:rFonts w:cstheme="minorHAnsi"/>
-          <w:b/>
-          <w:bCs/>
-          <w:sz w:val="28"/>
-          <w:szCs w:val="28"/>
-          <w:u w:val="single"/>
-        </w:rPr>
-      </w:pPr>
-    </w:p>
-    <w:p>
-      <w:pPr>
-        <w:pStyle w:val="ListParagraph"/>
-        <w:rPr>
-          <w:rFonts w:cstheme="minorHAnsi"/>
-          <w:b/>
-          <w:bCs/>
-          <w:sz w:val="28"/>
-          <w:szCs w:val="28"/>
-          <w:u w:val="single"/>
-        </w:rPr>
-      </w:pPr>
-    </w:p>
-    <w:p>
-      <w:pPr>
-        <w:pStyle w:val="ListParagraph"/>
-        <w:rPr>
-          <w:rFonts w:cstheme="minorHAnsi"/>
-          <w:b/>
-          <w:bCs/>
-          <w:sz w:val="28"/>
-          <w:szCs w:val="28"/>
-          <w:u w:val="single"/>
-        </w:rPr>
-      </w:pPr>
-    </w:p>
-    <w:p>
-      <w:pPr>
-        <w:pStyle w:val="ListParagraph"/>
-        <w:rPr>
-          <w:rFonts w:cstheme="minorHAnsi"/>
-          <w:b/>
-          <w:bCs/>
-          <w:sz w:val="28"/>
-          <w:szCs w:val="28"/>
-          <w:u w:val="single"/>
-        </w:rPr>
-      </w:pPr>
-    </w:p>
-    <w:p>
-      <w:pPr>
-        <w:pStyle w:val="ListParagraph"/>
-        <w:rPr>
-          <w:rFonts w:cstheme="minorHAnsi"/>
-          <w:b/>
-          <w:bCs/>
-          <w:sz w:val="28"/>
-          <w:szCs w:val="28"/>
-          <w:u w:val="single"/>
-        </w:rPr>
-      </w:pPr>
-    </w:p>
-    <w:p>
-      <w:pPr>
-        <w:pStyle w:val="ListParagraph"/>
-        <w:rPr>
-          <w:rFonts w:cstheme="minorHAnsi"/>
-          <w:b/>
-          <w:bCs/>
-          <w:sz w:val="28"/>
-          <w:szCs w:val="28"/>
-          <w:u w:val="single"/>
-        </w:rPr>
-      </w:pPr>
-    </w:p>
-    <w:p>
-      <w:pPr>
-        <w:pStyle w:val="ListParagraph"/>
-        <w:rPr>
-          <w:rFonts w:cstheme="minorHAnsi"/>
-          <w:b/>
-          <w:bCs/>
-          <w:sz w:val="28"/>
-          <w:szCs w:val="28"/>
-          <w:u w:val="single"/>
-        </w:rPr>
-      </w:pPr>
     </w:p>
     <w:p>
       <w:pPr>
@@ -1981,7 +2985,6 @@
           <w:szCs w:val="28"/>
           <w:u w:val="single"/>
         </w:rPr>
-        <w:lastRenderedPageBreak/>
         <w:t>Photographic Evidence:</w:t>
       </w:r>
       <w:r>
@@ -2011,21 +3014,6 @@
           <w:u w:val="single"/>
         </w:rPr>
       </w:pPr>
-    </w:p>
-    <w:p>
-      <w:pPr>
-        <w:pStyle w:val="ListParagraph"/>
-        <w:spacing w:after="0"/>
-        <w:ind w:left="360"/>
-        <w:rPr>
-          <w:rFonts w:cstheme="minorHAnsi"/>
-          <w:b/>
-          <w:bCs/>
-          <w:sz w:val="28"/>
-          <w:szCs w:val="28"/>
-          <w:u w:val="single"/>
-        </w:rPr>
-      </w:pPr>
       <w:r>
         <w:rPr>
           <w:rFonts w:cstheme="minorHAnsi"/>
@@ -2034,8 +3022,8 @@
           <w:noProof/>
           <w:sz w:val="28"/>
           <w:szCs w:val="28"/>
-          <w:u w:val="single"/>
-        </w:rPr>
+        </w:rPr>
+        <w:lastRenderedPageBreak/>
         <w:drawing>
           <wp:inline distT="0" distB="0" distL="0" distR="0" wp14:anchorId="4D26394A" wp14:editId="52FA0E0D">
             <wp:extent cx="4702805" cy="6270171"/>
@@ -2052,7 +3040,7 @@
                     <pic:cNvPicPr/>
                   </pic:nvPicPr>
                   <pic:blipFill>
-                    <a:blip r:embed="rId5" cstate="print">
+                    <a:blip r:embed="rId16" cstate="print">
                       <a:extLst>
                         <a:ext uri="{28A0092B-C50C-407E-A947-70E740481C1C}">
                           <a14:useLocalDpi xmlns:a14="http://schemas.microsoft.com/office/drawing/2010/main" val="0"/>
@@ -2098,7 +3086,6 @@
           <w:noProof/>
           <w:sz w:val="28"/>
           <w:szCs w:val="28"/>
-          <w:u w:val="single"/>
         </w:rPr>
         <w:lastRenderedPageBreak/>
         <w:drawing>
@@ -2117,7 +3104,7 @@
                     <pic:cNvPicPr/>
                   </pic:nvPicPr>
                   <pic:blipFill>
-                    <a:blip r:embed="rId6" cstate="print">
+                    <a:blip r:embed="rId17" cstate="print">
                       <a:extLst>
                         <a:ext uri="{28A0092B-C50C-407E-A947-70E740481C1C}">
                           <a14:useLocalDpi xmlns:a14="http://schemas.microsoft.com/office/drawing/2010/main" val="0"/>
@@ -2182,7 +3169,7 @@
                     <pic:cNvPicPr/>
                   </pic:nvPicPr>
                   <pic:blipFill>
-                    <a:blip r:embed="rId7" cstate="print">
+                    <a:blip r:embed="rId18" cstate="print">
                       <a:extLst>
                         <a:ext uri="{28A0092B-C50C-407E-A947-70E740481C1C}">
                           <a14:useLocalDpi xmlns:a14="http://schemas.microsoft.com/office/drawing/2010/main" val="0"/>
@@ -2247,7 +3234,7 @@
                     <pic:cNvPicPr/>
                   </pic:nvPicPr>
                   <pic:blipFill>
-                    <a:blip r:embed="rId8">
+                    <a:blip r:embed="rId19">
                       <a:extLst>
                         <a:ext uri="{28A0092B-C50C-407E-A947-70E740481C1C}">
                           <a14:useLocalDpi xmlns:a14="http://schemas.microsoft.com/office/drawing/2010/main" val="0"/>
@@ -2312,7 +3299,7 @@
                     <pic:cNvPicPr/>
                   </pic:nvPicPr>
                   <pic:blipFill>
-                    <a:blip r:embed="rId9">
+                    <a:blip r:embed="rId20">
                       <a:extLst>
                         <a:ext uri="{28A0092B-C50C-407E-A947-70E740481C1C}">
                           <a14:useLocalDpi xmlns:a14="http://schemas.microsoft.com/office/drawing/2010/main" val="0"/>
@@ -2672,7 +3659,7 @@
               </w:rPr>
               <w:t>Mainly designed for city-level civic complaints rather than campus-specific issues. (</w:t>
             </w:r>
-            <w:hyperlink r:id="rId10" w:tooltip="Swachhata-MoHUA - Apps on Google Play" w:history="1">
+            <w:hyperlink r:id="rId21" w:tooltip="Swachhata-MoHUA - Apps on Google Play" w:history="1">
               <w:r>
                 <w:rPr>
                   <w:rStyle w:val="Hyperlink"/>
@@ -2774,7 +3761,7 @@
               </w:rPr>
               <w:t>Broad community focus; not specifically designed around student/campus reporting. (</w:t>
             </w:r>
-            <w:hyperlink r:id="rId11" w:tooltip="How do I send a report? | Snap Send Solve Help Centre" w:history="1">
+            <w:hyperlink r:id="rId22" w:tooltip="How do I send a report? | Snap Send Solve Help Centre" w:history="1">
               <w:r>
                 <w:rPr>
                   <w:rStyle w:val="Hyperlink"/>
@@ -2965,7 +3952,7 @@
               </w:rPr>
               <w:t>Focuses specifically on animal rescue and does not cover other environmental issues. (</w:t>
             </w:r>
-            <w:hyperlink r:id="rId12" w:tooltip="SARRP INDIA - Apps on Google Play" w:history="1">
+            <w:hyperlink r:id="rId23" w:tooltip="SARRP INDIA - Apps on Google Play" w:history="1">
               <w:r>
                 <w:rPr>
                   <w:rStyle w:val="Hyperlink"/>
@@ -3004,6 +3991,79 @@
       <w:r>
         <w:rPr>
           <w:rFonts w:eastAsia="Times New Roman" w:cstheme="minorHAnsi"/>
+          <w:noProof/>
+          <w:kern w:val="0"/>
+          <w:sz w:val="24"/>
+          <w:szCs w:val="24"/>
+          <w:lang w:eastAsia="en-ID"/>
+        </w:rPr>
+        <w:drawing>
+          <wp:anchor distT="0" distB="0" distL="114300" distR="114300" simplePos="0" relativeHeight="251664384" behindDoc="1" locked="0" layoutInCell="1" allowOverlap="1" wp14:anchorId="3BFD2F07" wp14:editId="44CAB443">
+            <wp:simplePos x="0" y="0"/>
+            <wp:positionH relativeFrom="column">
+              <wp:posOffset>3086735</wp:posOffset>
+            </wp:positionH>
+            <wp:positionV relativeFrom="paragraph">
+              <wp:posOffset>367665</wp:posOffset>
+            </wp:positionV>
+            <wp:extent cx="1864995" cy="2057400"/>
+            <wp:effectExtent l="0" t="0" r="1905" b="0"/>
+            <wp:wrapTight wrapText="bothSides">
+              <wp:wrapPolygon edited="0">
+                <wp:start x="0" y="0"/>
+                <wp:lineTo x="0" y="21400"/>
+                <wp:lineTo x="21401" y="21400"/>
+                <wp:lineTo x="21401" y="0"/>
+                <wp:lineTo x="0" y="0"/>
+              </wp:wrapPolygon>
+            </wp:wrapTight>
+            <wp:docPr id="1548129009" name="Picture 7"/>
+            <wp:cNvGraphicFramePr>
+              <a:graphicFrameLocks xmlns:a="http://schemas.openxmlformats.org/drawingml/2006/main" noChangeAspect="1"/>
+            </wp:cNvGraphicFramePr>
+            <a:graphic xmlns:a="http://schemas.openxmlformats.org/drawingml/2006/main">
+              <a:graphicData uri="http://schemas.openxmlformats.org/drawingml/2006/picture">
+                <pic:pic xmlns:pic="http://schemas.openxmlformats.org/drawingml/2006/picture">
+                  <pic:nvPicPr>
+                    <pic:cNvPr id="1548129009" name="Picture 1548129009"/>
+                    <pic:cNvPicPr/>
+                  </pic:nvPicPr>
+                  <pic:blipFill>
+                    <a:blip r:embed="rId24">
+                      <a:extLst>
+                        <a:ext uri="{28A0092B-C50C-407E-A947-70E740481C1C}">
+                          <a14:useLocalDpi xmlns:a14="http://schemas.microsoft.com/office/drawing/2010/main" val="0"/>
+                        </a:ext>
+                      </a:extLst>
+                    </a:blip>
+                    <a:stretch>
+                      <a:fillRect/>
+                    </a:stretch>
+                  </pic:blipFill>
+                  <pic:spPr>
+                    <a:xfrm>
+                      <a:off x="0" y="0"/>
+                      <a:ext cx="1864995" cy="2057400"/>
+                    </a:xfrm>
+                    <a:prstGeom prst="rect">
+                      <a:avLst/>
+                    </a:prstGeom>
+                  </pic:spPr>
+                </pic:pic>
+              </a:graphicData>
+            </a:graphic>
+            <wp14:sizeRelH relativeFrom="margin">
+              <wp14:pctWidth>0</wp14:pctWidth>
+            </wp14:sizeRelH>
+            <wp14:sizeRelV relativeFrom="margin">
+              <wp14:pctHeight>0</wp14:pctHeight>
+            </wp14:sizeRelV>
+          </wp:anchor>
+        </w:drawing>
+      </w:r>
+      <w:r>
+        <w:rPr>
+          <w:rFonts w:eastAsia="Times New Roman" w:cstheme="minorHAnsi"/>
           <w:b/>
           <w:bCs/>
           <w:kern w:val="0"/>
@@ -3037,8 +4097,22 @@
           <w:lang w:eastAsia="en-ID"/>
           <w14:ligatures w14:val="none"/>
         </w:rPr>
-        <w:t>Existing platforms show that photo + exact location + issue category can make reporting easier and more useful for authorities. Platforms such as Swachhata-MoHUA and Snap Send Solve also show the importance of giving users feedback about what happens aft</w:t>
-      </w:r>
+        <w:t xml:space="preserve">Existing platforms show that photo + exact location + issue category can make reporting easier and more useful for authorities. Platforms such as Swachhata-MoHUA and Snap Send Solve also show the importance of giving users feedback about what happens after a complaint is submitted. </w:t>
+      </w:r>
+    </w:p>
+    <w:p>
+      <w:pPr>
+        <w:spacing w:after="100" w:afterAutospacing="1" w:line="240" w:lineRule="auto"/>
+        <w:ind w:left="360"/>
+        <w:rPr>
+          <w:rFonts w:eastAsia="Times New Roman" w:cstheme="minorHAnsi"/>
+          <w:noProof/>
+          <w:kern w:val="0"/>
+          <w:sz w:val="24"/>
+          <w:szCs w:val="24"/>
+          <w:lang w:eastAsia="en-ID"/>
+        </w:rPr>
+      </w:pPr>
       <w:r>
         <w:rPr>
           <w:rFonts w:eastAsia="Times New Roman" w:cstheme="minorHAnsi"/>
@@ -3048,9 +4122,24 @@
           <w:lang w:eastAsia="en-ID"/>
           <w14:ligatures w14:val="none"/>
         </w:rPr>
-        <w:t>e</w:t>
-      </w:r>
-      <w:r>
+        <w:t>However, there is a gap between these systems and our target users. Most are designed for general citizens, cities, or specific organisations, rather than college students reporting problems within their campus.</w:t>
+      </w:r>
+      <w:r>
+        <w:rPr>
+          <w:rFonts w:eastAsia="Times New Roman" w:cstheme="minorHAnsi"/>
+          <w:noProof/>
+          <w:kern w:val="0"/>
+          <w:sz w:val="24"/>
+          <w:szCs w:val="24"/>
+          <w:lang w:eastAsia="en-ID"/>
+        </w:rPr>
+        <w:t xml:space="preserve"> </w:t>
+      </w:r>
+    </w:p>
+    <w:p>
+      <w:pPr>
+        <w:spacing w:after="100" w:afterAutospacing="1" w:line="240" w:lineRule="auto"/>
+        <w:ind w:left="360"/>
         <w:rPr>
           <w:rFonts w:eastAsia="Times New Roman" w:cstheme="minorHAnsi"/>
           <w:kern w:val="0"/>
@@ -3059,13 +4148,16 @@
           <w:lang w:eastAsia="en-ID"/>
           <w14:ligatures w14:val="none"/>
         </w:rPr>
-        <w:t xml:space="preserve">r a complaint is submitted. </w:t>
-      </w:r>
-    </w:p>
-    <w:p>
-      <w:pPr>
-        <w:spacing w:after="100" w:afterAutospacing="1" w:line="240" w:lineRule="auto"/>
-        <w:ind w:left="360"/>
+      </w:pPr>
+    </w:p>
+    <w:p>
+      <w:pPr>
+        <w:pStyle w:val="ListParagraph"/>
+        <w:numPr>
+          <w:ilvl w:val="0"/>
+          <w:numId w:val="17"/>
+        </w:numPr>
+        <w:spacing w:after="0" w:line="240" w:lineRule="auto"/>
         <w:rPr>
           <w:rFonts w:eastAsia="Times New Roman" w:cstheme="minorHAnsi"/>
           <w:kern w:val="0"/>
@@ -3078,23 +4170,22 @@
       <w:r>
         <w:rPr>
           <w:rFonts w:eastAsia="Times New Roman" w:cstheme="minorHAnsi"/>
+          <w:b/>
+          <w:bCs/>
           <w:kern w:val="0"/>
-          <w:sz w:val="24"/>
-          <w:szCs w:val="24"/>
+          <w:sz w:val="27"/>
+          <w:szCs w:val="27"/>
           <w:lang w:eastAsia="en-ID"/>
           <w14:ligatures w14:val="none"/>
         </w:rPr>
-        <w:t>However, there is a gap between these systems and our target users. Most are designed for general citizens, cities, or specific organisations, rather than college students reporting problems within their campus.</w:t>
-      </w:r>
-    </w:p>
-    <w:p>
-      <w:pPr>
-        <w:pStyle w:val="ListParagraph"/>
-        <w:numPr>
-          <w:ilvl w:val="0"/>
-          <w:numId w:val="17"/>
-        </w:numPr>
-        <w:spacing w:after="0" w:line="240" w:lineRule="auto"/>
+        <w:lastRenderedPageBreak/>
+        <w:t>Design Opportunity</w:t>
+      </w:r>
+    </w:p>
+    <w:p>
+      <w:pPr>
+        <w:spacing w:after="100" w:afterAutospacing="1" w:line="240" w:lineRule="auto"/>
+        <w:ind w:left="360"/>
         <w:rPr>
           <w:rFonts w:eastAsia="Times New Roman" w:cstheme="minorHAnsi"/>
           <w:kern w:val="0"/>
@@ -3107,52 +4198,13 @@
       <w:r>
         <w:rPr>
           <w:rFonts w:eastAsia="Times New Roman" w:cstheme="minorHAnsi"/>
-          <w:b/>
-          <w:bCs/>
-          <w:kern w:val="0"/>
-          <w:sz w:val="27"/>
-          <w:szCs w:val="27"/>
-          <w:lang w:eastAsia="en-ID"/>
-          <w14:ligatures w14:val="none"/>
-        </w:rPr>
-        <w:t>Design Opportunity</w:t>
-      </w:r>
-    </w:p>
-    <w:p>
-      <w:pPr>
-        <w:spacing w:after="100" w:afterAutospacing="1" w:line="240" w:lineRule="auto"/>
-        <w:ind w:left="360"/>
-        <w:rPr>
-          <w:rFonts w:eastAsia="Times New Roman" w:cstheme="minorHAnsi"/>
           <w:kern w:val="0"/>
           <w:sz w:val="24"/>
           <w:szCs w:val="24"/>
           <w:lang w:eastAsia="en-ID"/>
           <w14:ligatures w14:val="none"/>
         </w:rPr>
-      </w:pPr>
-      <w:r>
-        <w:rPr>
-          <w:rFonts w:eastAsia="Times New Roman" w:cstheme="minorHAnsi"/>
-          <w:kern w:val="0"/>
-          <w:sz w:val="24"/>
-          <w:szCs w:val="24"/>
-          <w:lang w:eastAsia="en-ID"/>
-          <w14:ligatures w14:val="none"/>
-        </w:rPr>
-        <w:t xml:space="preserve">Our proposed system can combine the useful features of these platforms into a simple campus-focused environmental reporting system. Students could report issues such as garbage, pollution, water problems, greenery issues and injured/harmed animals, while providing a photo, location and short description. </w:t>
-      </w:r>
-      <w:r>
-        <w:rPr>
-          <w:rFonts w:eastAsia="Times New Roman" w:cstheme="minorHAnsi"/>
-          <w:kern w:val="0"/>
-          <w:sz w:val="24"/>
-          <w:szCs w:val="24"/>
-          <w:lang w:eastAsia="en-ID"/>
-          <w14:ligatures w14:val="none"/>
-        </w:rPr>
-        <w:lastRenderedPageBreak/>
-        <w:t>The system can also show the report status so students know whether action has been taken.</w:t>
+        <w:t>Our proposed system can combine the useful features of these platforms into a simple campus-focused environmental reporting system. Students could report issues such as garbage, pollution, water problems, greenery issues and injured/harmed animals, while providing a photo, location and short description. The system can also show the report status so students know whether action has been taken.</w:t>
       </w:r>
     </w:p>
     <w:p>
@@ -3225,6 +4277,74 @@
       </w:pPr>
       <w:r>
         <w:rPr>
+          <w:rFonts w:cstheme="minorHAnsi"/>
+          <w:b/>
+          <w:bCs/>
+          <w:noProof/>
+          <w:sz w:val="28"/>
+          <w:szCs w:val="28"/>
+          <w:u w:val="single"/>
+        </w:rPr>
+        <w:drawing>
+          <wp:anchor distT="0" distB="0" distL="114300" distR="114300" simplePos="0" relativeHeight="251666432" behindDoc="1" locked="0" layoutInCell="1" allowOverlap="1" wp14:anchorId="048C869B" wp14:editId="2CDD093F">
+            <wp:simplePos x="0" y="0"/>
+            <wp:positionH relativeFrom="column">
+              <wp:posOffset>2553335</wp:posOffset>
+            </wp:positionH>
+            <wp:positionV relativeFrom="paragraph">
+              <wp:posOffset>938530</wp:posOffset>
+            </wp:positionV>
+            <wp:extent cx="2026920" cy="1790700"/>
+            <wp:effectExtent l="0" t="0" r="0" b="0"/>
+            <wp:wrapTight wrapText="bothSides">
+              <wp:wrapPolygon edited="0">
+                <wp:start x="0" y="0"/>
+                <wp:lineTo x="0" y="21370"/>
+                <wp:lineTo x="21316" y="21370"/>
+                <wp:lineTo x="21316" y="0"/>
+                <wp:lineTo x="0" y="0"/>
+              </wp:wrapPolygon>
+            </wp:wrapTight>
+            <wp:docPr id="1757743052" name="Picture 9"/>
+            <wp:cNvGraphicFramePr>
+              <a:graphicFrameLocks xmlns:a="http://schemas.openxmlformats.org/drawingml/2006/main" noChangeAspect="1"/>
+            </wp:cNvGraphicFramePr>
+            <a:graphic xmlns:a="http://schemas.openxmlformats.org/drawingml/2006/main">
+              <a:graphicData uri="http://schemas.openxmlformats.org/drawingml/2006/picture">
+                <pic:pic xmlns:pic="http://schemas.openxmlformats.org/drawingml/2006/picture">
+                  <pic:nvPicPr>
+                    <pic:cNvPr id="1757743052" name="Picture 1757743052"/>
+                    <pic:cNvPicPr/>
+                  </pic:nvPicPr>
+                  <pic:blipFill>
+                    <a:blip r:embed="rId25">
+                      <a:extLst>
+                        <a:ext uri="{28A0092B-C50C-407E-A947-70E740481C1C}">
+                          <a14:useLocalDpi xmlns:a14="http://schemas.microsoft.com/office/drawing/2010/main" val="0"/>
+                        </a:ext>
+                      </a:extLst>
+                    </a:blip>
+                    <a:stretch>
+                      <a:fillRect/>
+                    </a:stretch>
+                  </pic:blipFill>
+                  <pic:spPr>
+                    <a:xfrm>
+                      <a:off x="0" y="0"/>
+                      <a:ext cx="2026920" cy="1790700"/>
+                    </a:xfrm>
+                    <a:prstGeom prst="rect">
+                      <a:avLst/>
+                    </a:prstGeom>
+                  </pic:spPr>
+                </pic:pic>
+              </a:graphicData>
+            </a:graphic>
+          </wp:anchor>
+        </w:drawing>
+      </w:r>
+      <w:r>
+        <w:rPr>
           <w:rStyle w:val="Strong"/>
           <w:rFonts w:asciiTheme="minorHAnsi" w:hAnsiTheme="minorHAnsi" w:cstheme="minorHAnsi"/>
         </w:rPr>
@@ -3323,6 +4443,70 @@
       </w:pPr>
       <w:r>
         <w:rPr>
+          <w:rFonts w:asciiTheme="minorHAnsi" w:hAnsiTheme="minorHAnsi" w:cstheme="minorHAnsi"/>
+          <w:noProof/>
+          <w14:ligatures w14:val="standardContextual"/>
+        </w:rPr>
+        <w:drawing>
+          <wp:anchor distT="0" distB="0" distL="114300" distR="114300" simplePos="0" relativeHeight="251668480" behindDoc="1" locked="0" layoutInCell="1" allowOverlap="1" wp14:anchorId="200ADA09" wp14:editId="186BFC3B">
+            <wp:simplePos x="0" y="0"/>
+            <wp:positionH relativeFrom="column">
+              <wp:posOffset>335915</wp:posOffset>
+            </wp:positionH>
+            <wp:positionV relativeFrom="paragraph">
+              <wp:posOffset>434340</wp:posOffset>
+            </wp:positionV>
+            <wp:extent cx="3330229" cy="1066892"/>
+            <wp:effectExtent l="0" t="0" r="3810" b="0"/>
+            <wp:wrapTight wrapText="bothSides">
+              <wp:wrapPolygon edited="0">
+                <wp:start x="0" y="0"/>
+                <wp:lineTo x="0" y="21214"/>
+                <wp:lineTo x="21501" y="21214"/>
+                <wp:lineTo x="21501" y="0"/>
+                <wp:lineTo x="0" y="0"/>
+              </wp:wrapPolygon>
+            </wp:wrapTight>
+            <wp:docPr id="1792727495" name="Picture 11"/>
+            <wp:cNvGraphicFramePr>
+              <a:graphicFrameLocks xmlns:a="http://schemas.openxmlformats.org/drawingml/2006/main" noChangeAspect="1"/>
+            </wp:cNvGraphicFramePr>
+            <a:graphic xmlns:a="http://schemas.openxmlformats.org/drawingml/2006/main">
+              <a:graphicData uri="http://schemas.openxmlformats.org/drawingml/2006/picture">
+                <pic:pic xmlns:pic="http://schemas.openxmlformats.org/drawingml/2006/picture">
+                  <pic:nvPicPr>
+                    <pic:cNvPr id="1792727495" name="Picture 1792727495"/>
+                    <pic:cNvPicPr/>
+                  </pic:nvPicPr>
+                  <pic:blipFill>
+                    <a:blip r:embed="rId26">
+                      <a:extLst>
+                        <a:ext uri="{28A0092B-C50C-407E-A947-70E740481C1C}">
+                          <a14:useLocalDpi xmlns:a14="http://schemas.microsoft.com/office/drawing/2010/main" val="0"/>
+                        </a:ext>
+                      </a:extLst>
+                    </a:blip>
+                    <a:stretch>
+                      <a:fillRect/>
+                    </a:stretch>
+                  </pic:blipFill>
+                  <pic:spPr>
+                    <a:xfrm>
+                      <a:off x="0" y="0"/>
+                      <a:ext cx="3330229" cy="1066892"/>
+                    </a:xfrm>
+                    <a:prstGeom prst="rect">
+                      <a:avLst/>
+                    </a:prstGeom>
+                  </pic:spPr>
+                </pic:pic>
+              </a:graphicData>
+            </a:graphic>
+          </wp:anchor>
+        </w:drawing>
+      </w:r>
+      <w:r>
+        <w:rPr>
           <w:rStyle w:val="Strong"/>
           <w:rFonts w:asciiTheme="minorHAnsi" w:hAnsiTheme="minorHAnsi" w:cstheme="minorHAnsi"/>
         </w:rPr>
@@ -3389,11 +4573,22 @@
           <w:rFonts w:asciiTheme="minorHAnsi" w:hAnsiTheme="minorHAnsi" w:cstheme="minorHAnsi"/>
         </w:rPr>
       </w:pPr>
+    </w:p>
+    <w:p>
+      <w:pPr>
+        <w:pStyle w:val="NormalWeb"/>
+        <w:spacing w:before="0" w:beforeAutospacing="0" w:after="0" w:afterAutospacing="0"/>
+        <w:ind w:left="360"/>
+        <w:rPr>
+          <w:rFonts w:asciiTheme="minorHAnsi" w:hAnsiTheme="minorHAnsi" w:cstheme="minorHAnsi"/>
+        </w:rPr>
+      </w:pPr>
       <w:r>
         <w:rPr>
           <w:rStyle w:val="Strong"/>
           <w:rFonts w:asciiTheme="minorHAnsi" w:hAnsiTheme="minorHAnsi" w:cstheme="minorHAnsi"/>
         </w:rPr>
+        <w:lastRenderedPageBreak/>
         <w:t>Relevance:</w:t>
       </w:r>
       <w:r>
@@ -3440,7 +4635,77 @@
           <w:rFonts w:asciiTheme="minorHAnsi" w:hAnsiTheme="minorHAnsi" w:cstheme="minorHAnsi"/>
         </w:rPr>
         <w:br/>
-        <w:t xml:space="preserve">Komninos studied a mobile crowdsourcing system used for monitoring beach conditions. The study found that participation was strongly influenced by altruistic motives and that openly sharing collected information could provide benefits to users and public bodies. </w:t>
+        <w:t xml:space="preserve">Komninos studied a mobile crowdsourcing system used for monitoring beach conditions. The study found that participation was strongly influenced by altruistic motives and that openly sharing collected information could provide benefits to users </w:t>
+      </w:r>
+      <w:r>
+        <w:rPr>
+          <w:rFonts w:asciiTheme="minorHAnsi" w:hAnsiTheme="minorHAnsi" w:cstheme="minorHAnsi"/>
+          <w:noProof/>
+          <w14:ligatures w14:val="standardContextual"/>
+        </w:rPr>
+        <w:drawing>
+          <wp:anchor distT="0" distB="0" distL="114300" distR="114300" simplePos="0" relativeHeight="251667456" behindDoc="1" locked="0" layoutInCell="1" allowOverlap="1" wp14:anchorId="6F99E566" wp14:editId="6A763527">
+            <wp:simplePos x="0" y="0"/>
+            <wp:positionH relativeFrom="column">
+              <wp:posOffset>168275</wp:posOffset>
+            </wp:positionH>
+            <wp:positionV relativeFrom="paragraph">
+              <wp:posOffset>400050</wp:posOffset>
+            </wp:positionV>
+            <wp:extent cx="4239260" cy="1322705"/>
+            <wp:effectExtent l="0" t="0" r="8890" b="0"/>
+            <wp:wrapTight wrapText="bothSides">
+              <wp:wrapPolygon edited="0">
+                <wp:start x="0" y="0"/>
+                <wp:lineTo x="0" y="21154"/>
+                <wp:lineTo x="21548" y="21154"/>
+                <wp:lineTo x="21548" y="0"/>
+                <wp:lineTo x="0" y="0"/>
+              </wp:wrapPolygon>
+            </wp:wrapTight>
+            <wp:docPr id="1348874128" name="Picture 10"/>
+            <wp:cNvGraphicFramePr>
+              <a:graphicFrameLocks xmlns:a="http://schemas.openxmlformats.org/drawingml/2006/main" noChangeAspect="1"/>
+            </wp:cNvGraphicFramePr>
+            <a:graphic xmlns:a="http://schemas.openxmlformats.org/drawingml/2006/main">
+              <a:graphicData uri="http://schemas.openxmlformats.org/drawingml/2006/picture">
+                <pic:pic xmlns:pic="http://schemas.openxmlformats.org/drawingml/2006/picture">
+                  <pic:nvPicPr>
+                    <pic:cNvPr id="1348874128" name="Picture 1348874128"/>
+                    <pic:cNvPicPr/>
+                  </pic:nvPicPr>
+                  <pic:blipFill>
+                    <a:blip r:embed="rId27">
+                      <a:extLst>
+                        <a:ext uri="{28A0092B-C50C-407E-A947-70E740481C1C}">
+                          <a14:useLocalDpi xmlns:a14="http://schemas.microsoft.com/office/drawing/2010/main" val="0"/>
+                        </a:ext>
+                      </a:extLst>
+                    </a:blip>
+                    <a:stretch>
+                      <a:fillRect/>
+                    </a:stretch>
+                  </pic:blipFill>
+                  <pic:spPr>
+                    <a:xfrm>
+                      <a:off x="0" y="0"/>
+                      <a:ext cx="4239260" cy="1322705"/>
+                    </a:xfrm>
+                    <a:prstGeom prst="rect">
+                      <a:avLst/>
+                    </a:prstGeom>
+                  </pic:spPr>
+                </pic:pic>
+              </a:graphicData>
+            </a:graphic>
+          </wp:anchor>
+        </w:drawing>
+      </w:r>
+      <w:r>
+        <w:rPr>
+          <w:rFonts w:asciiTheme="minorHAnsi" w:hAnsiTheme="minorHAnsi" w:cstheme="minorHAnsi"/>
+        </w:rPr>
+        <w:t xml:space="preserve">and public bodies. </w:t>
       </w:r>
     </w:p>
     <w:p>
@@ -3519,7 +4784,6 @@
           <w:szCs w:val="32"/>
           <w:u w:val="single"/>
         </w:rPr>
-        <w:lastRenderedPageBreak/>
         <w:t>Survey Images:</w:t>
       </w:r>
     </w:p>
@@ -3560,7 +4824,7 @@
                     <pic:cNvPicPr/>
                   </pic:nvPicPr>
                   <pic:blipFill>
-                    <a:blip r:embed="rId13">
+                    <a:blip r:embed="rId28">
                       <a:extLst>
                         <a:ext uri="{28A0092B-C50C-407E-A947-70E740481C1C}">
                           <a14:useLocalDpi xmlns:a14="http://schemas.microsoft.com/office/drawing/2010/main" val="0"/>
@@ -3624,7 +4888,7 @@
                     <pic:cNvPicPr/>
                   </pic:nvPicPr>
                   <pic:blipFill>
-                    <a:blip r:embed="rId14">
+                    <a:blip r:embed="rId29">
                       <a:extLst>
                         <a:ext uri="{28A0092B-C50C-407E-A947-70E740481C1C}">
                           <a14:useLocalDpi xmlns:a14="http://schemas.microsoft.com/office/drawing/2010/main" val="0"/>
@@ -3672,6 +4936,7 @@
           <w:szCs w:val="32"/>
           <w:u w:val="single"/>
         </w:rPr>
+        <w:lastRenderedPageBreak/>
         <w:drawing>
           <wp:inline distT="0" distB="0" distL="0" distR="0" wp14:anchorId="54B0F989" wp14:editId="478C0EDC">
             <wp:extent cx="4239260" cy="1945005"/>
@@ -3688,7 +4953,7 @@
                     <pic:cNvPicPr/>
                   </pic:nvPicPr>
                   <pic:blipFill>
-                    <a:blip r:embed="rId15">
+                    <a:blip r:embed="rId30">
                       <a:extLst>
                         <a:ext uri="{28A0092B-C50C-407E-A947-70E740481C1C}">
                           <a14:useLocalDpi xmlns:a14="http://schemas.microsoft.com/office/drawing/2010/main" val="0"/>
@@ -3752,7 +5017,7 @@
                     <pic:cNvPicPr/>
                   </pic:nvPicPr>
                   <pic:blipFill>
-                    <a:blip r:embed="rId16">
+                    <a:blip r:embed="rId31">
                       <a:extLst>
                         <a:ext uri="{28A0092B-C50C-407E-A947-70E740481C1C}">
                           <a14:useLocalDpi xmlns:a14="http://schemas.microsoft.com/office/drawing/2010/main" val="0"/>
@@ -3800,7 +5065,6 @@
           <w:szCs w:val="32"/>
           <w:u w:val="single"/>
         </w:rPr>
-        <w:lastRenderedPageBreak/>
         <w:drawing>
           <wp:inline distT="0" distB="0" distL="0" distR="0" wp14:anchorId="17A010C9" wp14:editId="2F4CE9D2">
             <wp:extent cx="4239260" cy="1958340"/>
@@ -3817,7 +5081,7 @@
                     <pic:cNvPicPr/>
                   </pic:nvPicPr>
                   <pic:blipFill>
-                    <a:blip r:embed="rId17">
+                    <a:blip r:embed="rId32">
                       <a:extLst>
                         <a:ext uri="{28A0092B-C50C-407E-A947-70E740481C1C}">
                           <a14:useLocalDpi xmlns:a14="http://schemas.microsoft.com/office/drawing/2010/main" val="0"/>
@@ -3881,7 +5145,7 @@
                     <pic:cNvPicPr/>
                   </pic:nvPicPr>
                   <pic:blipFill>
-                    <a:blip r:embed="rId18">
+                    <a:blip r:embed="rId33">
                       <a:extLst>
                         <a:ext uri="{28A0092B-C50C-407E-A947-70E740481C1C}">
                           <a14:useLocalDpi xmlns:a14="http://schemas.microsoft.com/office/drawing/2010/main" val="0"/>
@@ -3929,6 +5193,7 @@
           <w:szCs w:val="32"/>
           <w:u w:val="single"/>
         </w:rPr>
+        <w:lastRenderedPageBreak/>
         <w:drawing>
           <wp:inline distT="0" distB="0" distL="0" distR="0" wp14:anchorId="6F545235" wp14:editId="2679B38F">
             <wp:extent cx="4239260" cy="1696720"/>
@@ -3945,7 +5210,7 @@
                     <pic:cNvPicPr/>
                   </pic:nvPicPr>
                   <pic:blipFill>
-                    <a:blip r:embed="rId19">
+                    <a:blip r:embed="rId34">
                       <a:extLst>
                         <a:ext uri="{28A0092B-C50C-407E-A947-70E740481C1C}">
                           <a14:useLocalDpi xmlns:a14="http://schemas.microsoft.com/office/drawing/2010/main" val="0"/>
@@ -4009,7 +5274,7 @@
                     <pic:cNvPicPr/>
                   </pic:nvPicPr>
                   <pic:blipFill>
-                    <a:blip r:embed="rId20">
+                    <a:blip r:embed="rId35">
                       <a:extLst>
                         <a:ext uri="{28A0092B-C50C-407E-A947-70E740481C1C}">
                           <a14:useLocalDpi xmlns:a14="http://schemas.microsoft.com/office/drawing/2010/main" val="0"/>
@@ -4057,7 +5322,6 @@
           <w:szCs w:val="32"/>
           <w:u w:val="single"/>
         </w:rPr>
-        <w:lastRenderedPageBreak/>
         <w:drawing>
           <wp:inline distT="0" distB="0" distL="0" distR="0" wp14:anchorId="344C2C48" wp14:editId="259ABFA6">
             <wp:extent cx="4239260" cy="2041525"/>
@@ -4074,7 +5338,7 @@
                     <pic:cNvPicPr/>
                   </pic:nvPicPr>
                   <pic:blipFill>
-                    <a:blip r:embed="rId21">
+                    <a:blip r:embed="rId36">
                       <a:extLst>
                         <a:ext uri="{28A0092B-C50C-407E-A947-70E740481C1C}">
                           <a14:useLocalDpi xmlns:a14="http://schemas.microsoft.com/office/drawing/2010/main" val="0"/>
@@ -4138,7 +5402,7 @@
                     <pic:cNvPicPr/>
                   </pic:nvPicPr>
                   <pic:blipFill>
-                    <a:blip r:embed="rId22">
+                    <a:blip r:embed="rId37">
                       <a:extLst>
                         <a:ext uri="{28A0092B-C50C-407E-A947-70E740481C1C}">
                           <a14:useLocalDpi xmlns:a14="http://schemas.microsoft.com/office/drawing/2010/main" val="0"/>
@@ -4186,6 +5450,7 @@
           <w:szCs w:val="32"/>
           <w:u w:val="single"/>
         </w:rPr>
+        <w:lastRenderedPageBreak/>
         <w:drawing>
           <wp:inline distT="0" distB="0" distL="0" distR="0" wp14:anchorId="4D03CC92" wp14:editId="58DC0648">
             <wp:extent cx="4239260" cy="1875155"/>
@@ -4202,7 +5467,7 @@
                     <pic:cNvPicPr/>
                   </pic:nvPicPr>
                   <pic:blipFill>
-                    <a:blip r:embed="rId23">
+                    <a:blip r:embed="rId38">
                       <a:extLst>
                         <a:ext uri="{28A0092B-C50C-407E-A947-70E740481C1C}">
                           <a14:useLocalDpi xmlns:a14="http://schemas.microsoft.com/office/drawing/2010/main" val="0"/>
@@ -4266,7 +5531,7 @@
                     <pic:cNvPicPr/>
                   </pic:nvPicPr>
                   <pic:blipFill>
-                    <a:blip r:embed="rId24">
+                    <a:blip r:embed="rId39">
                       <a:extLst>
                         <a:ext uri="{28A0092B-C50C-407E-A947-70E740481C1C}">
                           <a14:useLocalDpi xmlns:a14="http://schemas.microsoft.com/office/drawing/2010/main" val="0"/>
@@ -4314,7 +5579,6 @@
           <w:szCs w:val="32"/>
           <w:u w:val="single"/>
         </w:rPr>
-        <w:lastRenderedPageBreak/>
         <w:drawing>
           <wp:inline distT="0" distB="0" distL="0" distR="0" wp14:anchorId="0A0BB10E" wp14:editId="503F4648">
             <wp:extent cx="4239260" cy="2041525"/>
@@ -4331,7 +5595,7 @@
                     <pic:cNvPicPr/>
                   </pic:nvPicPr>
                   <pic:blipFill>
-                    <a:blip r:embed="rId25">
+                    <a:blip r:embed="rId40">
                       <a:extLst>
                         <a:ext uri="{28A0092B-C50C-407E-A947-70E740481C1C}">
                           <a14:useLocalDpi xmlns:a14="http://schemas.microsoft.com/office/drawing/2010/main" val="0"/>
@@ -4395,7 +5659,7 @@
                     <pic:cNvPicPr/>
                   </pic:nvPicPr>
                   <pic:blipFill>
-                    <a:blip r:embed="rId26">
+                    <a:blip r:embed="rId41">
                       <a:extLst>
                         <a:ext uri="{28A0092B-C50C-407E-A947-70E740481C1C}">
                           <a14:useLocalDpi xmlns:a14="http://schemas.microsoft.com/office/drawing/2010/main" val="0"/>
@@ -4443,6 +5707,7 @@
           <w:szCs w:val="32"/>
           <w:u w:val="single"/>
         </w:rPr>
+        <w:lastRenderedPageBreak/>
         <w:drawing>
           <wp:inline distT="0" distB="0" distL="0" distR="0" wp14:anchorId="27500937" wp14:editId="4437C718">
             <wp:extent cx="4239260" cy="1995170"/>
@@ -4459,7 +5724,7 @@
                     <pic:cNvPicPr/>
                   </pic:nvPicPr>
                   <pic:blipFill>
-                    <a:blip r:embed="rId27">
+                    <a:blip r:embed="rId42">
                       <a:extLst>
                         <a:ext uri="{28A0092B-C50C-407E-A947-70E740481C1C}">
                           <a14:useLocalDpi xmlns:a14="http://schemas.microsoft.com/office/drawing/2010/main" val="0"/>
@@ -4523,7 +5788,7 @@
                     <pic:cNvPicPr/>
                   </pic:nvPicPr>
                   <pic:blipFill>
-                    <a:blip r:embed="rId28">
+                    <a:blip r:embed="rId43">
                       <a:extLst>
                         <a:ext uri="{28A0092B-C50C-407E-A947-70E740481C1C}">
                           <a14:useLocalDpi xmlns:a14="http://schemas.microsoft.com/office/drawing/2010/main" val="0"/>
@@ -4571,7 +5836,6 @@
           <w:szCs w:val="32"/>
           <w:u w:val="single"/>
         </w:rPr>
-        <w:lastRenderedPageBreak/>
         <w:drawing>
           <wp:inline distT="0" distB="0" distL="0" distR="0" wp14:anchorId="48490568" wp14:editId="03E1BACA">
             <wp:extent cx="4239260" cy="1701165"/>
@@ -4588,7 +5852,7 @@
                     <pic:cNvPicPr/>
                   </pic:nvPicPr>
                   <pic:blipFill>
-                    <a:blip r:embed="rId29">
+                    <a:blip r:embed="rId44">
                       <a:extLst>
                         <a:ext uri="{28A0092B-C50C-407E-A947-70E740481C1C}">
                           <a14:useLocalDpi xmlns:a14="http://schemas.microsoft.com/office/drawing/2010/main" val="0"/>
@@ -4652,7 +5916,7 @@
                     <pic:cNvPicPr/>
                   </pic:nvPicPr>
                   <pic:blipFill>
-                    <a:blip r:embed="rId30">
+                    <a:blip r:embed="rId45">
                       <a:extLst>
                         <a:ext uri="{28A0092B-C50C-407E-A947-70E740481C1C}">
                           <a14:useLocalDpi xmlns:a14="http://schemas.microsoft.com/office/drawing/2010/main" val="0"/>
@@ -4682,6 +5946,12 @@
     <w:sectPr>
       <w:pgSz w:w="11906" w:h="16838" w:code="9"/>
       <w:pgMar w:top="1400" w:right="2615" w:bottom="1440" w:left="2615" w:header="6" w:footer="142" w:gutter="0"/>
+      <w:pgBorders w:display="firstPage" w:offsetFrom="page">
+        <w:top w:val="double" w:sz="4" w:space="24" w:color="auto"/>
+        <w:left w:val="double" w:sz="4" w:space="24" w:color="auto"/>
+        <w:bottom w:val="double" w:sz="4" w:space="24" w:color="auto"/>
+        <w:right w:val="double" w:sz="4" w:space="24" w:color="auto"/>
+      </w:pgBorders>
       <w:cols w:space="708"/>
       <w:docGrid w:linePitch="381"/>
     </w:sectPr>
@@ -7369,6 +8639,7 @@
   <w:style w:type="character" w:default="1" w:styleId="DefaultParagraphFont">
     <w:name w:val="Default Paragraph Font"/>
     <w:uiPriority w:val="1"/>
+    <w:semiHidden/>
     <w:unhideWhenUsed/>
   </w:style>
   <w:style w:type="table" w:default="1" w:styleId="TableNormal">
@@ -8062,4 +9333,16 @@
     </a:ext>
   </a:extLst>
 </a:theme>
+</file>
+
+<file path=customXml/item1.xml><?xml version="1.0" encoding="utf-8"?>
+<b:Sources xmlns:b="http://schemas.openxmlformats.org/officeDocument/2006/bibliography" xmlns="http://schemas.openxmlformats.org/officeDocument/2006/bibliography" SelectedStyle="\APASixthEditionOfficeOnline.xsl" StyleName="APA" Version="6"/>
+</file>
+
+<file path=customXml/itemProps1.xml><?xml version="1.0" encoding="utf-8"?>
+<ds:datastoreItem xmlns:ds="http://schemas.openxmlformats.org/officeDocument/2006/customXml" ds:itemID="{D75FF1DD-145F-46E5-9F6B-8137FD747F05}">
+  <ds:schemaRefs>
+    <ds:schemaRef ds:uri="http://schemas.openxmlformats.org/officeDocument/2006/bibliography"/>
+  </ds:schemaRefs>
+</ds:datastoreItem>
 </file>
</xml_diff>